<commit_message>
Added filtering to hierarchy vis
</commit_message>
<xml_diff>
--- a/assessment/Writ1_Artificial-Intelligence_ST20285213-Tom-Rowan.docx
+++ b/assessment/Writ1_Artificial-Intelligence_ST20285213-Tom-Rowan.docx
@@ -30,15 +30,7 @@
           <w:sz w:val="84"/>
           <w:szCs w:val="84"/>
         </w:rPr>
-        <w:t>A</w:t>
-      </w:r>
-      <w:r>
-        <w:rPr>
-          <w:color w:val="002060"/>
-          <w:sz w:val="84"/>
-          <w:szCs w:val="84"/>
-        </w:rPr>
-        <w:t>rtificial Intelligence</w:t>
+        <w:t>Artificial Intelligence</w:t>
       </w:r>
     </w:p>
     <w:p>
@@ -191,12 +183,7 @@
         <w:tc>
           <w:tcPr>
             <w:tcW w:w="5812" w:type="dxa"/>
-            <w:tcBorders>
-              <w:top w:val="nil"/>
-              <w:start w:val="nil"/>
-              <w:bottom w:val="nil"/>
-              <w:end w:val="nil"/>
-            </w:tcBorders>
+            <w:tcBorders/>
           </w:tcPr>
           <w:p>
             <w:pPr>
@@ -222,12 +209,7 @@
         <w:tc>
           <w:tcPr>
             <w:tcW w:w="3815" w:type="dxa"/>
-            <w:tcBorders>
-              <w:top w:val="nil"/>
-              <w:start w:val="nil"/>
-              <w:bottom w:val="nil"/>
-              <w:end w:val="nil"/>
-            </w:tcBorders>
+            <w:tcBorders/>
           </w:tcPr>
           <w:p>
             <w:pPr>
@@ -245,9 +227,9 @@
               </w:rPr>
             </w:pPr>
             <w:bookmarkStart w:id="0" w:name="__RefHeading___Toc3119_3504685749"/>
-            <w:bookmarkStart w:id="1" w:name="_Toc215733927"/>
+            <w:bookmarkStart w:id="1" w:name="_Toc155876009"/>
             <w:bookmarkStart w:id="2" w:name="_Toc199754777"/>
-            <w:bookmarkStart w:id="3" w:name="_Toc155876009"/>
+            <w:bookmarkStart w:id="3" w:name="_Toc215733927"/>
             <w:bookmarkEnd w:id="0"/>
             <w:r>
               <w:rPr>
@@ -324,43 +306,7 @@
                 <w:kern w:val="2"/>
                 <w:lang w:eastAsia="zh-CN" w:bidi="hi-IN"/>
               </w:rPr>
-              <w:t>DAT</w:t>
-            </w:r>
-            <w:r>
-              <w:rPr>
-                <w:rFonts w:eastAsia="Noto Serif CJK SC" w:cs="Noto Sans Devanagari" w:ascii="Liberation Sans" w:hAnsi="Liberation Sans"/>
-                <w:color w:val="002060"/>
-                <w:kern w:val="2"/>
-                <w:lang w:eastAsia="zh-CN" w:bidi="hi-IN"/>
-              </w:rPr>
-              <w:t>6</w:t>
-            </w:r>
-            <w:r>
-              <w:rPr>
-                <w:rFonts w:eastAsia="Noto Serif CJK SC" w:cs="Noto Sans Devanagari" w:ascii="Liberation Sans" w:hAnsi="Liberation Sans"/>
-                <w:color w:val="002060"/>
-                <w:kern w:val="2"/>
-                <w:lang w:eastAsia="zh-CN" w:bidi="hi-IN"/>
-              </w:rPr>
-              <w:t>00</w:t>
-            </w:r>
-            <w:r>
-              <w:rPr>
-                <w:rFonts w:eastAsia="Noto Serif CJK SC" w:cs="Noto Sans Devanagari" w:ascii="Liberation Sans" w:hAnsi="Liberation Sans"/>
-                <w:color w:val="002060"/>
-                <w:kern w:val="2"/>
-                <w:lang w:eastAsia="zh-CN" w:bidi="hi-IN"/>
-              </w:rPr>
-              <w:t>2</w:t>
-            </w:r>
-            <w:r>
-              <w:rPr>
-                <w:rFonts w:eastAsia="Noto Serif CJK SC" w:cs="Noto Sans Devanagari" w:ascii="Liberation Sans" w:hAnsi="Liberation Sans"/>
-                <w:color w:val="002060"/>
-                <w:kern w:val="2"/>
-                <w:lang w:eastAsia="zh-CN" w:bidi="hi-IN"/>
-              </w:rPr>
-              <w:t xml:space="preserve"> S2_25</w:t>
+              <w:t>DAT6002 S2_25</w:t>
             </w:r>
           </w:p>
           <w:p>
@@ -392,25 +338,7 @@
                 <w:kern w:val="2"/>
                 <w:lang w:eastAsia="zh-CN" w:bidi="hi-IN"/>
               </w:rPr>
-              <w:t xml:space="preserve">Spring </w:t>
-            </w:r>
-            <w:r>
-              <w:rPr>
-                <w:rFonts w:eastAsia="Noto Serif CJK SC" w:cs="Noto Sans Devanagari" w:ascii="Liberation Sans" w:hAnsi="Liberation Sans"/>
-                <w:color w:val="002060"/>
-                <w:kern w:val="2"/>
-                <w:lang w:eastAsia="zh-CN" w:bidi="hi-IN"/>
-              </w:rPr>
-              <w:t>202</w:t>
-            </w:r>
-            <w:r>
-              <w:rPr>
-                <w:rFonts w:eastAsia="Noto Serif CJK SC" w:cs="Noto Sans Devanagari" w:ascii="Liberation Sans" w:hAnsi="Liberation Sans"/>
-                <w:color w:val="002060"/>
-                <w:kern w:val="2"/>
-                <w:lang w:eastAsia="zh-CN" w:bidi="hi-IN"/>
-              </w:rPr>
-              <w:t>6</w:t>
+              <w:t>Spring 2026</w:t>
             </w:r>
           </w:p>
           <w:p>
@@ -483,8 +411,8 @@
               </w:rPr>
             </w:pPr>
             <w:bookmarkStart w:id="4" w:name="__RefHeading___Toc3121_3504685749"/>
-            <w:bookmarkStart w:id="5" w:name="_Toc215733928"/>
-            <w:bookmarkStart w:id="6" w:name="_Toc199754778"/>
+            <w:bookmarkStart w:id="5" w:name="_Toc199754778"/>
+            <w:bookmarkStart w:id="6" w:name="_Toc215733928"/>
             <w:bookmarkEnd w:id="4"/>
             <w:r>
               <w:rPr>
@@ -559,9 +487,9 @@
               </w:rPr>
             </w:pPr>
             <w:bookmarkStart w:id="7" w:name="__RefHeading___Toc3123_3504685749"/>
-            <w:bookmarkStart w:id="8" w:name="_Toc215733929"/>
+            <w:bookmarkStart w:id="8" w:name="_Toc155876011"/>
             <w:bookmarkStart w:id="9" w:name="_Toc199754779"/>
-            <w:bookmarkStart w:id="10" w:name="_Toc155876011"/>
+            <w:bookmarkStart w:id="10" w:name="_Toc215733929"/>
             <w:bookmarkEnd w:id="7"/>
             <w:r>
               <w:rPr>
@@ -596,16 +524,7 @@
                 <w:kern w:val="2"/>
                 <w:lang w:eastAsia="zh-CN" w:bidi="hi-IN"/>
               </w:rPr>
-              <w:t xml:space="preserve">Dr. Imtiaz </w:t>
-            </w:r>
-            <w:r>
-              <w:rPr>
-                <w:rFonts w:eastAsia="Noto Serif CJK SC" w:cs="Noto Sans Devanagari" w:ascii="Liberation Sans" w:hAnsi="Liberation Sans"/>
-                <w:color w:val="002060"/>
-                <w:kern w:val="2"/>
-                <w:lang w:eastAsia="zh-CN" w:bidi="hi-IN"/>
-              </w:rPr>
-              <w:t>Hussain Khan</w:t>
+              <w:t>Dr. Imtiaz Hussain Khan</w:t>
             </w:r>
           </w:p>
         </w:tc>
@@ -757,7 +676,7 @@
               </w:rPr>
               <w:t>Ethical Considerations</w:t>
               <w:tab/>
-              <w:t>3</w:t>
+              <w:t>4</w:t>
             </w:r>
           </w:hyperlink>
         </w:p>
@@ -777,7 +696,7 @@
               </w:rPr>
               <w:t>Task 2: Semantic Network Implementation</w:t>
               <w:tab/>
-              <w:t>4</w:t>
+              <w:t>5</w:t>
             </w:r>
           </w:hyperlink>
         </w:p>
@@ -797,7 +716,7 @@
               </w:rPr>
               <w:t>Python</w:t>
               <w:tab/>
-              <w:t>4</w:t>
+              <w:t>5</w:t>
             </w:r>
           </w:hyperlink>
         </w:p>
@@ -817,7 +736,7 @@
               </w:rPr>
               <w:t>Prolog</w:t>
               <w:tab/>
-              <w:t>4</w:t>
+              <w:t>5</w:t>
             </w:r>
           </w:hyperlink>
         </w:p>
@@ -837,7 +756,7 @@
               </w:rPr>
               <w:t>Sample Queries</w:t>
               <w:tab/>
-              <w:t>5</w:t>
+              <w:t>6</w:t>
             </w:r>
           </w:hyperlink>
         </w:p>
@@ -857,7 +776,7 @@
               </w:rPr>
               <w:t>References</w:t>
               <w:tab/>
-              <w:t>9</w:t>
+              <w:t>10</w:t>
             </w:r>
           </w:hyperlink>
         </w:p>
@@ -877,7 +796,7 @@
               </w:rPr>
               <w:t>Part 2: Connectionist Methods</w:t>
               <w:tab/>
-              <w:t>10</w:t>
+              <w:t>11</w:t>
             </w:r>
           </w:hyperlink>
           <w:r>
@@ -912,6 +831,7 @@
           <w:ilvl w:val="0"/>
           <w:numId w:val="1"/>
         </w:numPr>
+        <w:spacing w:before="0" w:after="120"/>
         <w:ind w:hanging="0" w:start="0"/>
         <w:rPr/>
       </w:pPr>
@@ -919,11 +839,7 @@
       <w:bookmarkEnd w:id="11"/>
       <w:r>
         <w:rPr/>
-        <w:t xml:space="preserve">Part 1 - </w:t>
-      </w:r>
-      <w:r>
-        <w:rPr/>
-        <w:t>Symbolic AI</w:t>
+        <w:t>Part 1 - Symbolic AI</w:t>
       </w:r>
     </w:p>
     <w:p>
@@ -952,89 +868,17 @@
       <w:bookmarkEnd w:id="13"/>
       <w:r>
         <w:rPr/>
-        <w:t xml:space="preserve">Task 1: </w:t>
-      </w:r>
-      <w:r>
-        <w:rPr/>
-        <w:t>Semantic Network Design for Medieval Weaponry</w:t>
-      </w:r>
-    </w:p>
-    <w:p>
-      <w:pPr>
-        <w:pStyle w:val="Normal"/>
-        <w:rPr/>
-      </w:pPr>
-      <w:r>
-        <w:rPr/>
-        <w:t xml:space="preserve">A semantic network is a way of representing knowledge about a subject by modelling relationships and attributes as ‘nodes’ and connecting ‘edges’ on a graph. In this project, </w:t>
-      </w:r>
-      <w:r>
-        <w:rPr/>
-        <w:t>the subject being represented is medieval weaponry, with</w:t>
-      </w:r>
-      <w:r>
-        <w:rPr/>
-        <w:t xml:space="preserve"> the ‘</w:t>
-      </w:r>
-      <w:r>
-        <w:rPr/>
-        <w:t>m</w:t>
-      </w:r>
-      <w:r>
-        <w:rPr/>
-        <w:t xml:space="preserve">edieval </w:t>
-      </w:r>
-      <w:r>
-        <w:rPr/>
-        <w:t>p</w:t>
-      </w:r>
-      <w:r>
-        <w:rPr/>
-        <w:t xml:space="preserve">eriod’ defined as starting with the fall of the </w:t>
-      </w:r>
-      <w:r>
-        <w:rPr/>
-        <w:t xml:space="preserve">Western </w:t>
-      </w:r>
-      <w:r>
-        <w:rPr/>
-        <w:t xml:space="preserve">Roman Empire in 476 AD </w:t>
-      </w:r>
-      <w:r>
-        <w:rPr/>
-        <w:t xml:space="preserve">through </w:t>
-      </w:r>
-      <w:r>
-        <w:rPr/>
-        <w:t xml:space="preserve">to the beginning of the </w:t>
-      </w:r>
-      <w:r>
-        <w:rPr/>
-        <w:t xml:space="preserve">Protestant </w:t>
-      </w:r>
-      <w:r>
-        <w:rPr/>
-        <w:t xml:space="preserve">Renaissance Period </w:t>
-      </w:r>
-      <w:r>
-        <w:rPr/>
-        <w:t>in</w:t>
-      </w:r>
-      <w:r>
-        <w:rPr/>
-        <w:t xml:space="preserve"> 15</w:t>
-      </w:r>
-      <w:r>
-        <w:rPr/>
-        <w:t>17</w:t>
-      </w:r>
-      <w:r>
-        <w:rPr/>
-        <w:t xml:space="preserve"> AD. </w:t>
-      </w:r>
-      <w:r>
-        <w:rPr/>
-        <w:t>[references – wikipedia,etc]</w:t>
+        <w:t>Task 1: Semantic Network Design for Medieval Weaponry</w:t>
+      </w:r>
+    </w:p>
+    <w:p>
+      <w:pPr>
+        <w:pStyle w:val="Normal"/>
+        <w:rPr/>
+      </w:pPr>
+      <w:r>
+        <w:rPr/>
+        <w:t>A semantic network is a way of representing knowledge about a subject by modelling relationships and attributes as ‘nodes’ and connecting ‘edges’ on a graph. In this project, the subject being represented is medieval weaponry, with the ‘medieval period’ defined as starting with the fall of the Western Roman Empire in 476 AD through to the beginning of the Protestant Renaissance Period in 1517 AD. [references – wikipedia,etc]</w:t>
       </w:r>
     </w:p>
     <w:p>
@@ -1060,44 +904,61 @@
       </w:pPr>
       <w:r>
         <w:rPr/>
-        <w:t xml:space="preserve">The semantic network was constructed using a hierarchical classification system, grouping items by shared properties </w:t>
-      </w:r>
-      <w:r>
-        <w:rPr/>
-        <w:t>and</w:t>
-      </w:r>
-      <w:r>
-        <w:rPr/>
-        <w:t xml:space="preserve"> function. This reduces redundancy and follows the taxonomical classification found </w:t>
-      </w:r>
-      <w:r>
-        <w:rPr/>
-        <w:t>b</w:t>
-      </w:r>
-      <w:r>
-        <w:rPr/>
-        <w:t xml:space="preserve">iological classification </w:t>
-      </w:r>
-      <w:r>
-        <w:rPr/>
-        <w:t xml:space="preserve">which </w:t>
-      </w:r>
-      <w:r>
-        <w:rPr/>
-        <w:t xml:space="preserve">groups organisms based on shared ancestral traits </w:t>
-      </w:r>
-      <w:r>
-        <w:rPr/>
-        <w:t>(Campbell 2005).</w:t>
-      </w:r>
-    </w:p>
-    <w:p>
-      <w:pPr>
-        <w:pStyle w:val="Normal"/>
-        <w:rPr/>
-      </w:pPr>
-      <w:r>
-        <w:rPr/>
+        <w:t>The semantic network was constructed using a hierarchical classification system, grouping items by shared properties and function. This reduces redundancy and follows the taxonomical classification found biological classification which groups organisms based on shared ancestral traits (Campbell 2005).</w:t>
+      </w:r>
+    </w:p>
+    <w:p>
+      <w:pPr>
+        <w:pStyle w:val="Normal"/>
+        <w:rPr/>
+      </w:pPr>
+      <w:r>
+        <w:rPr/>
+        <w:drawing>
+          <wp:anchor behindDoc="0" distT="0" distB="0" distL="0" distR="0" simplePos="0" locked="0" layoutInCell="0" allowOverlap="1" relativeHeight="2">
+            <wp:simplePos x="0" y="0"/>
+            <wp:positionH relativeFrom="column">
+              <wp:posOffset>3143250</wp:posOffset>
+            </wp:positionH>
+            <wp:positionV relativeFrom="paragraph">
+              <wp:posOffset>10795</wp:posOffset>
+            </wp:positionV>
+            <wp:extent cx="3383915" cy="4899660"/>
+            <wp:effectExtent l="0" t="0" r="0" b="0"/>
+            <wp:wrapSquare wrapText="largest"/>
+            <wp:docPr id="1" name="Image1" descr="" title=""/>
+            <wp:cNvGraphicFramePr>
+              <a:graphicFrameLocks xmlns:a="http://schemas.openxmlformats.org/drawingml/2006/main" noChangeAspect="1"/>
+            </wp:cNvGraphicFramePr>
+            <a:graphic xmlns:a="http://schemas.openxmlformats.org/drawingml/2006/main">
+              <a:graphicData uri="http://schemas.openxmlformats.org/drawingml/2006/picture">
+                <pic:pic xmlns:pic="http://schemas.openxmlformats.org/drawingml/2006/picture">
+                  <pic:nvPicPr>
+                    <pic:cNvPr id="1" name="Image1" descr="" title=""/>
+                    <pic:cNvPicPr>
+                      <a:picLocks noChangeAspect="1" noChangeArrowheads="1"/>
+                    </pic:cNvPicPr>
+                  </pic:nvPicPr>
+                  <pic:blipFill>
+                    <a:blip r:embed="rId2"/>
+                    <a:stretch>
+                      <a:fillRect/>
+                    </a:stretch>
+                  </pic:blipFill>
+                  <pic:spPr bwMode="auto">
+                    <a:xfrm>
+                      <a:off x="0" y="0"/>
+                      <a:ext cx="3383915" cy="4899660"/>
+                    </a:xfrm>
+                    <a:prstGeom prst="rect">
+                      <a:avLst/>
+                    </a:prstGeom>
+                  </pic:spPr>
+                </pic:pic>
+              </a:graphicData>
+            </a:graphic>
+          </wp:anchor>
+        </w:drawing>
       </w:r>
     </w:p>
     <w:p>
@@ -1126,15 +987,7 @@
       </w:pPr>
       <w:r>
         <w:rPr/>
-        <w:t>Items that are closer to the root of the relationship tree have</w:t>
-      </w:r>
-      <w:r>
-        <w:rPr/>
-        <w:t xml:space="preserve"> fewer generalising </w:t>
-      </w:r>
-      <w:r>
-        <w:rPr/>
-        <w:t>properties. Conversely, objects that are leaves are likely to have more properties. Items inherit properties from objects that are closer to the root; these can be overridden (hidden) by more specific properties.</w:t>
+        <w:t>Items that are closer to the root of the relationship tree have fewer generalising properties. Conversely, objects that are leaves are likely to have more properties. Items inherit properties from objects that are closer to the root; these can be overridden (hidden) by more specific properties.</w:t>
       </w:r>
     </w:p>
     <w:p>
@@ -1172,11 +1025,7 @@
       </w:pPr>
       <w:r>
         <w:rPr/>
-        <w:t xml:space="preserve">The </w:t>
-      </w:r>
-      <w:r>
-        <w:rPr/>
-        <w:t>structure uses a strict tree without multiple inheritance. It is noted that to fully capture the trebuchet, the tree would have to be modified allowing a single node to inherit properties from multiple parents. This highlights the difference between the simplicity of a tree and the enhanced representation allowed for by a Directed Acyclic Graph (DAG).</w:t>
+        <w:t>The structure uses a strict tree without multiple inheritance. It is noted that to fully capture the trebuchet, the tree would have to be modified allowing a single node to inherit properties from multiple parents. This highlights the difference between the simplicity of a tree and the enhanced representation allowed for by a Directed Acyclic Graph (DAG).</w:t>
       </w:r>
     </w:p>
     <w:p>
@@ -1266,15 +1115,27 @@
       </w:pPr>
       <w:r>
         <w:rPr/>
-        <w:t>Humans are able to understand the historical context of this dataset, whereas AI systems do not have this distinction, and may struggle to give adequate weighting to non-aggressive features. Furthermore, if the output of this exercise were to be fed into confectionist neural network models, there is a danger that the system may learn bias in the system, such as predicting or advocating violence based on properties such as 'causes_damage' (</w:t>
-      </w:r>
-      <w:r>
-        <w:rPr/>
-        <w:t>reference needed</w:t>
-      </w:r>
-      <w:r>
-        <w:rPr/>
-        <w:t>).</w:t>
+        <w:t>Humans are able to understand the historical context of this dataset, whereas AI systems do not have this distinction, and may struggle to give adequate weighting to non-aggressive features. Furthermore, if the output of this exercise were to be fed into confectionist neural network models, there is a danger that the system may learn bias in the system, such as predicting or advocating violence based on properties such as 'causes_damage' (reference needed).</w:t>
+      </w:r>
+    </w:p>
+    <w:p>
+      <w:pPr>
+        <w:pStyle w:val="Heading2"/>
+        <w:widowControl/>
+        <w:numPr>
+          <w:ilvl w:val="0"/>
+          <w:numId w:val="0"/>
+        </w:numPr>
+        <w:suppressAutoHyphens w:val="true"/>
+        <w:ind w:hanging="0" w:start="0"/>
+        <w:jc w:val="both"/>
+        <w:rPr/>
+      </w:pPr>
+      <w:r>
+        <w:rPr/>
+      </w:r>
+      <w:r>
+        <w:br w:type="page"/>
       </w:r>
     </w:p>
     <w:p>
@@ -1291,11 +1152,7 @@
       <w:bookmarkEnd w:id="16"/>
       <w:r>
         <w:rPr/>
-        <w:t xml:space="preserve">Task 2: Semantic Network </w:t>
-      </w:r>
-      <w:r>
-        <w:rPr/>
-        <w:t>Implementation</w:t>
+        <w:t>Task 2: Semantic Network Implementation</w:t>
       </w:r>
     </w:p>
     <w:p>
@@ -1332,34 +1189,34 @@
       </w:pPr>
       <w:r>
         <w:rPr/>
-        <w:t xml:space="preserve">A python class was created to allow a user to model any generic semantic network. It allows the user to add nodes and edges to the graph as ‘is_a’ and ‘has_a’ relationships. From the resulting network, the user can output the network into JSON, CSV and Prolog files. They can also create </w:t>
-      </w:r>
-      <w:r>
-        <w:rPr/>
-        <w:t xml:space="preserve">graphical </w:t>
-      </w:r>
-      <w:r>
-        <w:rPr/>
-        <w:t>visualisations automatically.</w:t>
-      </w:r>
-    </w:p>
-    <w:p>
-      <w:pPr>
-        <w:pStyle w:val="Normal"/>
-        <w:rPr/>
-      </w:pPr>
-      <w:r>
-        <w:rPr/>
-      </w:r>
-    </w:p>
-    <w:p>
-      <w:pPr>
-        <w:pStyle w:val="Normal"/>
-        <w:rPr/>
-      </w:pPr>
-      <w:r>
-        <w:rPr/>
-        <w:t>As the network is sizeable, output visualisations are too detailed to display in their entirety in this report. They can be viewed here:</w:t>
+        <w:t>A python class was created to allow a user to model any generic semantic network. It allows the user to add nodes and edges to the graph as ‘is_a’ and ‘has_a’ relationships. From the resulting network, the user can output the network into JSON, CSV and Prolog files. They can also create graphical visualisations automatically.</w:t>
+      </w:r>
+    </w:p>
+    <w:p>
+      <w:pPr>
+        <w:pStyle w:val="Normal"/>
+        <w:rPr/>
+      </w:pPr>
+      <w:r>
+        <w:rPr/>
+      </w:r>
+    </w:p>
+    <w:p>
+      <w:pPr>
+        <w:pStyle w:val="Normal"/>
+        <w:rPr/>
+      </w:pPr>
+      <w:r>
+        <w:rPr/>
+        <w:t xml:space="preserve">As the network is sizeable, </w:t>
+      </w:r>
+      <w:r>
+        <w:rPr/>
+        <w:t xml:space="preserve">containing 84 is_a relationships and 341 has_a properties, </w:t>
+      </w:r>
+      <w:r>
+        <w:rPr/>
+        <w:t>output visualisations are too detailed to display in their entirety in this report. They can be viewed here:</w:t>
       </w:r>
     </w:p>
     <w:p>
@@ -1385,14 +1242,14 @@
         </w:tblCellMar>
       </w:tblPr>
       <w:tblGrid>
-        <w:gridCol w:w="3516"/>
+        <w:gridCol w:w="3515"/>
         <w:gridCol w:w="6122"/>
       </w:tblGrid>
       <w:tr>
         <w:trPr/>
         <w:tc>
           <w:tcPr>
-            <w:tcW w:w="3516" w:type="dxa"/>
+            <w:tcW w:w="3515" w:type="dxa"/>
             <w:tcBorders>
               <w:top w:val="single" w:sz="4" w:space="0" w:color="000000"/>
               <w:start w:val="single" w:sz="4" w:space="0" w:color="000000"/>
@@ -1436,7 +1293,7 @@
         <w:trPr/>
         <w:tc>
           <w:tcPr>
-            <w:tcW w:w="3516" w:type="dxa"/>
+            <w:tcW w:w="3515" w:type="dxa"/>
             <w:tcBorders>
               <w:start w:val="single" w:sz="4" w:space="0" w:color="000000"/>
               <w:bottom w:val="single" w:sz="4" w:space="0" w:color="000000"/>
@@ -1467,32 +1324,18 @@
               <w:pStyle w:val="TableContents"/>
               <w:rPr/>
             </w:pPr>
-            <w:hyperlink r:id="rId2">
+            <w:hyperlink r:id="rId3">
               <w:r>
                 <w:rPr>
                   <w:rStyle w:val="Hyperlink"/>
                 </w:rPr>
-                <w:t>https://datascience.daemonchild.com/year3/dat6002/Medieval_Weapons_</w:t>
-              </w:r>
-              <w:r>
-                <w:rPr>
-                  <w:rStyle w:val="Hyperlink"/>
-                </w:rPr>
-                <w:t>Hierarchy</w:t>
-              </w:r>
-              <w:r>
-                <w:rPr>
-                  <w:rStyle w:val="Hyperlink"/>
-                </w:rPr>
-                <w:t>.html</w:t>
+                <w:t>https://datascience.daemonchild.com/year3/dat6002/Medieval_Weapons_Hierarchy.html</w:t>
               </w:r>
             </w:hyperlink>
-            <w:hyperlink r:id="rId3">
-              <w:r>
-                <w:rPr/>
-                <w:t xml:space="preserve"> </w:t>
-              </w:r>
-            </w:hyperlink>
+            <w:r>
+              <w:rPr/>
+              <w:t xml:space="preserve"> </w:t>
+            </w:r>
           </w:p>
         </w:tc>
       </w:tr>
@@ -1500,7 +1343,7 @@
         <w:trPr/>
         <w:tc>
           <w:tcPr>
-            <w:tcW w:w="3516" w:type="dxa"/>
+            <w:tcW w:w="3515" w:type="dxa"/>
             <w:tcBorders>
               <w:start w:val="single" w:sz="4" w:space="0" w:color="000000"/>
               <w:bottom w:val="single" w:sz="4" w:space="0" w:color="000000"/>
@@ -1539,12 +1382,10 @@
                 <w:t>https://datascience.daemonchild.com/year3/dat6002/Medieval_Weapons_Node_Diagram.html</w:t>
               </w:r>
             </w:hyperlink>
-            <w:hyperlink r:id="rId5">
-              <w:r>
-                <w:rPr/>
-                <w:t xml:space="preserve"> </w:t>
-              </w:r>
-            </w:hyperlink>
+            <w:r>
+              <w:rPr/>
+              <w:t xml:space="preserve"> </w:t>
+            </w:r>
           </w:p>
         </w:tc>
       </w:tr>
@@ -1565,7 +1406,16 @@
       </w:pPr>
       <w:r>
         <w:rPr/>
-        <w:t>[INSERT IMAGES]</w:t>
+        <w:t>Filtered hierarchical diagrams are also possible, including only selected nodes and have been used elsewhere in this report.</w:t>
+      </w:r>
+    </w:p>
+    <w:p>
+      <w:pPr>
+        <w:pStyle w:val="Normal"/>
+        <w:rPr/>
+      </w:pPr>
+      <w:r>
+        <w:rPr/>
       </w:r>
     </w:p>
     <w:p>
@@ -1602,11 +1452,7 @@
       </w:pPr>
       <w:r>
         <w:rPr/>
-        <w:t>In Prolog t</w:t>
-      </w:r>
-      <w:r>
-        <w:rPr/>
-        <w:t>he network is implemented using two types of fact:</w:t>
+        <w:t>In Prolog the network is implemented using two types of fact:</w:t>
       </w:r>
     </w:p>
     <w:p>
@@ -1629,19 +1475,7 @@
       </w:pPr>
       <w:r>
         <w:rPr/>
-        <w:t>is_a</w:t>
-      </w:r>
-      <w:r>
-        <w:rPr/>
-        <w:t xml:space="preserve"> </w:t>
-      </w:r>
-      <w:r>
-        <w:rPr/>
-        <w:t>f</w:t>
-      </w:r>
-      <w:r>
-        <w:rPr/>
-        <w:t xml:space="preserve">acts </w:t>
+        <w:t xml:space="preserve">is_a facts </w:t>
       </w:r>
     </w:p>
     <w:p>
@@ -1679,23 +1513,7 @@
       </w:pPr>
       <w:r>
         <w:rPr/>
-        <w:t xml:space="preserve">The relationships between items in the network are defined in a parent-child hierarchy using </w:t>
-      </w:r>
-      <w:r>
-        <w:rPr/>
-        <w:t>the predicate ‘</w:t>
-      </w:r>
-      <w:r>
-        <w:rPr/>
-        <w:t xml:space="preserve">is_a’. This builds a tree of relationships </w:t>
-      </w:r>
-      <w:r>
-        <w:rPr/>
-        <w:t xml:space="preserve">in the form </w:t>
-      </w:r>
-      <w:r>
-        <w:rPr/>
-        <w:t>is_a ( child, parent ).</w:t>
+        <w:t>The relationships between items in the network are defined in a parent-child hierarchy using the predicate ‘is_a’. This builds a tree of relationships in the form is_a ( child, parent ).</w:t>
       </w:r>
     </w:p>
     <w:p>
@@ -1895,23 +1713,7 @@
       </w:pPr>
       <w:r>
         <w:rPr/>
-        <w:t>By defining nodes such as 'bladed_hand_weapon', the network utilises shared inheritance. Each class below this, for example ‘</w:t>
-      </w:r>
-      <w:r>
-        <w:rPr/>
-        <w:t>sword’</w:t>
-      </w:r>
-      <w:r>
-        <w:rPr/>
-        <w:t xml:space="preserve"> automatically inherits base properties like '</w:t>
-      </w:r>
-      <w:r>
-        <w:rPr/>
-        <w:t xml:space="preserve">has a </w:t>
-      </w:r>
-      <w:r>
-        <w:rPr/>
-        <w:t>blade'. Querying the network for the unique attributes defined for a generic sword would therefore return the following, with the attributes being inherited from further up the tree:</w:t>
+        <w:t>By defining nodes such as 'bladed_hand_weapon', the network utilises shared inheritance. Each class below this, for example ‘sword’ automatically inherits base properties like 'has a blade'. Querying the network for the unique attributes defined for a generic sword would therefore return the following, with the attributes being inherited from further up the tree:</w:t>
       </w:r>
     </w:p>
     <w:p>
@@ -1981,35 +1783,7 @@
       </w:pPr>
       <w:r>
         <w:rPr/>
-        <w:t>The</w:t>
-      </w:r>
-      <w:r>
-        <w:rPr/>
-        <w:t xml:space="preserve"> Closed World Assumption (CWA) </w:t>
-      </w:r>
-      <w:r>
-        <w:rPr/>
-        <w:t xml:space="preserve">is </w:t>
-      </w:r>
-      <w:r>
-        <w:rPr/>
-        <w:t xml:space="preserve">a fundamental tenet of Prolog. Under CWA any statement that cannot be proven true within the knowledge-base is assumed to be false. For example: has_a (sword, colour, pink) is not specifically stated, and cannot be inherited from a parent, </w:t>
-      </w:r>
-      <w:r>
-        <w:rPr/>
-        <w:t xml:space="preserve">so </w:t>
-      </w:r>
-      <w:r>
-        <w:rPr/>
-        <w:t xml:space="preserve">Prolog will conclude that this is </w:t>
-      </w:r>
-      <w:r>
-        <w:rPr/>
-        <w:t>f</w:t>
-      </w:r>
-      <w:r>
-        <w:rPr/>
-        <w:t>alse.</w:t>
+        <w:t>The Closed World Assumption (CWA) is a fundamental tenet of Prolog. Under CWA any statement that cannot be proven true within the knowledge-base is assumed to be false. For example: has_a (sword, colour, pink) is not specifically stated, and cannot be inherited from a parent, so Prolog will conclude that this is false.</w:t>
       </w:r>
     </w:p>
     <w:p>
@@ -2047,39 +1821,7 @@
       </w:pPr>
       <w:r>
         <w:rPr/>
-        <w:t xml:space="preserve">In additional, rules </w:t>
-      </w:r>
-      <w:r>
-        <w:rPr/>
-        <w:t>have been written</w:t>
-      </w:r>
-      <w:r>
-        <w:rPr/>
-        <w:t xml:space="preserve"> for querying a </w:t>
-      </w:r>
-      <w:r>
-        <w:rPr/>
-        <w:t xml:space="preserve">this network. Most of these </w:t>
-      </w:r>
-      <w:r>
-        <w:rPr/>
-        <w:t xml:space="preserve">functions are generic </w:t>
-      </w:r>
-      <w:r>
-        <w:rPr/>
-        <w:t>and work for any</w:t>
-      </w:r>
-      <w:r>
-        <w:rPr/>
-        <w:t xml:space="preserve"> suitably defined </w:t>
-      </w:r>
-      <w:r>
-        <w:rPr/>
-        <w:t xml:space="preserve">semantic </w:t>
-      </w:r>
-      <w:r>
-        <w:rPr/>
-        <w:t>network.</w:t>
+        <w:t>In additional, rules have been written for querying a this network. Most of these functions are generic and work for any suitably defined semantic network.</w:t>
       </w:r>
     </w:p>
     <w:p>
@@ -2233,31 +1975,7 @@
       </w:pPr>
       <w:r>
         <w:rPr/>
-        <w:t xml:space="preserve">The following functions are specific to </w:t>
-      </w:r>
-      <w:r>
-        <w:rPr/>
-        <w:t>m</w:t>
-      </w:r>
-      <w:r>
-        <w:rPr/>
-        <w:t xml:space="preserve">edieval </w:t>
-      </w:r>
-      <w:r>
-        <w:rPr/>
-        <w:t>w</w:t>
-      </w:r>
-      <w:r>
-        <w:rPr/>
-        <w:t>eapon</w:t>
-      </w:r>
-      <w:r>
-        <w:rPr/>
-        <w:t>ry</w:t>
-      </w:r>
-      <w:r>
-        <w:rPr/>
-        <w:t>:</w:t>
+        <w:t>The following functions are specific to medieval weaponry:</w:t>
       </w:r>
     </w:p>
     <w:p>
@@ -2306,7 +2024,10 @@
         </w:rPr>
       </w:pPr>
       <w:r>
-        <w:rPr/>
+        <w:rPr>
+          <w:b/>
+          <w:bCs/>
+        </w:rPr>
       </w:r>
     </w:p>
     <w:p>
@@ -2360,38 +2081,26 @@
       </w:r>
       <w:r>
         <w:rPr/>
-        <w:t xml:space="preserve"> </w:t>
-      </w:r>
-      <w:r>
-        <w:rPr/>
-        <w:t>which is false.</w:t>
-      </w:r>
-    </w:p>
-    <w:p>
-      <w:pPr>
-        <w:pStyle w:val="Normal"/>
-        <w:rPr/>
-      </w:pPr>
-      <w:r>
-        <w:rPr/>
-      </w:r>
-    </w:p>
-    <w:p>
-      <w:pPr>
-        <w:pStyle w:val="Normal"/>
-        <w:rPr/>
-      </w:pPr>
-      <w:r>
-        <w:rPr/>
-        <w:t>Using the rules</w:t>
-      </w:r>
-      <w:r>
-        <w:rPr/>
-        <w:t xml:space="preserve"> network can also answer questions about parent relationships. </w:t>
-      </w:r>
-      <w:r>
-        <w:rPr/>
-        <w:t>The first example asks the question “Is a long sword a melee weapon?”, while the second asks Prolog to show the lineage of a long sword:</w:t>
+        <w:t xml:space="preserve"> which is false.</w:t>
+      </w:r>
+    </w:p>
+    <w:p>
+      <w:pPr>
+        <w:pStyle w:val="Normal"/>
+        <w:rPr/>
+      </w:pPr>
+      <w:r>
+        <w:rPr/>
+      </w:r>
+    </w:p>
+    <w:p>
+      <w:pPr>
+        <w:pStyle w:val="Normal"/>
+        <w:rPr/>
+      </w:pPr>
+      <w:r>
+        <w:rPr/>
+        <w:t>Using the rules network can also answer questions about parent relationships. The first example asks the question “Is a long sword a melee weapon?”, while the second asks Prolog to show the lineage of a long sword:</w:t>
       </w:r>
     </w:p>
     <w:p>
@@ -2570,19 +2279,16 @@
     <w:p>
       <w:pPr>
         <w:pStyle w:val="Normal"/>
-        <w:rPr/>
-      </w:pPr>
-      <w:r>
-        <w:rPr/>
-        <w:t xml:space="preserve">The same concept works for properties. This example shows the properties of the sword class, firstly using the raw facts (no inheritance), and secondly using the has_a_property rule to </w:t>
-      </w:r>
-      <w:r>
-        <w:rPr/>
-        <w:t xml:space="preserve">also </w:t>
-      </w:r>
-      <w:r>
-        <w:rPr/>
-        <w:t>obtain inherited properties from further up the tree:</w:t>
+        <w:spacing w:before="0" w:after="0"/>
+        <w:rPr/>
+      </w:pPr>
+      <w:r>
+        <w:rPr/>
+        <w:t xml:space="preserve">The same concept works for properties. This example shows the properties of the sword class, firstly using the raw facts (no inheritance), and secondly using the has_a_property rule to also obtain inherited properties from further up the tree, </w:t>
+      </w:r>
+      <w:r>
+        <w:rPr/>
+        <w:t>as also shown in the diagram:</w:t>
       </w:r>
     </w:p>
     <w:p>
@@ -2627,6 +2333,58 @@
           <w:sz w:val="16"/>
           <w:szCs w:val="16"/>
         </w:rPr>
+        <w:drawing>
+          <wp:anchor behindDoc="0" distT="0" distB="0" distL="0" distR="0" simplePos="0" locked="0" layoutInCell="0" allowOverlap="1" relativeHeight="3">
+            <wp:simplePos x="0" y="0"/>
+            <wp:positionH relativeFrom="column">
+              <wp:posOffset>3775075</wp:posOffset>
+            </wp:positionH>
+            <wp:positionV relativeFrom="paragraph">
+              <wp:posOffset>53975</wp:posOffset>
+            </wp:positionV>
+            <wp:extent cx="1979930" cy="3945890"/>
+            <wp:effectExtent l="0" t="0" r="0" b="0"/>
+            <wp:wrapSquare wrapText="largest"/>
+            <wp:docPr id="2" name="Image2" descr="" title=""/>
+            <wp:cNvGraphicFramePr>
+              <a:graphicFrameLocks xmlns:a="http://schemas.openxmlformats.org/drawingml/2006/main" noChangeAspect="1"/>
+            </wp:cNvGraphicFramePr>
+            <a:graphic xmlns:a="http://schemas.openxmlformats.org/drawingml/2006/main">
+              <a:graphicData uri="http://schemas.openxmlformats.org/drawingml/2006/picture">
+                <pic:pic xmlns:pic="http://schemas.openxmlformats.org/drawingml/2006/picture">
+                  <pic:nvPicPr>
+                    <pic:cNvPr id="2" name="Image2" descr="" title=""/>
+                    <pic:cNvPicPr>
+                      <a:picLocks noChangeAspect="1" noChangeArrowheads="1"/>
+                    </pic:cNvPicPr>
+                  </pic:nvPicPr>
+                  <pic:blipFill>
+                    <a:blip r:embed="rId5"/>
+                    <a:stretch>
+                      <a:fillRect/>
+                    </a:stretch>
+                  </pic:blipFill>
+                  <pic:spPr bwMode="auto">
+                    <a:xfrm>
+                      <a:off x="0" y="0"/>
+                      <a:ext cx="1979930" cy="3945890"/>
+                    </a:xfrm>
+                    <a:prstGeom prst="rect">
+                      <a:avLst/>
+                    </a:prstGeom>
+                  </pic:spPr>
+                </pic:pic>
+              </a:graphicData>
+            </a:graphic>
+          </wp:anchor>
+        </w:drawing>
+      </w:r>
+      <w:r>
+        <w:rPr>
+          <w:rFonts w:ascii="FreeMono" w:hAnsi="FreeMono"/>
+          <w:sz w:val="16"/>
+          <w:szCs w:val="16"/>
+        </w:rPr>
         <w:t>Property = has_edges,</w:t>
       </w:r>
     </w:p>
@@ -3347,23 +3105,7 @@
       </w:pPr>
       <w:r>
         <w:rPr/>
-        <w:t xml:space="preserve">The list_properties </w:t>
-      </w:r>
-      <w:r>
-        <w:rPr/>
-        <w:t xml:space="preserve">rule </w:t>
-      </w:r>
-      <w:r>
-        <w:rPr/>
-        <w:t xml:space="preserve">acts as a wrapper to make the same output easier to </w:t>
-      </w:r>
-      <w:r>
-        <w:rPr/>
-        <w:t>read</w:t>
-      </w:r>
-      <w:r>
-        <w:rPr/>
-        <w:t>:</w:t>
+        <w:t>The list_properties rule acts as a wrapper to make the same output easier to read:</w:t>
         <w:br/>
         <w:br/>
       </w:r>
@@ -3758,15 +3500,7 @@
       </w:pPr>
       <w:r>
         <w:rPr/>
-        <w:t xml:space="preserve">However, the specific instance of a long sword belonging to William Wallace has a </w:t>
-      </w:r>
-      <w:r>
-        <w:rPr/>
-        <w:t xml:space="preserve">more </w:t>
-      </w:r>
-      <w:r>
-        <w:rPr/>
-        <w:t xml:space="preserve">specific use date: </w:t>
+        <w:t xml:space="preserve">However, the specific instance of a long sword belonging to William Wallace has a more specific use date: </w:t>
       </w:r>
     </w:p>
     <w:p>
@@ -3821,27 +3555,7 @@
       </w:pPr>
       <w:r>
         <w:rPr/>
-        <w:t xml:space="preserve">When all the properties for The Wallace Sword are listed, the more specific date overrides </w:t>
-      </w:r>
-      <w:r>
-        <w:rPr/>
-        <w:t xml:space="preserve">both </w:t>
-      </w:r>
-      <w:r>
-        <w:rPr/>
-        <w:t xml:space="preserve">the </w:t>
-      </w:r>
-      <w:r>
-        <w:rPr/>
-        <w:t>value for era_used</w:t>
-      </w:r>
-      <w:r>
-        <w:rPr/>
-        <w:t xml:space="preserve"> applied at the root of the tree and that applied </w:t>
-      </w:r>
-      <w:r>
-        <w:rPr/>
-        <w:t>to all long swords. This list shows a mixture of local, inherited and overridden properties:</w:t>
+        <w:t>When all the properties for The Wallace Sword are listed, the more specific date overrides both the value for era_used applied at the root of the tree and that applied to all long swords. This list shows a mixture of local, inherited and overridden properties:</w:t>
       </w:r>
     </w:p>
     <w:p>
@@ -4488,23 +4202,7 @@
       </w:pPr>
       <w:r>
         <w:rPr/>
-        <w:t xml:space="preserve">As the effective_range property is a word rather than a numerical value, the following weighting facts were used to </w:t>
-      </w:r>
-      <w:r>
-        <w:rPr/>
-        <w:t xml:space="preserve">convert to numbers and </w:t>
-      </w:r>
-      <w:r>
-        <w:rPr/>
-        <w:t xml:space="preserve">allow </w:t>
-      </w:r>
-      <w:r>
-        <w:rPr/>
-        <w:t xml:space="preserve">direct </w:t>
-      </w:r>
-      <w:r>
-        <w:rPr/>
-        <w:t>comparison in the longer_range rule.</w:t>
+        <w:t>As the effective_range property is a word rather than a numerical value, the following weighting facts were used to convert to numbers and allow direct comparison in the longer_range rule.</w:t>
       </w:r>
     </w:p>
     <w:p>
@@ -4622,19 +4320,7 @@
       </w:pPr>
       <w:r>
         <w:rPr/>
-        <w:t xml:space="preserve">One final example shows the </w:t>
-      </w:r>
-      <w:r>
-        <w:rPr/>
-        <w:t xml:space="preserve">output of the </w:t>
-      </w:r>
-      <w:r>
-        <w:rPr/>
-        <w:t xml:space="preserve">show_tree rule, </w:t>
-      </w:r>
-      <w:r>
-        <w:rPr/>
-        <w:t>which gives each of the weapons and their level in the hierarchy:</w:t>
+        <w:t>One final example shows the output of the show_tree rule, which gives each of the weapons and their level in the hierarchy:</w:t>
       </w:r>
     </w:p>
     <w:p>
@@ -4652,6 +4338,7 @@
     <w:p>
       <w:pPr>
         <w:pStyle w:val="Normal"/>
+        <w:spacing w:before="0" w:after="0"/>
         <w:rPr>
           <w:rFonts w:ascii="FreeMono" w:hAnsi="FreeMono"/>
           <w:sz w:val="16"/>
@@ -6977,76 +6664,70 @@
         <w:pStyle w:val="Normal"/>
         <w:rPr/>
       </w:pPr>
-      <w:hyperlink r:id="rId7">
-        <w:r>
-          <w:rPr>
-            <w:rStyle w:val="Hyperlink"/>
-          </w:rPr>
-          <w:t>https://fiveable.me/europe-1000-1500/unit-1/defining-middle-ages-chronology-geographical-scope/study-guide/PdAHuoPDDX2anH9c</w:t>
-        </w:r>
-      </w:hyperlink>
-    </w:p>
-    <w:p>
-      <w:pPr>
-        <w:pStyle w:val="Normal"/>
-        <w:rPr/>
-      </w:pPr>
-      <w:r>
-        <w:rPr/>
-      </w:r>
-    </w:p>
-    <w:p>
-      <w:pPr>
-        <w:pStyle w:val="Normal"/>
-        <w:rPr/>
-      </w:pPr>
-      <w:hyperlink r:id="rId9">
-        <w:r>
-          <w:rPr>
-            <w:rStyle w:val="Hyperlink"/>
-          </w:rPr>
-          <w:t>https://education.nationalgeographic.org/resource/protestant-reformation/</w:t>
-        </w:r>
-      </w:hyperlink>
-    </w:p>
-    <w:p>
-      <w:pPr>
-        <w:pStyle w:val="Normal"/>
-        <w:rPr/>
-      </w:pPr>
-      <w:r>
-        <w:rPr/>
-      </w:r>
-    </w:p>
-    <w:p>
-      <w:pPr>
-        <w:pStyle w:val="Normal"/>
-        <w:rPr/>
-      </w:pPr>
-      <w:hyperlink r:id="rId11">
-        <w:r>
-          <w:rPr>
-            <w:rStyle w:val="Hyperlink"/>
-          </w:rPr>
-          <w:t>https://en.wikipedia.org/wiki/Fall_of_the_Western_Roman_Empire</w:t>
-        </w:r>
-      </w:hyperlink>
-    </w:p>
-    <w:p>
-      <w:pPr>
-        <w:pStyle w:val="Normal"/>
-        <w:rPr/>
-      </w:pPr>
-      <w:r>
-        <w:rPr/>
-      </w:r>
-    </w:p>
-    <w:p>
-      <w:pPr>
-        <w:pStyle w:val="Normal"/>
-        <w:rPr/>
-      </w:pPr>
-      <w:hyperlink r:id="rId12">
+      <w:r>
+        <w:rPr>
+          <w:rStyle w:val="Hyperlink"/>
+        </w:rPr>
+        <w:t>https://fiveable.me/europe-1000-1500/unit-1/defining-middle-ages-chronology-geographical-scope/study-guide/PdAHuoPDDX2anH9c</w:t>
+      </w:r>
+    </w:p>
+    <w:p>
+      <w:pPr>
+        <w:pStyle w:val="Normal"/>
+        <w:rPr/>
+      </w:pPr>
+      <w:r>
+        <w:rPr/>
+      </w:r>
+    </w:p>
+    <w:p>
+      <w:pPr>
+        <w:pStyle w:val="Normal"/>
+        <w:rPr/>
+      </w:pPr>
+      <w:r>
+        <w:rPr>
+          <w:rStyle w:val="Hyperlink"/>
+        </w:rPr>
+        <w:t>https://education.nationalgeographic.org/resource/protestant-reformation/</w:t>
+      </w:r>
+    </w:p>
+    <w:p>
+      <w:pPr>
+        <w:pStyle w:val="Normal"/>
+        <w:rPr/>
+      </w:pPr>
+      <w:r>
+        <w:rPr/>
+      </w:r>
+    </w:p>
+    <w:p>
+      <w:pPr>
+        <w:pStyle w:val="Normal"/>
+        <w:rPr/>
+      </w:pPr>
+      <w:r>
+        <w:rPr>
+          <w:rStyle w:val="Hyperlink"/>
+        </w:rPr>
+        <w:t>https://en.wikipedia.org/wiki/Fall_of_the_Western_Roman_Empire</w:t>
+      </w:r>
+    </w:p>
+    <w:p>
+      <w:pPr>
+        <w:pStyle w:val="Normal"/>
+        <w:rPr/>
+      </w:pPr>
+      <w:r>
+        <w:rPr/>
+      </w:r>
+    </w:p>
+    <w:p>
+      <w:pPr>
+        <w:pStyle w:val="Normal"/>
+        <w:rPr/>
+      </w:pPr>
+      <w:hyperlink r:id="rId6">
         <w:r>
           <w:rPr>
             <w:rStyle w:val="Hyperlink"/>
@@ -7105,6 +6786,7 @@
           <w:ilvl w:val="0"/>
           <w:numId w:val="1"/>
         </w:numPr>
+        <w:spacing w:before="0" w:after="120"/>
         <w:ind w:hanging="0" w:start="0"/>
         <w:rPr/>
       </w:pPr>
@@ -7294,7 +6976,9 @@
       </w:r>
     </w:p>
     <w:sectPr>
-      <w:footerReference w:type="default" r:id="rId13"/>
+      <w:footerReference w:type="even" r:id="rId7"/>
+      <w:footerReference w:type="default" r:id="rId8"/>
+      <w:footerReference w:type="first" r:id="rId9"/>
       <w:type w:val="nextPage"/>
       <w:pgSz w:w="11906" w:h="16838"/>
       <w:pgMar w:left="1134" w:right="1134" w:gutter="0" w:header="0" w:top="1134" w:footer="1134" w:bottom="1693"/>
@@ -7308,6 +6992,20 @@
 </file>
 
 <file path=word/footer1.xml><?xml version="1.0" encoding="utf-8"?>
+<w:ftr xmlns:o="urn:schemas-microsoft-com:office:office" xmlns:r="http://schemas.openxmlformats.org/officeDocument/2006/relationships" xmlns:v="urn:schemas-microsoft-com:vml" xmlns:w="http://schemas.openxmlformats.org/wordprocessingml/2006/main" xmlns:w10="urn:schemas-microsoft-com:office:word" xmlns:wp="http://schemas.openxmlformats.org/drawingml/2006/wordprocessingDrawing" xmlns:wps="http://schemas.microsoft.com/office/word/2010/wordprocessingShape" xmlns:wpg="http://schemas.microsoft.com/office/word/2010/wordprocessingGroup" xmlns:mc="http://schemas.openxmlformats.org/markup-compatibility/2006" xmlns:wp14="http://schemas.microsoft.com/office/word/2010/wordprocessingDrawing" xmlns:w14="http://schemas.microsoft.com/office/word/2010/wordml" xmlns:w15="http://schemas.microsoft.com/office/word/2012/wordml" mc:Ignorable="w14 wp14 w15">
+  <w:p>
+    <w:pPr>
+      <w:pStyle w:val="Footer"/>
+      <w:rPr/>
+    </w:pPr>
+    <w:r>
+      <w:rPr/>
+    </w:r>
+  </w:p>
+</w:ftr>
+</file>
+
+<file path=word/footer2.xml><?xml version="1.0" encoding="utf-8"?>
 <w:ftr xmlns:o="urn:schemas-microsoft-com:office:office" xmlns:r="http://schemas.openxmlformats.org/officeDocument/2006/relationships" xmlns:v="urn:schemas-microsoft-com:vml" xmlns:w="http://schemas.openxmlformats.org/wordprocessingml/2006/main" xmlns:w10="urn:schemas-microsoft-com:office:word" xmlns:wp="http://schemas.openxmlformats.org/drawingml/2006/wordprocessingDrawing" xmlns:wps="http://schemas.microsoft.com/office/word/2010/wordprocessingShape" xmlns:wpg="http://schemas.microsoft.com/office/word/2010/wordprocessingGroup" xmlns:mc="http://schemas.openxmlformats.org/markup-compatibility/2006" xmlns:wp14="http://schemas.microsoft.com/office/word/2010/wordprocessingDrawing" xmlns:w14="http://schemas.microsoft.com/office/word/2010/wordml" xmlns:w15="http://schemas.microsoft.com/office/word/2012/wordml" mc:Ignorable="w14 wp14 w15">
   <w:p>
     <w:pPr>
@@ -7333,7 +7031,7 @@
     </w:r>
     <w:r>
       <w:rPr/>
-      <w:t>10</w:t>
+      <w:t>11</w:t>
     </w:r>
     <w:r>
       <w:rPr/>
@@ -7357,7 +7055,67 @@
     </w:r>
     <w:r>
       <w:rPr/>
-      <w:t>10</w:t>
+      <w:t>11</w:t>
+    </w:r>
+    <w:r>
+      <w:rPr/>
+      <w:fldChar w:fldCharType="end"/>
+    </w:r>
+  </w:p>
+</w:ftr>
+</file>
+
+<file path=word/footer3.xml><?xml version="1.0" encoding="utf-8"?>
+<w:ftr xmlns:o="urn:schemas-microsoft-com:office:office" xmlns:r="http://schemas.openxmlformats.org/officeDocument/2006/relationships" xmlns:v="urn:schemas-microsoft-com:vml" xmlns:w="http://schemas.openxmlformats.org/wordprocessingml/2006/main" xmlns:w10="urn:schemas-microsoft-com:office:word" xmlns:wp="http://schemas.openxmlformats.org/drawingml/2006/wordprocessingDrawing" xmlns:wps="http://schemas.microsoft.com/office/word/2010/wordprocessingShape" xmlns:wpg="http://schemas.microsoft.com/office/word/2010/wordprocessingGroup" xmlns:mc="http://schemas.openxmlformats.org/markup-compatibility/2006" xmlns:wp14="http://schemas.microsoft.com/office/word/2010/wordprocessingDrawing" xmlns:w14="http://schemas.microsoft.com/office/word/2010/wordml" xmlns:w15="http://schemas.microsoft.com/office/word/2012/wordml" mc:Ignorable="w14 wp14 w15">
+  <w:p>
+    <w:pPr>
+      <w:pStyle w:val="Footer"/>
+      <w:jc w:val="center"/>
+      <w:rPr/>
+    </w:pPr>
+    <w:r>
+      <w:rPr/>
+      <w:t xml:space="preserve">Page </w:t>
+    </w:r>
+    <w:r>
+      <w:rPr/>
+      <w:fldChar w:fldCharType="begin"/>
+    </w:r>
+    <w:r>
+      <w:rPr/>
+      <w:instrText xml:space="preserve"> PAGE </w:instrText>
+    </w:r>
+    <w:r>
+      <w:rPr/>
+      <w:fldChar w:fldCharType="separate"/>
+    </w:r>
+    <w:r>
+      <w:rPr/>
+      <w:t>11</w:t>
+    </w:r>
+    <w:r>
+      <w:rPr/>
+      <w:fldChar w:fldCharType="end"/>
+    </w:r>
+    <w:r>
+      <w:rPr/>
+      <w:t xml:space="preserve"> of </w:t>
+    </w:r>
+    <w:r>
+      <w:rPr/>
+      <w:fldChar w:fldCharType="begin"/>
+    </w:r>
+    <w:r>
+      <w:rPr/>
+      <w:instrText xml:space="preserve"> NUMPAGES </w:instrText>
+    </w:r>
+    <w:r>
+      <w:rPr/>
+      <w:fldChar w:fldCharType="separate"/>
+    </w:r>
+    <w:r>
+      <w:rPr/>
+      <w:t>11</w:t>
     </w:r>
     <w:r>
       <w:rPr/>
@@ -8589,7 +8347,7 @@
       <w:suppressAutoHyphens w:val="true"/>
       <w:bidi w:val="0"/>
       <w:spacing w:before="0" w:after="0"/>
-      <w:jc w:val="start"/>
+      <w:jc w:val="both"/>
     </w:pPr>
     <w:rPr>
       <w:rFonts w:ascii="Liberation Serif" w:hAnsi="Liberation Serif" w:eastAsia="Noto Serif CJK SC" w:cs="Noto Sans Devanagari"/>

</xml_diff>

<commit_message>
Massive changes to report, added ReLU and BCE, added stratified spitting to class.
</commit_message>
<xml_diff>
--- a/assessment/Writ1_Artificial-Intelligence_ST20285213-Tom-Rowan.docx
+++ b/assessment/Writ1_Artificial-Intelligence_ST20285213-Tom-Rowan.docx
@@ -217,8 +217,8 @@
             </w:pPr>
             <w:bookmarkStart w:id="0" w:name="__RefHeading___Toc3119_3504685749"/>
             <w:bookmarkStart w:id="1" w:name="_Toc215733927"/>
-            <w:bookmarkStart w:id="2" w:name="_Toc199754777"/>
-            <w:bookmarkStart w:id="3" w:name="_Toc155876009"/>
+            <w:bookmarkStart w:id="2" w:name="_Toc155876009"/>
+            <w:bookmarkStart w:id="3" w:name="_Toc199754777"/>
             <w:bookmarkEnd w:id="0"/>
             <w:r>
               <w:rPr>
@@ -6958,22 +6958,6 @@
     </w:p>
     <w:p>
       <w:pPr>
-        <w:pStyle w:val="Normal"/>
-        <w:numPr>
-          <w:ilvl w:val="0"/>
-          <w:numId w:val="1"/>
-        </w:numPr>
-        <w:rPr/>
-      </w:pPr>
-      <w:bookmarkStart w:id="21" w:name="__RefHeading___Toc3125_3504685749_Copy_1"/>
-      <w:bookmarkEnd w:id="21"/>
-      <w:r>
-        <w:rPr/>
-        <w:t xml:space="preserve">What we are doing, why we are doing it, and how we are doing it… </w:t>
-      </w:r>
-    </w:p>
-    <w:p>
-      <w:pPr>
         <w:pStyle w:val="Heading2"/>
         <w:numPr>
           <w:ilvl w:val="1"/>
@@ -6982,8 +6966,8 @@
         <w:ind w:hanging="0" w:start="0"/>
         <w:rPr/>
       </w:pPr>
-      <w:bookmarkStart w:id="22" w:name="__RefHeading___Toc2842_500896196"/>
-      <w:bookmarkEnd w:id="22"/>
+      <w:bookmarkStart w:id="21" w:name="__RefHeading___Toc2842_500896196"/>
+      <w:bookmarkEnd w:id="21"/>
       <w:r>
         <w:rPr/>
         <w:t>Dataset Preparation</w:t>
@@ -8063,25 +8047,447 @@
       </w:pPr>
       <w:r>
         <w:rPr/>
-        <w:t>Poutcome?</w:t>
-      </w:r>
-    </w:p>
-    <w:p>
-      <w:pPr>
-        <w:pStyle w:val="Normal"/>
-        <w:rPr/>
-      </w:pPr>
-      <w:r>
-        <w:rPr/>
-      </w:r>
-    </w:p>
-    <w:p>
-      <w:pPr>
-        <w:pStyle w:val="Normal"/>
-        <w:rPr/>
-      </w:pPr>
-      <w:r>
-        <w:rPr/>
+        <w:t>It makes sense that th</w:t>
+      </w:r>
+      <w:r>
+        <w:rPr/>
+        <w:t>e ‘previous outcome’</w:t>
+      </w:r>
+      <w:r>
+        <w:rPr/>
+        <w:t xml:space="preserve"> feature would likely be a useful indicator for predicting the future outcome. If someone said yes before then they may well be amenable to making further deposits. Conversely, having said yes before may indicate strongly that a person will not make a deposit again. </w:t>
+      </w:r>
+      <w:r>
+        <w:rPr/>
+        <w:t>Either way, it is likely to make a significant impact on a future result.</w:t>
+      </w:r>
+    </w:p>
+    <w:p>
+      <w:pPr>
+        <w:pStyle w:val="Normal"/>
+        <w:rPr/>
+      </w:pPr>
+      <w:r>
+        <w:rPr/>
+      </w:r>
+    </w:p>
+    <w:p>
+      <w:pPr>
+        <w:pStyle w:val="Normal"/>
+        <w:rPr/>
+      </w:pPr>
+      <w:r>
+        <w:rPr/>
+        <w:drawing>
+          <wp:anchor behindDoc="0" distT="0" distB="0" distL="0" distR="0" simplePos="0" locked="0" layoutInCell="0" allowOverlap="1" relativeHeight="10">
+            <wp:simplePos x="0" y="0"/>
+            <wp:positionH relativeFrom="column">
+              <wp:align>center</wp:align>
+            </wp:positionH>
+            <wp:positionV relativeFrom="paragraph">
+              <wp:posOffset>635</wp:posOffset>
+            </wp:positionV>
+            <wp:extent cx="4994275" cy="2962910"/>
+            <wp:effectExtent l="0" t="0" r="0" b="0"/>
+            <wp:wrapTopAndBottom/>
+            <wp:docPr id="7" name="Image9" descr="" title=""/>
+            <wp:cNvGraphicFramePr>
+              <a:graphicFrameLocks xmlns:a="http://schemas.openxmlformats.org/drawingml/2006/main" noChangeAspect="1"/>
+            </wp:cNvGraphicFramePr>
+            <a:graphic xmlns:a="http://schemas.openxmlformats.org/drawingml/2006/main">
+              <a:graphicData uri="http://schemas.openxmlformats.org/drawingml/2006/picture">
+                <pic:pic xmlns:pic="http://schemas.openxmlformats.org/drawingml/2006/picture">
+                  <pic:nvPicPr>
+                    <pic:cNvPr id="7" name="Image9" descr="" title=""/>
+                    <pic:cNvPicPr>
+                      <a:picLocks noChangeAspect="1" noChangeArrowheads="1"/>
+                    </pic:cNvPicPr>
+                  </pic:nvPicPr>
+                  <pic:blipFill>
+                    <a:blip r:embed="rId11"/>
+                    <a:stretch>
+                      <a:fillRect/>
+                    </a:stretch>
+                  </pic:blipFill>
+                  <pic:spPr bwMode="auto">
+                    <a:xfrm>
+                      <a:off x="0" y="0"/>
+                      <a:ext cx="4994275" cy="2962910"/>
+                    </a:xfrm>
+                    <a:prstGeom prst="rect">
+                      <a:avLst/>
+                    </a:prstGeom>
+                  </pic:spPr>
+                </pic:pic>
+              </a:graphicData>
+            </a:graphic>
+          </wp:anchor>
+        </w:drawing>
+      </w:r>
+    </w:p>
+    <w:p>
+      <w:pPr>
+        <w:pStyle w:val="Normal"/>
+        <w:rPr/>
+      </w:pPr>
+      <w:r>
+        <w:rPr/>
+      </w:r>
+    </w:p>
+    <w:p>
+      <w:pPr>
+        <w:pStyle w:val="Normal"/>
+        <w:rPr/>
+      </w:pPr>
+      <w:r>
+        <w:rPr/>
+        <w:t xml:space="preserve">The </w:t>
+      </w:r>
+      <w:r>
+        <w:rPr/>
+        <w:t>graph shows that there</w:t>
+      </w:r>
+      <w:r>
+        <w:rPr/>
+        <w:t xml:space="preserve"> is a massive disparity in the results, </w:t>
+      </w:r>
+      <w:r>
+        <w:rPr/>
+        <w:t xml:space="preserve">and </w:t>
+      </w:r>
+      <w:r>
+        <w:rPr/>
+        <w:t xml:space="preserve">if an individual said "yes" last time, they are overwhelmingly likely to say "yes" again. </w:t>
+      </w:r>
+    </w:p>
+    <w:p>
+      <w:pPr>
+        <w:pStyle w:val="Normal"/>
+        <w:rPr/>
+      </w:pPr>
+      <w:r>
+        <w:rPr/>
+      </w:r>
+    </w:p>
+    <w:p>
+      <w:pPr>
+        <w:pStyle w:val="Normal"/>
+        <w:rPr/>
+      </w:pPr>
+      <w:r>
+        <w:rPr/>
+        <w:t>One Hot Encoding would allow the MLP to determine for itself that the previous outcome is an excellent indicator. However, as the number of unknowns is very high in comparison, there is a strong chance that the MLP might miss these relatively rare signals. This may be made worse as they are distributed across training, validation and test sets.</w:t>
+      </w:r>
+    </w:p>
+    <w:p>
+      <w:pPr>
+        <w:pStyle w:val="Normal"/>
+        <w:rPr/>
+      </w:pPr>
+      <w:r>
+        <w:rPr/>
+      </w:r>
+    </w:p>
+    <w:p>
+      <w:pPr>
+        <w:pStyle w:val="Normal"/>
+        <w:rPr/>
+      </w:pPr>
+      <w:r>
+        <w:rPr/>
+        <w:t xml:space="preserve">To assist the MLP in spotting these rare but strong indicators, I </w:t>
+      </w:r>
+      <w:r>
+        <w:rPr/>
+        <w:t>used</w:t>
+      </w:r>
+      <w:r>
+        <w:rPr/>
+        <w:t xml:space="preserve"> a map to manually weight these values </w:t>
+      </w:r>
+      <w:r>
+        <w:rPr/>
+        <w:t xml:space="preserve">highly </w:t>
+      </w:r>
+      <w:r>
+        <w:rPr/>
+        <w:t>to reflect their importance:</w:t>
+      </w:r>
+    </w:p>
+    <w:p>
+      <w:pPr>
+        <w:pStyle w:val="Normal"/>
+        <w:rPr/>
+      </w:pPr>
+      <w:r>
+        <w:rPr/>
+      </w:r>
+    </w:p>
+    <w:tbl>
+      <w:tblPr>
+        <w:tblW w:w="3855" w:type="dxa"/>
+        <w:jc w:val="start"/>
+        <w:tblInd w:w="-5" w:type="dxa"/>
+        <w:tblLayout w:type="fixed"/>
+        <w:tblCellMar>
+          <w:top w:w="55" w:type="dxa"/>
+          <w:start w:w="55" w:type="dxa"/>
+          <w:bottom w:w="55" w:type="dxa"/>
+          <w:end w:w="55" w:type="dxa"/>
+        </w:tblCellMar>
+      </w:tblPr>
+      <w:tblGrid>
+        <w:gridCol w:w="1753"/>
+        <w:gridCol w:w="2102"/>
+      </w:tblGrid>
+      <w:tr>
+        <w:trPr/>
+        <w:tc>
+          <w:tcPr>
+            <w:tcW w:w="1753" w:type="dxa"/>
+            <w:tcBorders>
+              <w:top w:val="single" w:sz="4" w:space="0" w:color="000000"/>
+              <w:start w:val="single" w:sz="4" w:space="0" w:color="000000"/>
+              <w:bottom w:val="single" w:sz="4" w:space="0" w:color="000000"/>
+            </w:tcBorders>
+          </w:tcPr>
+          <w:p>
+            <w:pPr>
+              <w:pStyle w:val="TableContents"/>
+              <w:rPr/>
+            </w:pPr>
+            <w:r>
+              <w:rPr/>
+              <w:t>Value</w:t>
+            </w:r>
+          </w:p>
+        </w:tc>
+        <w:tc>
+          <w:tcPr>
+            <w:tcW w:w="2102" w:type="dxa"/>
+            <w:tcBorders>
+              <w:top w:val="single" w:sz="4" w:space="0" w:color="000000"/>
+              <w:start w:val="single" w:sz="4" w:space="0" w:color="000000"/>
+              <w:bottom w:val="single" w:sz="4" w:space="0" w:color="000000"/>
+              <w:end w:val="single" w:sz="4" w:space="0" w:color="000000"/>
+            </w:tcBorders>
+          </w:tcPr>
+          <w:p>
+            <w:pPr>
+              <w:pStyle w:val="TableContents"/>
+              <w:rPr/>
+            </w:pPr>
+            <w:r>
+              <w:rPr/>
+              <w:t>Weighted Map</w:t>
+            </w:r>
+          </w:p>
+        </w:tc>
+      </w:tr>
+      <w:tr>
+        <w:trPr/>
+        <w:tc>
+          <w:tcPr>
+            <w:tcW w:w="1753" w:type="dxa"/>
+            <w:tcBorders>
+              <w:start w:val="single" w:sz="4" w:space="0" w:color="000000"/>
+              <w:bottom w:val="single" w:sz="4" w:space="0" w:color="000000"/>
+            </w:tcBorders>
+          </w:tcPr>
+          <w:p>
+            <w:pPr>
+              <w:pStyle w:val="TableContents"/>
+              <w:rPr/>
+            </w:pPr>
+            <w:r>
+              <w:rPr/>
+              <w:t>Success</w:t>
+            </w:r>
+          </w:p>
+        </w:tc>
+        <w:tc>
+          <w:tcPr>
+            <w:tcW w:w="2102" w:type="dxa"/>
+            <w:tcBorders>
+              <w:start w:val="single" w:sz="4" w:space="0" w:color="000000"/>
+              <w:bottom w:val="single" w:sz="4" w:space="0" w:color="000000"/>
+              <w:end w:val="single" w:sz="4" w:space="0" w:color="000000"/>
+            </w:tcBorders>
+          </w:tcPr>
+          <w:p>
+            <w:pPr>
+              <w:pStyle w:val="TableContents"/>
+              <w:rPr/>
+            </w:pPr>
+            <w:r>
+              <w:rPr/>
+              <w:t>7</w:t>
+            </w:r>
+          </w:p>
+        </w:tc>
+      </w:tr>
+      <w:tr>
+        <w:trPr/>
+        <w:tc>
+          <w:tcPr>
+            <w:tcW w:w="1753" w:type="dxa"/>
+            <w:tcBorders>
+              <w:start w:val="single" w:sz="4" w:space="0" w:color="000000"/>
+              <w:bottom w:val="single" w:sz="4" w:space="0" w:color="000000"/>
+            </w:tcBorders>
+          </w:tcPr>
+          <w:p>
+            <w:pPr>
+              <w:pStyle w:val="TableContents"/>
+              <w:rPr/>
+            </w:pPr>
+            <w:r>
+              <w:rPr/>
+              <w:t>Other</w:t>
+            </w:r>
+          </w:p>
+        </w:tc>
+        <w:tc>
+          <w:tcPr>
+            <w:tcW w:w="2102" w:type="dxa"/>
+            <w:tcBorders>
+              <w:start w:val="single" w:sz="4" w:space="0" w:color="000000"/>
+              <w:bottom w:val="single" w:sz="4" w:space="0" w:color="000000"/>
+              <w:end w:val="single" w:sz="4" w:space="0" w:color="000000"/>
+            </w:tcBorders>
+          </w:tcPr>
+          <w:p>
+            <w:pPr>
+              <w:pStyle w:val="TableContents"/>
+              <w:rPr/>
+            </w:pPr>
+            <w:r>
+              <w:rPr/>
+              <w:t>2</w:t>
+            </w:r>
+          </w:p>
+        </w:tc>
+      </w:tr>
+      <w:tr>
+        <w:trPr/>
+        <w:tc>
+          <w:tcPr>
+            <w:tcW w:w="1753" w:type="dxa"/>
+            <w:tcBorders>
+              <w:start w:val="single" w:sz="4" w:space="0" w:color="000000"/>
+              <w:bottom w:val="single" w:sz="4" w:space="0" w:color="000000"/>
+            </w:tcBorders>
+          </w:tcPr>
+          <w:p>
+            <w:pPr>
+              <w:pStyle w:val="TableContents"/>
+              <w:rPr/>
+            </w:pPr>
+            <w:r>
+              <w:rPr/>
+              <w:t>Failure</w:t>
+            </w:r>
+          </w:p>
+        </w:tc>
+        <w:tc>
+          <w:tcPr>
+            <w:tcW w:w="2102" w:type="dxa"/>
+            <w:tcBorders>
+              <w:start w:val="single" w:sz="4" w:space="0" w:color="000000"/>
+              <w:bottom w:val="single" w:sz="4" w:space="0" w:color="000000"/>
+              <w:end w:val="single" w:sz="4" w:space="0" w:color="000000"/>
+            </w:tcBorders>
+          </w:tcPr>
+          <w:p>
+            <w:pPr>
+              <w:pStyle w:val="TableContents"/>
+              <w:rPr/>
+            </w:pPr>
+            <w:r>
+              <w:rPr/>
+              <w:t>0</w:t>
+            </w:r>
+          </w:p>
+        </w:tc>
+      </w:tr>
+      <w:tr>
+        <w:trPr/>
+        <w:tc>
+          <w:tcPr>
+            <w:tcW w:w="1753" w:type="dxa"/>
+            <w:tcBorders>
+              <w:start w:val="single" w:sz="4" w:space="0" w:color="000000"/>
+              <w:bottom w:val="single" w:sz="4" w:space="0" w:color="000000"/>
+            </w:tcBorders>
+          </w:tcPr>
+          <w:p>
+            <w:pPr>
+              <w:pStyle w:val="TableContents"/>
+              <w:rPr/>
+            </w:pPr>
+            <w:r>
+              <w:rPr/>
+              <w:t>Unknown</w:t>
+            </w:r>
+          </w:p>
+        </w:tc>
+        <w:tc>
+          <w:tcPr>
+            <w:tcW w:w="2102" w:type="dxa"/>
+            <w:tcBorders>
+              <w:start w:val="single" w:sz="4" w:space="0" w:color="000000"/>
+              <w:bottom w:val="single" w:sz="4" w:space="0" w:color="000000"/>
+              <w:end w:val="single" w:sz="4" w:space="0" w:color="000000"/>
+            </w:tcBorders>
+          </w:tcPr>
+          <w:p>
+            <w:pPr>
+              <w:pStyle w:val="TableContents"/>
+              <w:rPr/>
+            </w:pPr>
+            <w:r>
+              <w:rPr/>
+              <w:t>1</w:t>
+            </w:r>
+          </w:p>
+        </w:tc>
+      </w:tr>
+    </w:tbl>
+    <w:p>
+      <w:pPr>
+        <w:pStyle w:val="Normal"/>
+        <w:rPr/>
+      </w:pPr>
+      <w:r>
+        <w:rPr/>
+      </w:r>
+    </w:p>
+    <w:p>
+      <w:pPr>
+        <w:pStyle w:val="Normal"/>
+        <w:rPr/>
+      </w:pPr>
+      <w:r>
+        <w:rPr/>
+      </w:r>
+    </w:p>
+    <w:p>
+      <w:pPr>
+        <w:pStyle w:val="Heading3"/>
+        <w:widowControl/>
+        <w:numPr>
+          <w:ilvl w:val="0"/>
+          <w:numId w:val="0"/>
+        </w:numPr>
+        <w:suppressAutoHyphens w:val="true"/>
+        <w:jc w:val="both"/>
+        <w:rPr/>
+      </w:pPr>
+      <w:r>
+        <w:rPr/>
+      </w:r>
+      <w:r>
+        <w:br w:type="page"/>
       </w:r>
     </w:p>
     <w:p>
@@ -8094,8 +8500,8 @@
         <w:ind w:hanging="0" w:start="0"/>
         <w:rPr/>
       </w:pPr>
-      <w:bookmarkStart w:id="23" w:name="__RefHeading___Toc2844_500896196"/>
-      <w:bookmarkEnd w:id="23"/>
+      <w:bookmarkStart w:id="22" w:name="__RefHeading___Toc2844_500896196"/>
+      <w:bookmarkEnd w:id="22"/>
       <w:r>
         <w:rPr/>
         <w:t>One-Hot Encoding</w:t>
@@ -8108,24 +8514,23 @@
       </w:pPr>
       <w:r>
         <w:rPr/>
-      </w:r>
-    </w:p>
-    <w:p>
-      <w:pPr>
-        <w:pStyle w:val="Normal"/>
-        <w:rPr/>
-      </w:pPr>
-      <w:r>
-        <w:rPr/>
-        <w:t xml:space="preserve">Categorical features with no natural order </w:t>
-      </w:r>
-      <w:r>
-        <w:rPr/>
-        <w:t>including j</w:t>
-      </w:r>
-      <w:r>
-        <w:rPr/>
-        <w:t xml:space="preserve">ob, marital, contact, and poutcome were expanded </w:t>
+        <w:t>The non-</w:t>
+      </w:r>
+      <w:r>
+        <w:rPr/>
+        <w:t>ordinal c</w:t>
+      </w:r>
+      <w:r>
+        <w:rPr/>
+        <w:t xml:space="preserve">ategorical features </w:t>
+      </w:r>
+      <w:r>
+        <w:rPr/>
+        <w:t>j</w:t>
+      </w:r>
+      <w:r>
+        <w:rPr/>
+        <w:t xml:space="preserve">ob, marital, contact were expanded </w:t>
       </w:r>
       <w:r>
         <w:rPr/>
@@ -8195,8 +8600,8 @@
         <w:ind w:hanging="0" w:start="0"/>
         <w:rPr/>
       </w:pPr>
-      <w:bookmarkStart w:id="24" w:name="__RefHeading___Toc2846_500896196"/>
-      <w:bookmarkEnd w:id="24"/>
+      <w:bookmarkStart w:id="23" w:name="__RefHeading___Toc2846_500896196"/>
+      <w:bookmarkEnd w:id="23"/>
       <w:r>
         <w:rPr/>
         <w:t>Binary Variable Encoding</w:t>
@@ -8231,8 +8636,8 @@
         <w:ind w:hanging="0" w:start="0"/>
         <w:rPr/>
       </w:pPr>
-      <w:bookmarkStart w:id="25" w:name="__RefHeading___Toc2848_500896196"/>
-      <w:bookmarkEnd w:id="25"/>
+      <w:bookmarkStart w:id="24" w:name="__RefHeading___Toc2848_500896196"/>
+      <w:bookmarkEnd w:id="24"/>
       <w:r>
         <w:rPr/>
         <w:t>Normali</w:t>
@@ -8353,15 +8758,6 @@
       <w:r>
         <w:rPr/>
         <w:t xml:space="preserve"> range.</w:t>
-      </w:r>
-    </w:p>
-    <w:p>
-      <w:pPr>
-        <w:pStyle w:val="Normal"/>
-        <w:rPr/>
-      </w:pPr>
-      <w:r>
-        <w:rPr/>
       </w:r>
     </w:p>
     <w:p>
@@ -8682,6 +9078,25 @@
     <w:p>
       <w:pPr>
         <w:pStyle w:val="Heading3"/>
+        <w:widowControl/>
+        <w:numPr>
+          <w:ilvl w:val="0"/>
+          <w:numId w:val="0"/>
+        </w:numPr>
+        <w:suppressAutoHyphens w:val="true"/>
+        <w:jc w:val="both"/>
+        <w:rPr/>
+      </w:pPr>
+      <w:r>
+        <w:rPr/>
+      </w:r>
+      <w:r>
+        <w:br w:type="page"/>
+      </w:r>
+    </w:p>
+    <w:p>
+      <w:pPr>
+        <w:pStyle w:val="Heading3"/>
         <w:numPr>
           <w:ilvl w:val="2"/>
           <w:numId w:val="1"/>
@@ -8689,8 +9104,8 @@
         <w:ind w:hanging="0" w:start="0"/>
         <w:rPr/>
       </w:pPr>
-      <w:bookmarkStart w:id="26" w:name="__RefHeading___Toc2850_500896196"/>
-      <w:bookmarkEnd w:id="26"/>
+      <w:bookmarkStart w:id="25" w:name="__RefHeading___Toc2850_500896196"/>
+      <w:bookmarkEnd w:id="25"/>
       <w:r>
         <w:rPr/>
         <w:t>Removal of Problematic Features</w:t>
@@ -8763,7 +9178,7 @@
             <wp:extent cx="6120130" cy="2374265"/>
             <wp:effectExtent l="0" t="0" r="0" b="0"/>
             <wp:wrapSquare wrapText="largest"/>
-            <wp:docPr id="7" name="Image5" descr="" title=""/>
+            <wp:docPr id="8" name="Image5" descr="" title=""/>
             <wp:cNvGraphicFramePr>
               <a:graphicFrameLocks xmlns:a="http://schemas.openxmlformats.org/drawingml/2006/main" noChangeAspect="1"/>
             </wp:cNvGraphicFramePr>
@@ -8771,13 +9186,13 @@
               <a:graphicData uri="http://schemas.openxmlformats.org/drawingml/2006/picture">
                 <pic:pic xmlns:pic="http://schemas.openxmlformats.org/drawingml/2006/picture">
                   <pic:nvPicPr>
-                    <pic:cNvPr id="7" name="Image5" descr="" title=""/>
+                    <pic:cNvPr id="8" name="Image5" descr="" title=""/>
                     <pic:cNvPicPr>
                       <a:picLocks noChangeAspect="1" noChangeArrowheads="1"/>
                     </pic:cNvPicPr>
                   </pic:nvPicPr>
                   <pic:blipFill>
-                    <a:blip r:embed="rId11"/>
+                    <a:blip r:embed="rId12"/>
                     <a:stretch>
                       <a:fillRect/>
                     </a:stretch>
@@ -8796,15 +9211,6 @@
             </a:graphic>
           </wp:anchor>
         </w:drawing>
-      </w:r>
-    </w:p>
-    <w:p>
-      <w:pPr>
-        <w:pStyle w:val="Normal"/>
-        <w:rPr/>
-      </w:pPr>
-      <w:r>
-        <w:rPr/>
       </w:r>
     </w:p>
     <w:p>
@@ -8900,10 +9306,21 @@
           <w:p>
             <w:pPr>
               <w:pStyle w:val="Normal"/>
-              <w:rPr/>
+              <w:rPr>
+                <w:b/>
+                <w:bCs/>
+                <w:i w:val="false"/>
+                <w:iCs w:val="false"/>
+                <w:sz w:val="24"/>
+                <w:szCs w:val="24"/>
+              </w:rPr>
             </w:pPr>
             <w:r>
-              <w:rPr/>
+              <w:rPr>
+                <w:bCs/>
+                <w:iCs w:val="false"/>
+                <w:szCs w:val="24"/>
+              </w:rPr>
               <w:t>Feature</w:t>
               <w:tab/>
             </w:r>
@@ -8917,10 +9334,21 @@
           <w:p>
             <w:pPr>
               <w:pStyle w:val="Normal"/>
-              <w:rPr/>
+              <w:rPr>
+                <w:b/>
+                <w:bCs/>
+                <w:i w:val="false"/>
+                <w:iCs w:val="false"/>
+                <w:sz w:val="24"/>
+                <w:szCs w:val="24"/>
+              </w:rPr>
             </w:pPr>
             <w:r>
-              <w:rPr/>
+              <w:rPr>
+                <w:bCs/>
+                <w:iCs w:val="false"/>
+                <w:szCs w:val="24"/>
+              </w:rPr>
               <w:t>Action</w:t>
               <w:tab/>
             </w:r>
@@ -8934,10 +9362,21 @@
           <w:p>
             <w:pPr>
               <w:pStyle w:val="Normal"/>
-              <w:rPr/>
+              <w:rPr>
+                <w:b/>
+                <w:bCs/>
+                <w:i w:val="false"/>
+                <w:iCs w:val="false"/>
+                <w:sz w:val="24"/>
+                <w:szCs w:val="24"/>
+              </w:rPr>
             </w:pPr>
             <w:r>
-              <w:rPr/>
+              <w:rPr>
+                <w:bCs/>
+                <w:iCs w:val="false"/>
+                <w:szCs w:val="24"/>
+              </w:rPr>
               <w:t>Reasoning</w:t>
             </w:r>
           </w:p>
@@ -8953,10 +9392,21 @@
           <w:p>
             <w:pPr>
               <w:pStyle w:val="Normal"/>
-              <w:rPr/>
+              <w:rPr>
+                <w:b w:val="false"/>
+                <w:bCs w:val="false"/>
+                <w:i w:val="false"/>
+                <w:iCs w:val="false"/>
+                <w:sz w:val="24"/>
+                <w:szCs w:val="24"/>
+              </w:rPr>
             </w:pPr>
             <w:r>
-              <w:rPr/>
+              <w:rPr>
+                <w:bCs w:val="false"/>
+                <w:iCs w:val="false"/>
+                <w:szCs w:val="24"/>
+              </w:rPr>
               <w:t>Duration</w:t>
               <w:tab/>
             </w:r>
@@ -8970,10 +9420,21 @@
           <w:p>
             <w:pPr>
               <w:pStyle w:val="Normal"/>
-              <w:rPr/>
+              <w:rPr>
+                <w:b w:val="false"/>
+                <w:bCs w:val="false"/>
+                <w:i w:val="false"/>
+                <w:iCs w:val="false"/>
+                <w:sz w:val="24"/>
+                <w:szCs w:val="24"/>
+              </w:rPr>
             </w:pPr>
             <w:r>
-              <w:rPr/>
+              <w:rPr>
+                <w:bCs w:val="false"/>
+                <w:iCs w:val="false"/>
+                <w:szCs w:val="24"/>
+              </w:rPr>
               <w:t>Dropped</w:t>
               <w:tab/>
             </w:r>
@@ -8987,10 +9448,21 @@
           <w:p>
             <w:pPr>
               <w:pStyle w:val="Normal"/>
-              <w:rPr/>
+              <w:rPr>
+                <w:b w:val="false"/>
+                <w:bCs w:val="false"/>
+                <w:i w:val="false"/>
+                <w:iCs w:val="false"/>
+                <w:sz w:val="24"/>
+                <w:szCs w:val="24"/>
+              </w:rPr>
             </w:pPr>
             <w:r>
-              <w:rPr/>
+              <w:rPr>
+                <w:bCs w:val="false"/>
+                <w:iCs w:val="false"/>
+                <w:szCs w:val="24"/>
+              </w:rPr>
               <w:t>Target leakage; duration is not known at the time of prediction.</w:t>
             </w:r>
           </w:p>
@@ -9006,10 +9478,21 @@
           <w:p>
             <w:pPr>
               <w:pStyle w:val="Normal"/>
-              <w:rPr/>
+              <w:rPr>
+                <w:b w:val="false"/>
+                <w:bCs w:val="false"/>
+                <w:i w:val="false"/>
+                <w:iCs w:val="false"/>
+                <w:sz w:val="24"/>
+                <w:szCs w:val="24"/>
+              </w:rPr>
             </w:pPr>
             <w:r>
-              <w:rPr/>
+              <w:rPr>
+                <w:bCs w:val="false"/>
+                <w:iCs w:val="false"/>
+                <w:szCs w:val="24"/>
+              </w:rPr>
               <w:t>Default</w:t>
               <w:tab/>
             </w:r>
@@ -9023,10 +9506,21 @@
           <w:p>
             <w:pPr>
               <w:pStyle w:val="Normal"/>
-              <w:rPr/>
+              <w:rPr>
+                <w:b w:val="false"/>
+                <w:bCs w:val="false"/>
+                <w:i w:val="false"/>
+                <w:iCs w:val="false"/>
+                <w:sz w:val="24"/>
+                <w:szCs w:val="24"/>
+              </w:rPr>
             </w:pPr>
             <w:r>
-              <w:rPr/>
+              <w:rPr>
+                <w:bCs w:val="false"/>
+                <w:iCs w:val="false"/>
+                <w:szCs w:val="24"/>
+              </w:rPr>
               <w:t>Dropped</w:t>
               <w:tab/>
             </w:r>
@@ -9040,10 +9534,21 @@
           <w:p>
             <w:pPr>
               <w:pStyle w:val="Normal"/>
-              <w:rPr/>
+              <w:rPr>
+                <w:b w:val="false"/>
+                <w:bCs w:val="false"/>
+                <w:i w:val="false"/>
+                <w:iCs w:val="false"/>
+                <w:sz w:val="24"/>
+                <w:szCs w:val="24"/>
+              </w:rPr>
             </w:pPr>
             <w:r>
-              <w:rPr/>
+              <w:rPr>
+                <w:bCs w:val="false"/>
+                <w:iCs w:val="false"/>
+                <w:szCs w:val="24"/>
+              </w:rPr>
               <w:t>Near-zero variance; 98% of entries are 'no'.</w:t>
             </w:r>
           </w:p>
@@ -9059,10 +9564,21 @@
           <w:p>
             <w:pPr>
               <w:pStyle w:val="Normal"/>
-              <w:rPr/>
+              <w:rPr>
+                <w:b w:val="false"/>
+                <w:bCs w:val="false"/>
+                <w:i w:val="false"/>
+                <w:iCs w:val="false"/>
+                <w:sz w:val="24"/>
+                <w:szCs w:val="24"/>
+              </w:rPr>
             </w:pPr>
             <w:r>
-              <w:rPr/>
+              <w:rPr>
+                <w:bCs w:val="false"/>
+                <w:iCs w:val="false"/>
+                <w:szCs w:val="24"/>
+              </w:rPr>
               <w:t xml:space="preserve">Day </w:t>
             </w:r>
           </w:p>
@@ -9075,10 +9591,21 @@
           <w:p>
             <w:pPr>
               <w:pStyle w:val="Normal"/>
-              <w:rPr/>
+              <w:rPr>
+                <w:b w:val="false"/>
+                <w:bCs w:val="false"/>
+                <w:i w:val="false"/>
+                <w:iCs w:val="false"/>
+                <w:sz w:val="24"/>
+                <w:szCs w:val="24"/>
+              </w:rPr>
             </w:pPr>
             <w:r>
-              <w:rPr/>
+              <w:rPr>
+                <w:bCs w:val="false"/>
+                <w:iCs w:val="false"/>
+                <w:szCs w:val="24"/>
+              </w:rPr>
               <w:t xml:space="preserve">Dropped </w:t>
             </w:r>
           </w:p>
@@ -9091,10 +9618,21 @@
           <w:p>
             <w:pPr>
               <w:pStyle w:val="Normal"/>
-              <w:rPr/>
+              <w:rPr>
+                <w:b w:val="false"/>
+                <w:bCs w:val="false"/>
+                <w:i w:val="false"/>
+                <w:iCs w:val="false"/>
+                <w:sz w:val="24"/>
+                <w:szCs w:val="24"/>
+              </w:rPr>
             </w:pPr>
             <w:r>
-              <w:rPr/>
+              <w:rPr>
+                <w:bCs w:val="false"/>
+                <w:iCs w:val="false"/>
+                <w:szCs w:val="24"/>
+              </w:rPr>
               <w:t>Does not appear to add value; no obvious trends.</w:t>
             </w:r>
           </w:p>
@@ -9110,10 +9648,21 @@
           <w:p>
             <w:pPr>
               <w:pStyle w:val="Normal"/>
-              <w:rPr/>
+              <w:rPr>
+                <w:b w:val="false"/>
+                <w:bCs w:val="false"/>
+                <w:i w:val="false"/>
+                <w:iCs w:val="false"/>
+                <w:sz w:val="24"/>
+                <w:szCs w:val="24"/>
+              </w:rPr>
             </w:pPr>
             <w:r>
-              <w:rPr/>
+              <w:rPr>
+                <w:bCs w:val="false"/>
+                <w:iCs w:val="false"/>
+                <w:szCs w:val="24"/>
+              </w:rPr>
               <w:t>Pdays</w:t>
               <w:tab/>
             </w:r>
@@ -9127,10 +9676,21 @@
           <w:p>
             <w:pPr>
               <w:pStyle w:val="Normal"/>
-              <w:rPr/>
+              <w:rPr>
+                <w:b w:val="false"/>
+                <w:bCs w:val="false"/>
+                <w:i w:val="false"/>
+                <w:iCs w:val="false"/>
+                <w:sz w:val="24"/>
+                <w:szCs w:val="24"/>
+              </w:rPr>
             </w:pPr>
             <w:r>
-              <w:rPr/>
+              <w:rPr>
+                <w:bCs w:val="false"/>
+                <w:iCs w:val="false"/>
+                <w:szCs w:val="24"/>
+              </w:rPr>
               <w:t>Binned Version Kept</w:t>
             </w:r>
           </w:p>
@@ -9143,10 +9703,21 @@
           <w:p>
             <w:pPr>
               <w:pStyle w:val="Normal"/>
-              <w:rPr/>
+              <w:rPr>
+                <w:b w:val="false"/>
+                <w:bCs w:val="false"/>
+                <w:i w:val="false"/>
+                <w:iCs w:val="false"/>
+                <w:sz w:val="24"/>
+                <w:szCs w:val="24"/>
+              </w:rPr>
             </w:pPr>
             <w:r>
-              <w:rPr/>
+              <w:rPr>
+                <w:bCs w:val="false"/>
+                <w:iCs w:val="false"/>
+                <w:szCs w:val="24"/>
+              </w:rPr>
               <w:t>Re-encoded to handle multi-modal distribution and -1 values.</w:t>
             </w:r>
           </w:p>
@@ -9162,10 +9733,21 @@
           <w:p>
             <w:pPr>
               <w:pStyle w:val="Normal"/>
-              <w:rPr/>
+              <w:rPr>
+                <w:b w:val="false"/>
+                <w:bCs w:val="false"/>
+                <w:i w:val="false"/>
+                <w:iCs w:val="false"/>
+                <w:sz w:val="24"/>
+                <w:szCs w:val="24"/>
+              </w:rPr>
             </w:pPr>
             <w:r>
-              <w:rPr/>
+              <w:rPr>
+                <w:bCs w:val="false"/>
+                <w:iCs w:val="false"/>
+                <w:szCs w:val="24"/>
+              </w:rPr>
               <w:t>Month</w:t>
             </w:r>
           </w:p>
@@ -9178,10 +9760,21 @@
           <w:p>
             <w:pPr>
               <w:pStyle w:val="Normal"/>
-              <w:rPr/>
+              <w:rPr>
+                <w:b w:val="false"/>
+                <w:bCs w:val="false"/>
+                <w:i w:val="false"/>
+                <w:iCs w:val="false"/>
+                <w:sz w:val="24"/>
+                <w:szCs w:val="24"/>
+              </w:rPr>
             </w:pPr>
             <w:r>
-              <w:rPr/>
+              <w:rPr>
+                <w:bCs w:val="false"/>
+                <w:iCs w:val="false"/>
+                <w:szCs w:val="24"/>
+              </w:rPr>
               <w:t>Encoded version kept</w:t>
             </w:r>
           </w:p>
@@ -9194,10 +9787,21 @@
           <w:p>
             <w:pPr>
               <w:pStyle w:val="Normal"/>
-              <w:rPr/>
+              <w:rPr>
+                <w:b w:val="false"/>
+                <w:bCs w:val="false"/>
+                <w:i w:val="false"/>
+                <w:iCs w:val="false"/>
+                <w:sz w:val="24"/>
+                <w:szCs w:val="24"/>
+              </w:rPr>
             </w:pPr>
             <w:r>
-              <w:rPr/>
+              <w:rPr>
+                <w:bCs w:val="false"/>
+                <w:iCs w:val="false"/>
+                <w:szCs w:val="24"/>
+              </w:rPr>
               <w:t>Re-encoded as values 1-12</w:t>
             </w:r>
           </w:p>
@@ -9213,10 +9817,21 @@
           <w:p>
             <w:pPr>
               <w:pStyle w:val="Normal"/>
-              <w:rPr/>
+              <w:rPr>
+                <w:b w:val="false"/>
+                <w:bCs w:val="false"/>
+                <w:i w:val="false"/>
+                <w:iCs w:val="false"/>
+                <w:sz w:val="24"/>
+                <w:szCs w:val="24"/>
+              </w:rPr>
             </w:pPr>
             <w:r>
-              <w:rPr/>
+              <w:rPr>
+                <w:bCs w:val="false"/>
+                <w:iCs w:val="false"/>
+                <w:szCs w:val="24"/>
+              </w:rPr>
               <w:t>Education</w:t>
             </w:r>
           </w:p>
@@ -9229,10 +9844,21 @@
           <w:p>
             <w:pPr>
               <w:pStyle w:val="Normal"/>
-              <w:rPr/>
+              <w:rPr>
+                <w:b w:val="false"/>
+                <w:bCs w:val="false"/>
+                <w:i w:val="false"/>
+                <w:iCs w:val="false"/>
+                <w:sz w:val="24"/>
+                <w:szCs w:val="24"/>
+              </w:rPr>
             </w:pPr>
             <w:r>
-              <w:rPr/>
+              <w:rPr>
+                <w:bCs w:val="false"/>
+                <w:iCs w:val="false"/>
+                <w:szCs w:val="24"/>
+              </w:rPr>
               <w:t>Encoded version kept</w:t>
             </w:r>
           </w:p>
@@ -9245,10 +9871,21 @@
           <w:p>
             <w:pPr>
               <w:pStyle w:val="Normal"/>
-              <w:rPr/>
+              <w:rPr>
+                <w:b w:val="false"/>
+                <w:bCs w:val="false"/>
+                <w:i w:val="false"/>
+                <w:iCs w:val="false"/>
+                <w:sz w:val="24"/>
+                <w:szCs w:val="24"/>
+              </w:rPr>
             </w:pPr>
             <w:r>
-              <w:rPr/>
+              <w:rPr>
+                <w:bCs w:val="false"/>
+                <w:iCs w:val="false"/>
+                <w:szCs w:val="24"/>
+              </w:rPr>
               <w:t>Re-encoded as values 0-3</w:t>
             </w:r>
           </w:p>
@@ -9264,10 +9901,21 @@
           <w:p>
             <w:pPr>
               <w:pStyle w:val="Normal"/>
-              <w:rPr/>
+              <w:rPr>
+                <w:b/>
+                <w:bCs/>
+                <w:i w:val="false"/>
+                <w:iCs w:val="false"/>
+                <w:sz w:val="24"/>
+                <w:szCs w:val="24"/>
+              </w:rPr>
             </w:pPr>
             <w:r>
-              <w:rPr/>
+              <w:rPr>
+                <w:bCs/>
+                <w:iCs w:val="false"/>
+                <w:szCs w:val="24"/>
+              </w:rPr>
               <w:t>Poutcome</w:t>
             </w:r>
           </w:p>
@@ -9280,10 +9928,21 @@
           <w:p>
             <w:pPr>
               <w:pStyle w:val="Normal"/>
-              <w:rPr/>
+              <w:rPr>
+                <w:b/>
+                <w:bCs/>
+                <w:i w:val="false"/>
+                <w:iCs w:val="false"/>
+                <w:sz w:val="24"/>
+                <w:szCs w:val="24"/>
+              </w:rPr>
             </w:pPr>
             <w:r>
-              <w:rPr/>
+              <w:rPr>
+                <w:bCs/>
+                <w:iCs w:val="false"/>
+                <w:szCs w:val="24"/>
+              </w:rPr>
               <w:t>Encoded version kept</w:t>
             </w:r>
           </w:p>
@@ -9296,10 +9955,21 @@
           <w:p>
             <w:pPr>
               <w:pStyle w:val="Normal"/>
-              <w:rPr/>
+              <w:rPr>
+                <w:b/>
+                <w:bCs/>
+                <w:i w:val="false"/>
+                <w:iCs w:val="false"/>
+                <w:sz w:val="24"/>
+                <w:szCs w:val="24"/>
+              </w:rPr>
             </w:pPr>
             <w:r>
-              <w:rPr/>
+              <w:rPr>
+                <w:bCs/>
+                <w:iCs w:val="false"/>
+                <w:szCs w:val="24"/>
+              </w:rPr>
               <w:t>Re-encoded as values 0-7</w:t>
             </w:r>
           </w:p>
@@ -9339,89 +10009,20 @@
     <w:p>
       <w:pPr>
         <w:pStyle w:val="Heading3"/>
+        <w:widowControl/>
         <w:numPr>
-          <w:ilvl w:val="2"/>
-          <w:numId w:val="1"/>
+          <w:ilvl w:val="0"/>
+          <w:numId w:val="0"/>
         </w:numPr>
-        <w:ind w:hanging="0" w:start="0"/>
-        <w:rPr/>
-      </w:pPr>
-      <w:bookmarkStart w:id="27" w:name="__RefHeading___Toc2852_500896196"/>
-      <w:bookmarkEnd w:id="27"/>
-      <w:r>
-        <w:rPr/>
-        <w:t>Correlation with Dependent Variable ‘y’</w:t>
-      </w:r>
-    </w:p>
-    <w:p>
-      <w:pPr>
-        <w:pStyle w:val="BodyText"/>
-        <w:rPr/>
-      </w:pPr>
-      <w:r>
-        <w:rPr/>
-        <w:t>The remaining features in the dataset were compared with the target variable ‘y’ to chow which features have the best correlation. I would expect these features to correspond to strong indicators for the MLP to learn from.</w:t>
-      </w:r>
-    </w:p>
-    <w:p>
-      <w:pPr>
-        <w:pStyle w:val="BodyText"/>
-        <w:bidi w:val="0"/>
-        <w:rPr/>
-      </w:pPr>
-      <w:r>
-        <w:rPr>
-          <w:b/>
-          <w:bCs/>
-        </w:rPr>
-        <w:t>Strongest Positive Correlation:</w:t>
-      </w:r>
-      <w:r>
-        <w:rPr/>
-        <w:t xml:space="preserve"> poutcome_numeric (0.289) and contact_cellular (0.136).</w:t>
-      </w:r>
-    </w:p>
-    <w:p>
-      <w:pPr>
-        <w:pStyle w:val="BodyText"/>
-        <w:rPr/>
-      </w:pPr>
-      <w:r>
-        <w:rPr>
-          <w:b/>
-          <w:bCs/>
-        </w:rPr>
-        <w:t>Demographics:</w:t>
-      </w:r>
-      <w:r>
-        <w:rPr/>
-        <w:t xml:space="preserve"> job_retired, job_student, and marital_single are all positively correlated with success. This confirms that specific life stages are more likely to say "yes". Students, for example, are likely planning for their future and trying to make savings, while the retired likely have spare cash to invest.</w:t>
-      </w:r>
-    </w:p>
-    <w:p>
-      <w:pPr>
-        <w:pStyle w:val="BodyText"/>
-        <w:rPr/>
-      </w:pPr>
-      <w:r>
-        <w:rPr>
-          <w:b/>
-          <w:bCs/>
-        </w:rPr>
-        <w:t xml:space="preserve">Weak correlation: </w:t>
-      </w:r>
-      <w:r>
-        <w:rPr/>
-        <w:t>Balance (0.053) is lower than might be expected. It is not the primary driver for a "yes" in this campaign.</w:t>
-      </w:r>
-    </w:p>
-    <w:p>
-      <w:pPr>
-        <w:pStyle w:val="BodyText"/>
-        <w:rPr/>
-      </w:pPr>
-      <w:r>
-        <w:rPr/>
+        <w:suppressAutoHyphens w:val="true"/>
+        <w:jc w:val="both"/>
+        <w:rPr/>
+      </w:pPr>
+      <w:r>
+        <w:rPr/>
+      </w:r>
+      <w:r>
+        <w:br w:type="page"/>
       </w:r>
     </w:p>
     <w:p>
@@ -9434,8 +10035,34 @@
         <w:ind w:hanging="0" w:start="0"/>
         <w:rPr/>
       </w:pPr>
-      <w:bookmarkStart w:id="28" w:name="__RefHeading___Toc2854_500896196"/>
-      <w:bookmarkEnd w:id="28"/>
+      <w:bookmarkStart w:id="26" w:name="__RefHeading___Toc2852_500896196"/>
+      <w:bookmarkEnd w:id="26"/>
+      <w:r>
+        <w:rPr/>
+        <w:t>Correlation with Dependent Variable ‘y’</w:t>
+      </w:r>
+    </w:p>
+    <w:p>
+      <w:pPr>
+        <w:pStyle w:val="BodyText"/>
+        <w:rPr/>
+      </w:pPr>
+      <w:r>
+        <w:rPr/>
+        <w:t>The remaining features in the dataset were compared with the target variable ‘y’ to chow which features have the best correlation. I would expect these features to correspond to strong indicators for the MLP to learn from.</w:t>
+      </w:r>
+    </w:p>
+    <w:p>
+      <w:pPr>
+        <w:pStyle w:val="BodyText"/>
+        <w:rPr/>
+      </w:pPr>
+      <w:bookmarkStart w:id="27" w:name="__RefHeading___Toc2854_500896196"/>
+      <w:bookmarkEnd w:id="27"/>
+      <w:r>
+        <w:rPr/>
+        <w:br/>
+      </w:r>
       <w:r>
         <w:drawing>
           <wp:anchor behindDoc="0" distT="0" distB="0" distL="0" distR="0" simplePos="0" locked="0" layoutInCell="0" allowOverlap="1" relativeHeight="9">
@@ -9446,10 +10073,10 @@
             <wp:positionV relativeFrom="paragraph">
               <wp:posOffset>635</wp:posOffset>
             </wp:positionV>
-            <wp:extent cx="6120130" cy="4869815"/>
+            <wp:extent cx="5638800" cy="4486910"/>
             <wp:effectExtent l="0" t="0" r="0" b="0"/>
-            <wp:wrapSquare wrapText="largest"/>
-            <wp:docPr id="8" name="Image8" descr="" title=""/>
+            <wp:wrapTopAndBottom/>
+            <wp:docPr id="9" name="Image8" descr="" title=""/>
             <wp:cNvGraphicFramePr>
               <a:graphicFrameLocks xmlns:a="http://schemas.openxmlformats.org/drawingml/2006/main" noChangeAspect="1"/>
             </wp:cNvGraphicFramePr>
@@ -9457,13 +10084,13 @@
               <a:graphicData uri="http://schemas.openxmlformats.org/drawingml/2006/picture">
                 <pic:pic xmlns:pic="http://schemas.openxmlformats.org/drawingml/2006/picture">
                   <pic:nvPicPr>
-                    <pic:cNvPr id="8" name="Image8" descr="" title=""/>
+                    <pic:cNvPr id="9" name="Image8" descr="" title=""/>
                     <pic:cNvPicPr>
                       <a:picLocks noChangeAspect="1" noChangeArrowheads="1"/>
                     </pic:cNvPicPr>
                   </pic:nvPicPr>
                   <pic:blipFill>
-                    <a:blip r:embed="rId12"/>
+                    <a:blip r:embed="rId13"/>
                     <a:stretch>
                       <a:fillRect/>
                     </a:stretch>
@@ -9471,7 +10098,7 @@
                   <pic:spPr bwMode="auto">
                     <a:xfrm>
                       <a:off x="0" y="0"/>
-                      <a:ext cx="6120130" cy="4869815"/>
+                      <a:ext cx="5638800" cy="4486910"/>
                     </a:xfrm>
                     <a:prstGeom prst="rect">
                       <a:avLst/>
@@ -9484,97 +10111,15 @@
         </w:drawing>
       </w:r>
       <w:r>
-        <w:rPr/>
-        <w:t>Post Processing</w:t>
-      </w:r>
-    </w:p>
-    <w:p>
-      <w:pPr>
-        <w:pStyle w:val="Normal"/>
-        <w:rPr/>
-      </w:pPr>
-      <w:r>
-        <w:rPr/>
-        <w:t>After preprocessing, the dataset was written out to a new CSV file to allow the exact same data to be used in both the MLP written ‘from scratch’ and the MLP based on Sci</w:t>
-      </w:r>
-      <w:r>
-        <w:rPr/>
-        <w:t>K</w:t>
-      </w:r>
-      <w:r>
-        <w:rPr/>
-        <w:t>it Learn Python libraries.</w:t>
-      </w:r>
-    </w:p>
-    <w:p>
-      <w:pPr>
-        <w:pStyle w:val="Normal"/>
-        <w:rPr/>
-      </w:pPr>
-      <w:r>
-        <w:rPr/>
-      </w:r>
-    </w:p>
-    <w:p>
-      <w:pPr>
-        <w:pStyle w:val="Normal"/>
-        <w:rPr/>
-      </w:pPr>
-      <w:r>
-        <w:rPr/>
-        <w:t xml:space="preserve">Before </w:t>
-      </w:r>
-      <w:r>
-        <w:rPr/>
-        <w:t>loading the data into either MLP implementation, one further step was be required: splitting the dataset into training and testing data. In the instance of the ‘from scratch’ MLP, this was done using simple pandas functions, whereas splitting the data for SciKit Learn based MLP used libraries.</w:t>
-      </w:r>
-    </w:p>
-    <w:p>
-      <w:pPr>
-        <w:pStyle w:val="Normal"/>
-        <w:rPr/>
-      </w:pPr>
-      <w:r>
-        <w:rPr/>
-      </w:r>
-    </w:p>
-    <w:p>
-      <w:pPr>
-        <w:pStyle w:val="Heading2"/>
-        <w:numPr>
-          <w:ilvl w:val="1"/>
-          <w:numId w:val="1"/>
-        </w:numPr>
-        <w:spacing w:before="200" w:after="120"/>
-        <w:rPr/>
-      </w:pPr>
-      <w:bookmarkStart w:id="29" w:name="__RefHeading___Toc2856_500896196"/>
-      <w:bookmarkEnd w:id="29"/>
-      <w:r>
-        <w:rPr/>
-        <w:t>ANN From Scratch</w:t>
-      </w:r>
-    </w:p>
-    <w:p>
-      <w:pPr>
-        <w:pStyle w:val="BodyText"/>
-        <w:rPr/>
-      </w:pPr>
-      <w:r>
         <w:rPr>
           <w:b/>
-        </w:rPr>
-        <w:t>N (Input Neurons):</w:t>
-      </w:r>
-      <w:r>
-        <w:rPr/>
-        <w:t xml:space="preserve"> Explicitly state: </w:t>
-      </w:r>
-      <w:r>
-        <w:rPr>
-          <w:i/>
-        </w:rPr>
-        <w:t>"After encoding, the input layer consists of N=29 neurons."</w:t>
+          <w:bCs/>
+        </w:rPr>
+        <w:t>Strongest Positive Correlation:</w:t>
+      </w:r>
+      <w:r>
+        <w:rPr/>
+        <w:t xml:space="preserve"> poutcome_numeric (0.289) and contact_cellular (0.136).</w:t>
       </w:r>
     </w:p>
     <w:p>
@@ -9582,165 +10127,62 @@
         <w:pStyle w:val="BodyText"/>
         <w:numPr>
           <w:ilvl w:val="0"/>
-          <w:numId w:val="6"/>
+          <w:numId w:val="1"/>
         </w:numPr>
-        <w:tabs>
-          <w:tab w:val="clear" w:pos="709"/>
-          <w:tab w:val="left" w:pos="0" w:leader="none"/>
-        </w:tabs>
-        <w:ind w:hanging="283" w:start="720"/>
         <w:rPr/>
       </w:pPr>
       <w:r>
         <w:rPr>
           <w:b/>
-        </w:rPr>
-        <w:t>M (Output Neurons):</w:t>
-      </w:r>
-      <w:r>
-        <w:rPr/>
-        <w:t xml:space="preserve"> Explicitly state: </w:t>
-      </w:r>
-      <w:r>
-        <w:rPr>
-          <w:i/>
-        </w:rPr>
-        <w:t>"As this is a binary classification, the output layer consists of M=1 neuron using a Sigmoid activation."</w:t>
-      </w:r>
-    </w:p>
-    <w:p>
-      <w:pPr>
-        <w:pStyle w:val="Normal"/>
-        <w:rPr/>
-      </w:pPr>
-      <w:r>
-        <w:rPr/>
-      </w:r>
-    </w:p>
-    <w:p>
-      <w:pPr>
-        <w:pStyle w:val="Normal"/>
-        <w:rPr/>
-      </w:pPr>
-      <w:r>
-        <w:rPr/>
-      </w:r>
-    </w:p>
-    <w:p>
-      <w:pPr>
-        <w:pStyle w:val="Normal"/>
-        <w:rPr/>
-      </w:pPr>
-      <w:r>
-        <w:rPr/>
-        <w:t>Architecture:Input Layer ($N$): 29 neurons (following the pruning of redundant dummy variables and selection of high-correlation features).Hidden Layer: 10 neurons (as specified in the brief).Output Layer ($M$): 1 neuron with a Sigmoid activation function, outputting a probability $P(y=1)$.Justification of Activation Function:We chose the Sigmoid function $\sigma(x) = \frac{1}{1 + e^{-x}}$ for the output layer because this is a binary classification task. It maps the weighted sum of inputs to a range between 0 and 1, representing the likelihood of a customer subscribing. For hidden layers, ReLU or Leaky ReLU is preferred to mitigate the vanishing gradient problem often encountered in from-scratch implementations.Implementation Logic:The network was trained using the Backpropagation algorithm:Forward Pass: Computing the dot product of weights and inputs ($z = w \cdot x + b$) and applying activations.Loss Function: Binary Cross-Entropy was used to penalize the model for confident incorrect predictions.Backward Pass: Calculating the partial derivative of the loss with respect to each weight using the Chain Rule.Weight Update: Adjusting weights via Gradient Descent: $w = w - (\eta \cdot \frac{\partial L}{\partial w})$.</w:t>
-      </w:r>
-    </w:p>
-    <w:p>
-      <w:pPr>
-        <w:pStyle w:val="Normal"/>
-        <w:rPr/>
-      </w:pPr>
-      <w:r>
-        <w:rPr/>
-      </w:r>
-    </w:p>
-    <w:p>
-      <w:pPr>
-        <w:pStyle w:val="Normal"/>
-        <w:rPr/>
-      </w:pPr>
-      <w:r>
-        <w:rPr/>
-      </w:r>
-    </w:p>
-    <w:p>
-      <w:pPr>
-        <w:pStyle w:val="Normal"/>
-        <w:rPr/>
-      </w:pPr>
-      <w:r>
-        <w:rPr/>
-        <w:t xml:space="preserve">Performance Evaluation </w:t>
-      </w:r>
-    </w:p>
-    <w:p>
-      <w:pPr>
-        <w:pStyle w:val="Normal"/>
-        <w:rPr/>
-      </w:pPr>
-      <w:r>
-        <w:rPr/>
-      </w:r>
-    </w:p>
-    <w:p>
-      <w:pPr>
-        <w:pStyle w:val="Normal"/>
-        <w:rPr/>
-      </w:pPr>
-      <w:r>
-        <w:rPr/>
-      </w:r>
-    </w:p>
-    <w:p>
-      <w:pPr>
-        <w:pStyle w:val="Normal"/>
-        <w:rPr/>
-      </w:pPr>
-      <w:r>
-        <w:rPr/>
-        <w:t>ANN Implementation with Libraries</w:t>
-      </w:r>
-    </w:p>
-    <w:p>
-      <w:pPr>
-        <w:pStyle w:val="Normal"/>
-        <w:rPr/>
-      </w:pPr>
-      <w:r>
-        <w:rPr/>
-      </w:r>
-    </w:p>
-    <w:p>
-      <w:pPr>
-        <w:pStyle w:val="Normal"/>
-        <w:rPr/>
-      </w:pPr>
-      <w:r>
-        <w:rPr/>
-      </w:r>
-    </w:p>
-    <w:p>
-      <w:pPr>
-        <w:pStyle w:val="Normal"/>
-        <w:rPr/>
-      </w:pPr>
-      <w:r>
-        <w:rPr/>
-        <w:t>Parameter Tuning and Model Optimisation</w:t>
-      </w:r>
-    </w:p>
-    <w:p>
-      <w:pPr>
-        <w:pStyle w:val="Normal"/>
-        <w:rPr/>
-      </w:pPr>
-      <w:r>
-        <w:rPr/>
-      </w:r>
-    </w:p>
-    <w:p>
-      <w:pPr>
-        <w:pStyle w:val="Normal"/>
-        <w:rPr/>
-      </w:pPr>
-      <w:r>
-        <w:rPr/>
-      </w:r>
-    </w:p>
-    <w:p>
-      <w:pPr>
-        <w:pStyle w:val="Normal"/>
+          <w:bCs/>
+        </w:rPr>
+        <w:t>Demographics:</w:t>
+      </w:r>
+      <w:r>
+        <w:rPr/>
+        <w:t xml:space="preserve"> job_retired, job_student, and marital_single are all positively correlated with success. This confirms that specific life stages are more likely to say "yes". Students, for example, are likely planning for their future and trying to make savings, while the retired likely have spare cash to invest.</w:t>
+      </w:r>
+    </w:p>
+    <w:p>
+      <w:pPr>
+        <w:pStyle w:val="BodyText"/>
+        <w:numPr>
+          <w:ilvl w:val="0"/>
+          <w:numId w:val="1"/>
+        </w:numPr>
+        <w:rPr/>
+      </w:pPr>
+      <w:r>
+        <w:rPr>
+          <w:b/>
+          <w:bCs/>
+        </w:rPr>
+        <w:t xml:space="preserve">Weak correlation: </w:t>
+      </w:r>
+      <w:r>
+        <w:rPr/>
+        <w:t xml:space="preserve">Balance (0.053) is </w:t>
+      </w:r>
+      <w:r>
+        <w:rPr/>
+        <w:t xml:space="preserve">more weakly correlated </w:t>
+      </w:r>
+      <w:r>
+        <w:rPr/>
+        <w:t>than might be expected. It is not the primary driver for a ‘</w:t>
+      </w:r>
+      <w:r>
+        <w:rPr/>
+        <w:t>yes’ result</w:t>
+      </w:r>
+      <w:r>
+        <w:rPr/>
+        <w:t xml:space="preserve"> in this campaign.</w:t>
+      </w:r>
+    </w:p>
+    <w:p>
+      <w:pPr>
+        <w:pStyle w:val="Heading3"/>
         <w:widowControl/>
         <w:numPr>
           <w:ilvl w:val="0"/>
@@ -9759,6 +10201,2329 @@
     </w:p>
     <w:p>
       <w:pPr>
+        <w:pStyle w:val="Heading3"/>
+        <w:numPr>
+          <w:ilvl w:val="2"/>
+          <w:numId w:val="1"/>
+        </w:numPr>
+        <w:ind w:hanging="0" w:start="0"/>
+        <w:rPr/>
+      </w:pPr>
+      <w:r>
+        <w:rPr/>
+        <w:t>Post Processing</w:t>
+      </w:r>
+    </w:p>
+    <w:p>
+      <w:pPr>
+        <w:pStyle w:val="Normal"/>
+        <w:rPr/>
+      </w:pPr>
+      <w:r>
+        <w:rPr/>
+        <w:t>After preprocessing, the dataset was written out to a new CSV file to allow the exact same data to be used in both the MLP written ‘from scratch’ and the MLP based on Sci</w:t>
+      </w:r>
+      <w:r>
+        <w:rPr/>
+        <w:t>K</w:t>
+      </w:r>
+      <w:r>
+        <w:rPr/>
+        <w:t>it Learn Python libraries.</w:t>
+      </w:r>
+    </w:p>
+    <w:p>
+      <w:pPr>
+        <w:pStyle w:val="Normal"/>
+        <w:rPr/>
+      </w:pPr>
+      <w:r>
+        <w:rPr/>
+      </w:r>
+    </w:p>
+    <w:p>
+      <w:pPr>
+        <w:pStyle w:val="Normal"/>
+        <w:rPr/>
+      </w:pPr>
+      <w:r>
+        <w:rPr/>
+        <w:t xml:space="preserve">Before </w:t>
+      </w:r>
+      <w:r>
+        <w:rPr/>
+        <w:t>loading the data into either MLP implementation, one further step was be required: splitting the dataset into training and testing data. The dataset is date ordered, meaning that it must be shuffled to avoid</w:t>
+      </w:r>
+      <w:r>
+        <w:rPr/>
+        <w:t xml:space="preserve"> the MLP </w:t>
+      </w:r>
+      <w:r>
+        <w:rPr/>
+        <w:t>learning</w:t>
+      </w:r>
+      <w:r>
+        <w:rPr/>
+        <w:t xml:space="preserve"> patterns based on the sequence of the rows, </w:t>
+      </w:r>
+      <w:r>
+        <w:rPr/>
+        <w:t xml:space="preserve">such as </w:t>
+      </w:r>
+      <w:r>
+        <w:rPr/>
+        <w:t>time-of-year trends.</w:t>
+      </w:r>
+    </w:p>
+    <w:p>
+      <w:pPr>
+        <w:pStyle w:val="Normal"/>
+        <w:rPr/>
+      </w:pPr>
+      <w:r>
+        <w:rPr/>
+      </w:r>
+    </w:p>
+    <w:p>
+      <w:pPr>
+        <w:pStyle w:val="Normal"/>
+        <w:rPr/>
+      </w:pPr>
+      <w:r>
+        <w:rPr/>
+        <w:t>Stratified s</w:t>
+      </w:r>
+      <w:r>
+        <w:rPr/>
+        <w:t xml:space="preserve">ampling </w:t>
+      </w:r>
+      <w:r>
+        <w:rPr/>
+        <w:t>of the</w:t>
+      </w:r>
+      <w:r>
+        <w:rPr/>
+        <w:t xml:space="preserve"> 'success' and 'failure' classes </w:t>
+      </w:r>
+      <w:r>
+        <w:rPr/>
+        <w:t>means that the</w:t>
+      </w:r>
+      <w:r>
+        <w:rPr/>
+        <w:t xml:space="preserve"> </w:t>
+      </w:r>
+      <w:r>
+        <w:rPr/>
+        <w:t>target variable</w:t>
+      </w:r>
+      <w:r>
+        <w:rPr/>
+        <w:t xml:space="preserve"> imbalance </w:t>
+      </w:r>
+      <w:r>
+        <w:rPr/>
+        <w:t xml:space="preserve">of </w:t>
+      </w:r>
+      <w:r>
+        <w:rPr/>
+        <w:t xml:space="preserve">11.7% minority class was preserved across both training and testing </w:t>
+      </w:r>
+      <w:r>
+        <w:rPr/>
+        <w:t>datasets</w:t>
+      </w:r>
+      <w:r>
+        <w:rPr/>
+        <w:t xml:space="preserve">. This </w:t>
+      </w:r>
+      <w:r>
+        <w:rPr/>
+        <w:t xml:space="preserve">aims to </w:t>
+      </w:r>
+      <w:r>
+        <w:rPr/>
+        <w:t>preven</w:t>
+      </w:r>
+      <w:r>
+        <w:rPr/>
+        <w:t>t</w:t>
+      </w:r>
+      <w:r>
+        <w:rPr/>
+        <w:t xml:space="preserve">s </w:t>
+      </w:r>
+      <w:r>
+        <w:rPr/>
+        <w:t xml:space="preserve">the result from </w:t>
+      </w:r>
+      <w:r>
+        <w:rPr/>
+        <w:t xml:space="preserve">being skewed by a disproportionate distribution of target </w:t>
+      </w:r>
+      <w:r>
+        <w:rPr/>
+        <w:t>variables</w:t>
+      </w:r>
+      <w:r>
+        <w:rPr/>
+        <w:t xml:space="preserve"> in </w:t>
+      </w:r>
+      <w:r>
+        <w:rPr/>
+        <w:t>the two datasets.</w:t>
+      </w:r>
+    </w:p>
+    <w:p>
+      <w:pPr>
+        <w:pStyle w:val="Normal"/>
+        <w:rPr/>
+      </w:pPr>
+      <w:r>
+        <w:rPr/>
+      </w:r>
+    </w:p>
+    <w:p>
+      <w:pPr>
+        <w:pStyle w:val="Normal"/>
+        <w:rPr/>
+      </w:pPr>
+      <w:r>
+        <w:rPr/>
+        <w:t xml:space="preserve">In the instance of the ‘from scratch’ MLP, this was done using simple pandas functions, whereas splitting the data for the Scikit-Learn based MLP utilized the train_test_split function with the stratify </w:t>
+      </w:r>
+      <w:r>
+        <w:rPr/>
+        <w:t xml:space="preserve">and shuffle </w:t>
+      </w:r>
+      <w:r>
+        <w:rPr/>
+        <w:t>parameter</w:t>
+      </w:r>
+      <w:r>
+        <w:rPr/>
+        <w:t>s</w:t>
+      </w:r>
+      <w:r>
+        <w:rPr/>
+        <w:t xml:space="preserve"> enabled</w:t>
+      </w:r>
+      <w:r>
+        <w:rPr/>
+        <w:t>.</w:t>
+      </w:r>
+    </w:p>
+    <w:p>
+      <w:pPr>
+        <w:pStyle w:val="Normal"/>
+        <w:rPr/>
+      </w:pPr>
+      <w:r>
+        <w:rPr/>
+      </w:r>
+    </w:p>
+    <w:p>
+      <w:pPr>
+        <w:pStyle w:val="Heading2"/>
+        <w:widowControl/>
+        <w:numPr>
+          <w:ilvl w:val="0"/>
+          <w:numId w:val="0"/>
+        </w:numPr>
+        <w:suppressAutoHyphens w:val="true"/>
+        <w:jc w:val="both"/>
+        <w:rPr/>
+      </w:pPr>
+      <w:r>
+        <w:rPr/>
+      </w:r>
+      <w:r>
+        <w:br w:type="page"/>
+      </w:r>
+    </w:p>
+    <w:p>
+      <w:pPr>
+        <w:pStyle w:val="Heading2"/>
+        <w:numPr>
+          <w:ilvl w:val="1"/>
+          <w:numId w:val="1"/>
+        </w:numPr>
+        <w:ind w:hanging="0" w:start="0"/>
+        <w:rPr/>
+      </w:pPr>
+      <w:bookmarkStart w:id="28" w:name="__RefHeading___Toc2856_500896196"/>
+      <w:bookmarkEnd w:id="28"/>
+      <w:r>
+        <w:rPr/>
+        <w:t xml:space="preserve">Implementation of </w:t>
+      </w:r>
+      <w:r>
+        <w:rPr/>
+        <w:t>ANN From Scratch</w:t>
+      </w:r>
+    </w:p>
+    <w:p>
+      <w:pPr>
+        <w:pStyle w:val="Normal"/>
+        <w:rPr/>
+      </w:pPr>
+      <w:r>
+        <w:rPr/>
+        <w:br/>
+        <w:t>The ‘from scratch’ MLP was implemented in Python as a Class ‘MLP_From_Scratch’. It provides a number of public functions:</w:t>
+      </w:r>
+    </w:p>
+    <w:p>
+      <w:pPr>
+        <w:pStyle w:val="Normal"/>
+        <w:rPr/>
+      </w:pPr>
+      <w:r>
+        <w:rPr/>
+      </w:r>
+    </w:p>
+    <w:tbl>
+      <w:tblPr>
+        <w:tblW w:w="5000" w:type="pct"/>
+        <w:jc w:val="start"/>
+        <w:tblInd w:w="0" w:type="dxa"/>
+        <w:tblLayout w:type="fixed"/>
+        <w:tblCellMar>
+          <w:top w:w="0" w:type="dxa"/>
+          <w:start w:w="0" w:type="dxa"/>
+          <w:bottom w:w="0" w:type="dxa"/>
+          <w:end w:w="0" w:type="dxa"/>
+        </w:tblCellMar>
+      </w:tblPr>
+      <w:tblGrid>
+        <w:gridCol w:w="4818"/>
+        <w:gridCol w:w="4819"/>
+      </w:tblGrid>
+      <w:tr>
+        <w:trPr/>
+        <w:tc>
+          <w:tcPr>
+            <w:tcW w:w="4818" w:type="dxa"/>
+            <w:tcBorders/>
+          </w:tcPr>
+          <w:p>
+            <w:pPr>
+              <w:pStyle w:val="Normal"/>
+              <w:rPr/>
+            </w:pPr>
+            <w:r>
+              <w:rPr/>
+              <w:t>Function</w:t>
+            </w:r>
+          </w:p>
+        </w:tc>
+        <w:tc>
+          <w:tcPr>
+            <w:tcW w:w="4819" w:type="dxa"/>
+            <w:tcBorders/>
+          </w:tcPr>
+          <w:p>
+            <w:pPr>
+              <w:pStyle w:val="Normal"/>
+              <w:rPr/>
+            </w:pPr>
+            <w:r>
+              <w:rPr/>
+              <w:t>Purpose</w:t>
+            </w:r>
+          </w:p>
+        </w:tc>
+      </w:tr>
+      <w:tr>
+        <w:trPr/>
+        <w:tc>
+          <w:tcPr>
+            <w:tcW w:w="4818" w:type="dxa"/>
+            <w:tcBorders/>
+          </w:tcPr>
+          <w:p>
+            <w:pPr>
+              <w:pStyle w:val="Normal"/>
+              <w:rPr/>
+            </w:pPr>
+            <w:r>
+              <w:rPr/>
+              <w:t>Class Constructor</w:t>
+            </w:r>
+          </w:p>
+        </w:tc>
+        <w:tc>
+          <w:tcPr>
+            <w:tcW w:w="4819" w:type="dxa"/>
+            <w:tcBorders/>
+          </w:tcPr>
+          <w:p>
+            <w:pPr>
+              <w:pStyle w:val="Normal"/>
+              <w:rPr/>
+            </w:pPr>
+            <w:r>
+              <w:rPr/>
+              <w:t xml:space="preserve">Creates new network using provided training and test datasets, automatically splitting out validation data. </w:t>
+            </w:r>
+            <w:r>
+              <w:rPr/>
+              <w:t>The number of input neurons is determined by the input dataset.</w:t>
+            </w:r>
+          </w:p>
+          <w:p>
+            <w:pPr>
+              <w:pStyle w:val="Normal"/>
+              <w:rPr/>
+            </w:pPr>
+            <w:r>
+              <w:rPr/>
+            </w:r>
+          </w:p>
+          <w:p>
+            <w:pPr>
+              <w:pStyle w:val="Normal"/>
+              <w:rPr/>
+            </w:pPr>
+            <w:r>
+              <w:rPr/>
+              <w:t>Allows user to tune parameters:</w:t>
+            </w:r>
+          </w:p>
+          <w:p>
+            <w:pPr>
+              <w:pStyle w:val="Normal"/>
+              <w:numPr>
+                <w:ilvl w:val="0"/>
+                <w:numId w:val="6"/>
+              </w:numPr>
+              <w:rPr/>
+            </w:pPr>
+            <w:r>
+              <w:rPr/>
+              <w:t>no_hidden_neurons</w:t>
+            </w:r>
+          </w:p>
+          <w:p>
+            <w:pPr>
+              <w:pStyle w:val="Normal"/>
+              <w:numPr>
+                <w:ilvl w:val="0"/>
+                <w:numId w:val="6"/>
+              </w:numPr>
+              <w:rPr/>
+            </w:pPr>
+            <w:r>
+              <w:rPr/>
+              <w:t>no_output_neurons</w:t>
+            </w:r>
+          </w:p>
+          <w:p>
+            <w:pPr>
+              <w:pStyle w:val="Normal"/>
+              <w:numPr>
+                <w:ilvl w:val="0"/>
+                <w:numId w:val="6"/>
+              </w:numPr>
+              <w:rPr/>
+            </w:pPr>
+            <w:r>
+              <w:rPr/>
+              <w:t>output_threshold</w:t>
+            </w:r>
+          </w:p>
+          <w:p>
+            <w:pPr>
+              <w:pStyle w:val="Normal"/>
+              <w:numPr>
+                <w:ilvl w:val="0"/>
+                <w:numId w:val="6"/>
+              </w:numPr>
+              <w:rPr/>
+            </w:pPr>
+            <w:r>
+              <w:rPr/>
+              <w:t>validation_split (%)</w:t>
+            </w:r>
+          </w:p>
+          <w:p>
+            <w:pPr>
+              <w:pStyle w:val="Normal"/>
+              <w:rPr/>
+            </w:pPr>
+            <w:r>
+              <w:rPr/>
+              <w:t xml:space="preserve"> </w:t>
+            </w:r>
+          </w:p>
+        </w:tc>
+      </w:tr>
+      <w:tr>
+        <w:trPr>
+          <w:trHeight w:val="1623" w:hRule="atLeast"/>
+        </w:trPr>
+        <w:tc>
+          <w:tcPr>
+            <w:tcW w:w="4818" w:type="dxa"/>
+            <w:tcBorders/>
+          </w:tcPr>
+          <w:p>
+            <w:pPr>
+              <w:pStyle w:val="Normal"/>
+              <w:rPr/>
+            </w:pPr>
+            <w:r>
+              <w:rPr/>
+              <w:t>train_network</w:t>
+            </w:r>
+          </w:p>
+        </w:tc>
+        <w:tc>
+          <w:tcPr>
+            <w:tcW w:w="4819" w:type="dxa"/>
+            <w:tcBorders/>
+          </w:tcPr>
+          <w:p>
+            <w:pPr>
+              <w:pStyle w:val="Normal"/>
+              <w:rPr/>
+            </w:pPr>
+            <w:r>
+              <w:rPr/>
+              <w:t>Performs network training for a user supplied number of epochs. Allows user to define learning_rate.</w:t>
+            </w:r>
+          </w:p>
+          <w:p>
+            <w:pPr>
+              <w:pStyle w:val="Normal"/>
+              <w:rPr/>
+            </w:pPr>
+            <w:r>
+              <w:rPr/>
+            </w:r>
+          </w:p>
+          <w:p>
+            <w:pPr>
+              <w:pStyle w:val="Normal"/>
+              <w:rPr/>
+            </w:pPr>
+            <w:r>
+              <w:rPr/>
+              <w:t>Steps:</w:t>
+            </w:r>
+          </w:p>
+          <w:p>
+            <w:pPr>
+              <w:pStyle w:val="Normal"/>
+              <w:numPr>
+                <w:ilvl w:val="0"/>
+                <w:numId w:val="7"/>
+              </w:numPr>
+              <w:rPr/>
+            </w:pPr>
+            <w:r>
+              <w:rPr/>
+              <w:t>Feed Forward</w:t>
+            </w:r>
+          </w:p>
+          <w:p>
+            <w:pPr>
+              <w:pStyle w:val="Normal"/>
+              <w:numPr>
+                <w:ilvl w:val="0"/>
+                <w:numId w:val="7"/>
+              </w:numPr>
+              <w:rPr/>
+            </w:pPr>
+            <w:r>
+              <w:rPr/>
+              <w:t>Back Propagation (Output Layer)</w:t>
+            </w:r>
+          </w:p>
+          <w:p>
+            <w:pPr>
+              <w:pStyle w:val="Normal"/>
+              <w:numPr>
+                <w:ilvl w:val="0"/>
+                <w:numId w:val="7"/>
+              </w:numPr>
+              <w:rPr/>
+            </w:pPr>
+            <w:r>
+              <w:rPr/>
+              <w:t>Back Propagation (Hidden Layer)</w:t>
+            </w:r>
+          </w:p>
+          <w:p>
+            <w:pPr>
+              <w:pStyle w:val="Normal"/>
+              <w:numPr>
+                <w:ilvl w:val="0"/>
+                <w:numId w:val="7"/>
+              </w:numPr>
+              <w:rPr/>
+            </w:pPr>
+            <w:r>
+              <w:rPr/>
+              <w:t xml:space="preserve">Weights and </w:t>
+            </w:r>
+            <w:r>
+              <w:rPr/>
+              <w:t>b</w:t>
+            </w:r>
+            <w:r>
+              <w:rPr/>
+              <w:t xml:space="preserve">iases </w:t>
+            </w:r>
+            <w:r>
+              <w:rPr/>
+              <w:t>u</w:t>
+            </w:r>
+            <w:r>
+              <w:rPr/>
+              <w:t>pdate</w:t>
+            </w:r>
+            <w:r>
+              <w:rPr/>
+              <w:t>d</w:t>
+            </w:r>
+          </w:p>
+        </w:tc>
+      </w:tr>
+      <w:tr>
+        <w:trPr/>
+        <w:tc>
+          <w:tcPr>
+            <w:tcW w:w="4818" w:type="dxa"/>
+            <w:tcBorders/>
+          </w:tcPr>
+          <w:p>
+            <w:pPr>
+              <w:pStyle w:val="Normal"/>
+              <w:rPr/>
+            </w:pPr>
+            <w:r>
+              <w:rPr/>
+              <w:t>evaluate</w:t>
+            </w:r>
+          </w:p>
+        </w:tc>
+        <w:tc>
+          <w:tcPr>
+            <w:tcW w:w="4819" w:type="dxa"/>
+            <w:tcBorders/>
+          </w:tcPr>
+          <w:p>
+            <w:pPr>
+              <w:pStyle w:val="Normal"/>
+              <w:rPr/>
+            </w:pPr>
+            <w:r>
+              <w:rPr/>
+              <w:t>Return accuracy.</w:t>
+            </w:r>
+          </w:p>
+        </w:tc>
+      </w:tr>
+      <w:tr>
+        <w:trPr/>
+        <w:tc>
+          <w:tcPr>
+            <w:tcW w:w="4818" w:type="dxa"/>
+            <w:tcBorders/>
+          </w:tcPr>
+          <w:p>
+            <w:pPr>
+              <w:pStyle w:val="Normal"/>
+              <w:rPr/>
+            </w:pPr>
+            <w:r>
+              <w:rPr/>
+              <w:t>plot_error</w:t>
+            </w:r>
+          </w:p>
+        </w:tc>
+        <w:tc>
+          <w:tcPr>
+            <w:tcW w:w="4819" w:type="dxa"/>
+            <w:tcBorders/>
+          </w:tcPr>
+          <w:p>
+            <w:pPr>
+              <w:pStyle w:val="Normal"/>
+              <w:rPr/>
+            </w:pPr>
+            <w:r>
+              <w:rPr/>
+              <w:t>Plots the training and validation set losses for comparison.</w:t>
+            </w:r>
+          </w:p>
+        </w:tc>
+      </w:tr>
+      <w:tr>
+        <w:trPr/>
+        <w:tc>
+          <w:tcPr>
+            <w:tcW w:w="4818" w:type="dxa"/>
+            <w:tcBorders/>
+          </w:tcPr>
+          <w:p>
+            <w:pPr>
+              <w:pStyle w:val="Normal"/>
+              <w:rPr/>
+            </w:pPr>
+            <w:r>
+              <w:rPr/>
+              <w:t>plot_confusion_matrix</w:t>
+            </w:r>
+          </w:p>
+        </w:tc>
+        <w:tc>
+          <w:tcPr>
+            <w:tcW w:w="4819" w:type="dxa"/>
+            <w:tcBorders/>
+          </w:tcPr>
+          <w:p>
+            <w:pPr>
+              <w:pStyle w:val="Normal"/>
+              <w:rPr/>
+            </w:pPr>
+            <w:r>
+              <w:rPr/>
+              <w:t>Plots a graphical confusion matrix.</w:t>
+            </w:r>
+          </w:p>
+        </w:tc>
+      </w:tr>
+      <w:tr>
+        <w:trPr/>
+        <w:tc>
+          <w:tcPr>
+            <w:tcW w:w="4818" w:type="dxa"/>
+            <w:tcBorders/>
+          </w:tcPr>
+          <w:p>
+            <w:pPr>
+              <w:pStyle w:val="Normal"/>
+              <w:rPr/>
+            </w:pPr>
+            <w:r>
+              <w:rPr/>
+              <w:t>print_confusion_matrix</w:t>
+            </w:r>
+          </w:p>
+        </w:tc>
+        <w:tc>
+          <w:tcPr>
+            <w:tcW w:w="4819" w:type="dxa"/>
+            <w:tcBorders/>
+          </w:tcPr>
+          <w:p>
+            <w:pPr>
+              <w:pStyle w:val="Normal"/>
+              <w:rPr/>
+            </w:pPr>
+            <w:r>
+              <w:rPr/>
+              <w:t>Prints a text representation of the confusion matrix.</w:t>
+            </w:r>
+          </w:p>
+        </w:tc>
+      </w:tr>
+      <w:tr>
+        <w:trPr/>
+        <w:tc>
+          <w:tcPr>
+            <w:tcW w:w="4818" w:type="dxa"/>
+            <w:tcBorders/>
+          </w:tcPr>
+          <w:p>
+            <w:pPr>
+              <w:pStyle w:val="Normal"/>
+              <w:rPr/>
+            </w:pPr>
+            <w:r>
+              <w:rPr/>
+              <w:t>save_weights</w:t>
+            </w:r>
+          </w:p>
+        </w:tc>
+        <w:tc>
+          <w:tcPr>
+            <w:tcW w:w="4819" w:type="dxa"/>
+            <w:tcBorders/>
+          </w:tcPr>
+          <w:p>
+            <w:pPr>
+              <w:pStyle w:val="Normal"/>
+              <w:rPr/>
+            </w:pPr>
+            <w:r>
+              <w:rPr/>
+              <w:t>Save out the weights and biases for future use.</w:t>
+            </w:r>
+          </w:p>
+        </w:tc>
+      </w:tr>
+      <w:tr>
+        <w:trPr/>
+        <w:tc>
+          <w:tcPr>
+            <w:tcW w:w="4818" w:type="dxa"/>
+            <w:tcBorders/>
+          </w:tcPr>
+          <w:p>
+            <w:pPr>
+              <w:pStyle w:val="Normal"/>
+              <w:rPr/>
+            </w:pPr>
+            <w:r>
+              <w:rPr/>
+              <w:t>load_weights</w:t>
+            </w:r>
+          </w:p>
+        </w:tc>
+        <w:tc>
+          <w:tcPr>
+            <w:tcW w:w="4819" w:type="dxa"/>
+            <w:tcBorders/>
+          </w:tcPr>
+          <w:p>
+            <w:pPr>
+              <w:pStyle w:val="Normal"/>
+              <w:rPr/>
+            </w:pPr>
+            <w:r>
+              <w:rPr/>
+              <w:t>Load in a set of saved weights.</w:t>
+            </w:r>
+          </w:p>
+        </w:tc>
+      </w:tr>
+      <w:tr>
+        <w:trPr/>
+        <w:tc>
+          <w:tcPr>
+            <w:tcW w:w="4818" w:type="dxa"/>
+            <w:tcBorders/>
+          </w:tcPr>
+          <w:p>
+            <w:pPr>
+              <w:pStyle w:val="Normal"/>
+              <w:rPr/>
+            </w:pPr>
+            <w:r>
+              <w:rPr/>
+              <w:t>get_report</w:t>
+            </w:r>
+          </w:p>
+        </w:tc>
+        <w:tc>
+          <w:tcPr>
+            <w:tcW w:w="4819" w:type="dxa"/>
+            <w:tcBorders/>
+          </w:tcPr>
+          <w:p>
+            <w:pPr>
+              <w:pStyle w:val="Normal"/>
+              <w:rPr/>
+            </w:pPr>
+            <w:r>
+              <w:rPr/>
+              <w:t>Print a report of model accuracy, recall, precision and F1-score.</w:t>
+            </w:r>
+          </w:p>
+        </w:tc>
+      </w:tr>
+      <w:tr>
+        <w:trPr/>
+        <w:tc>
+          <w:tcPr>
+            <w:tcW w:w="4818" w:type="dxa"/>
+            <w:tcBorders/>
+          </w:tcPr>
+          <w:p>
+            <w:pPr>
+              <w:pStyle w:val="Normal"/>
+              <w:rPr/>
+            </w:pPr>
+            <w:r>
+              <w:rPr/>
+              <w:t>set_model_parameters</w:t>
+            </w:r>
+          </w:p>
+        </w:tc>
+        <w:tc>
+          <w:tcPr>
+            <w:tcW w:w="4819" w:type="dxa"/>
+            <w:tcBorders/>
+          </w:tcPr>
+          <w:p>
+            <w:pPr>
+              <w:pStyle w:val="Normal"/>
+              <w:rPr/>
+            </w:pPr>
+            <w:r>
+              <w:rPr/>
+              <w:t>Allows user to reset learning_rate and output_threshold hyper-parameters.</w:t>
+            </w:r>
+          </w:p>
+        </w:tc>
+      </w:tr>
+    </w:tbl>
+    <w:p>
+      <w:pPr>
+        <w:pStyle w:val="Normal"/>
+        <w:rPr/>
+      </w:pPr>
+      <w:r>
+        <w:rPr/>
+      </w:r>
+      <w:r>
+        <w:br w:type="page"/>
+      </w:r>
+    </w:p>
+    <w:p>
+      <w:pPr>
+        <w:pStyle w:val="Normal"/>
+        <w:rPr/>
+      </w:pPr>
+      <w:r>
+        <w:rPr/>
+      </w:r>
+    </w:p>
+    <w:p>
+      <w:pPr>
+        <w:pStyle w:val="Heading3"/>
+        <w:numPr>
+          <w:ilvl w:val="2"/>
+          <w:numId w:val="1"/>
+        </w:numPr>
+        <w:ind w:hanging="0" w:start="0"/>
+        <w:rPr/>
+      </w:pPr>
+      <w:r>
+        <w:rPr/>
+        <w:t xml:space="preserve">Network Architecture </w:t>
+      </w:r>
+    </w:p>
+    <w:p>
+      <w:pPr>
+        <w:pStyle w:val="Normal"/>
+        <w:rPr/>
+      </w:pPr>
+      <w:r>
+        <w:rPr/>
+        <w:t xml:space="preserve">After encoding, the input layer consists of N=29 neurons. </w:t>
+      </w:r>
+      <w:r>
+        <w:rPr/>
+        <w:t xml:space="preserve">The hidden layer is explicitly defined as 10 neurons. As this is a binary classification, the output layer consists 1 neuron using a Sigmoid activation function, </w:t>
+      </w:r>
+      <w:r>
+        <w:rPr/>
+        <w:t xml:space="preserve">outputting a probability score. </w:t>
+      </w:r>
+    </w:p>
+    <w:p>
+      <w:pPr>
+        <w:pStyle w:val="Normal"/>
+        <w:rPr/>
+      </w:pPr>
+      <w:r>
+        <w:rPr/>
+      </w:r>
+    </w:p>
+    <w:p>
+      <w:pPr>
+        <w:pStyle w:val="Normal"/>
+        <w:rPr/>
+      </w:pPr>
+      <w:r>
+        <w:rPr/>
+        <w:drawing>
+          <wp:anchor behindDoc="0" distT="0" distB="0" distL="0" distR="0" simplePos="0" locked="0" layoutInCell="0" allowOverlap="1" relativeHeight="11">
+            <wp:simplePos x="0" y="0"/>
+            <wp:positionH relativeFrom="column">
+              <wp:align>center</wp:align>
+            </wp:positionH>
+            <wp:positionV relativeFrom="paragraph">
+              <wp:posOffset>635</wp:posOffset>
+            </wp:positionV>
+            <wp:extent cx="5040630" cy="4102100"/>
+            <wp:effectExtent l="0" t="0" r="0" b="0"/>
+            <wp:wrapTopAndBottom/>
+            <wp:docPr id="10" name="Image10" descr="" title=""/>
+            <wp:cNvGraphicFramePr>
+              <a:graphicFrameLocks xmlns:a="http://schemas.openxmlformats.org/drawingml/2006/main" noChangeAspect="1"/>
+            </wp:cNvGraphicFramePr>
+            <a:graphic xmlns:a="http://schemas.openxmlformats.org/drawingml/2006/main">
+              <a:graphicData uri="http://schemas.openxmlformats.org/drawingml/2006/picture">
+                <pic:pic xmlns:pic="http://schemas.openxmlformats.org/drawingml/2006/picture">
+                  <pic:nvPicPr>
+                    <pic:cNvPr id="10" name="Image10" descr="" title=""/>
+                    <pic:cNvPicPr>
+                      <a:picLocks noChangeAspect="1" noChangeArrowheads="1"/>
+                    </pic:cNvPicPr>
+                  </pic:nvPicPr>
+                  <pic:blipFill>
+                    <a:blip r:embed="rId14"/>
+                    <a:stretch>
+                      <a:fillRect/>
+                    </a:stretch>
+                  </pic:blipFill>
+                  <pic:spPr bwMode="auto">
+                    <a:xfrm>
+                      <a:off x="0" y="0"/>
+                      <a:ext cx="5040630" cy="4102100"/>
+                    </a:xfrm>
+                    <a:prstGeom prst="rect">
+                      <a:avLst/>
+                    </a:prstGeom>
+                  </pic:spPr>
+                </pic:pic>
+              </a:graphicData>
+            </a:graphic>
+          </wp:anchor>
+        </w:drawing>
+      </w:r>
+    </w:p>
+    <w:p>
+      <w:pPr>
+        <w:pStyle w:val="Normal"/>
+        <w:rPr/>
+      </w:pPr>
+      <w:r>
+        <w:rPr/>
+      </w:r>
+    </w:p>
+    <w:p>
+      <w:pPr>
+        <w:pStyle w:val="Heading3"/>
+        <w:numPr>
+          <w:ilvl w:val="2"/>
+          <w:numId w:val="1"/>
+        </w:numPr>
+        <w:ind w:hanging="0" w:start="0"/>
+        <w:rPr/>
+      </w:pPr>
+      <w:r>
+        <w:rPr/>
+        <w:t xml:space="preserve">Feed </w:t>
+      </w:r>
+      <w:r>
+        <w:rPr/>
+        <w:t>Forward Pass</w:t>
+      </w:r>
+    </w:p>
+    <w:p>
+      <w:pPr>
+        <w:pStyle w:val="Normal"/>
+        <w:rPr/>
+      </w:pPr>
+      <w:r>
+        <w:rPr/>
+        <w:t>The forward pass is simply c</w:t>
+      </w:r>
+      <w:r>
+        <w:rPr/>
+        <w:t xml:space="preserve">omputing the dot product of weights and inputs (z = w \cdot x + b) and applying activation </w:t>
+      </w:r>
+      <w:r>
+        <w:rPr/>
+        <w:t xml:space="preserve">functions </w:t>
+      </w:r>
+      <w:r>
+        <w:rPr/>
+        <w:t>at the hidden and output layers.</w:t>
+      </w:r>
+    </w:p>
+    <w:p>
+      <w:pPr>
+        <w:pStyle w:val="Normal"/>
+        <w:rPr/>
+      </w:pPr>
+      <w:r>
+        <w:rPr/>
+      </w:r>
+    </w:p>
+    <w:p>
+      <w:pPr>
+        <w:pStyle w:val="Normal"/>
+        <w:rPr/>
+      </w:pPr>
+      <w:r>
+        <w:rPr/>
+        <w:t xml:space="preserve">The </w:t>
+      </w:r>
+      <w:r>
+        <w:rPr/>
+        <w:t xml:space="preserve">ReLU </w:t>
+      </w:r>
+      <w:r>
+        <w:rPr/>
+        <w:t>(Rectified Linear Unit) function is used</w:t>
+      </w:r>
+      <w:r>
+        <w:rPr/>
+        <w:t xml:space="preserve"> </w:t>
+      </w:r>
+      <w:r>
+        <w:rPr/>
+        <w:t>in the hidden layer. Initially, I was using the Sigmoid function for both hidden and output layers. However, performance was improved significantly using ReLU at the hidden layer. T</w:t>
+      </w:r>
+      <w:r>
+        <w:rPr/>
+        <w:t>he</w:t>
+      </w:r>
+      <w:r>
+        <w:rPr/>
+        <w:t xml:space="preserve"> network </w:t>
+      </w:r>
+      <w:r>
+        <w:rPr/>
+        <w:t xml:space="preserve">likely </w:t>
+      </w:r>
+      <w:r>
+        <w:rPr/>
+        <w:t>experienced a</w:t>
+      </w:r>
+      <w:r>
+        <w:rPr/>
+        <w:t xml:space="preserve"> vanishing gradient </w:t>
+      </w:r>
+      <w:r>
+        <w:rPr/>
+        <w:t>due to the skewed target data.</w:t>
+      </w:r>
+    </w:p>
+    <w:p>
+      <w:pPr>
+        <w:pStyle w:val="Normal"/>
+        <w:rPr/>
+      </w:pPr>
+      <w:r>
+        <w:rPr/>
+      </w:r>
+    </w:p>
+    <w:p>
+      <w:pPr>
+        <w:pStyle w:val="Normal"/>
+        <w:rPr/>
+      </w:pPr>
+      <w:r>
+        <w:rPr/>
+        <w:t>T</w:t>
+      </w:r>
+      <w:r>
+        <w:rPr/>
+        <w:t xml:space="preserve">he Sigmoid function $\sigma(x) = \frac{1}{1 + e^{-x}}$ is the standard choice for the output layer </w:t>
+      </w:r>
+      <w:r>
+        <w:rPr/>
+        <w:t xml:space="preserve">in a binary classification task </w:t>
+      </w:r>
+      <w:r>
+        <w:rPr/>
+        <w:t xml:space="preserve">because it squashes any input into a value between 0 and 1, which </w:t>
+      </w:r>
+      <w:r>
+        <w:rPr/>
+        <w:t>represent</w:t>
+      </w:r>
+      <w:r>
+        <w:rPr/>
+        <w:t>s</w:t>
+      </w:r>
+      <w:r>
+        <w:rPr/>
+        <w:t xml:space="preserve"> the </w:t>
+      </w:r>
+      <w:r>
+        <w:rPr/>
+        <w:t>probability</w:t>
+      </w:r>
+      <w:r>
+        <w:rPr/>
+        <w:t xml:space="preserve"> of an individual subscribing. (Bishop 2006) </w:t>
+      </w:r>
+    </w:p>
+    <w:p>
+      <w:pPr>
+        <w:pStyle w:val="Normal"/>
+        <w:rPr/>
+      </w:pPr>
+      <w:r>
+        <w:rPr/>
+      </w:r>
+    </w:p>
+    <w:p>
+      <w:pPr>
+        <w:pStyle w:val="Heading3"/>
+        <w:widowControl/>
+        <w:numPr>
+          <w:ilvl w:val="0"/>
+          <w:numId w:val="0"/>
+        </w:numPr>
+        <w:suppressAutoHyphens w:val="true"/>
+        <w:jc w:val="both"/>
+        <w:rPr/>
+      </w:pPr>
+      <w:r>
+        <w:rPr/>
+      </w:r>
+      <w:r>
+        <w:br w:type="page"/>
+      </w:r>
+    </w:p>
+    <w:p>
+      <w:pPr>
+        <w:pStyle w:val="Heading3"/>
+        <w:numPr>
+          <w:ilvl w:val="2"/>
+          <w:numId w:val="1"/>
+        </w:numPr>
+        <w:ind w:hanging="0" w:start="0"/>
+        <w:rPr/>
+      </w:pPr>
+      <w:r>
+        <w:rPr/>
+        <w:t>Back Propagation</w:t>
+      </w:r>
+    </w:p>
+    <w:p>
+      <w:pPr>
+        <w:pStyle w:val="Normal"/>
+        <w:rPr/>
+      </w:pPr>
+      <w:r>
+        <w:rPr/>
+      </w:r>
+    </w:p>
+    <w:p>
+      <w:pPr>
+        <w:pStyle w:val="Normal"/>
+        <w:rPr/>
+      </w:pPr>
+      <w:r>
+        <w:rPr/>
+        <w:t>The backwards pass works by c</w:t>
+      </w:r>
+      <w:r>
+        <w:rPr/>
+        <w:t xml:space="preserve">alculating the partial derivative of the loss with respect to each weight. </w:t>
+      </w:r>
+      <w:r>
+        <w:rPr/>
+        <w:t xml:space="preserve">Originally, I had used Mean Squared Error to calculate the </w:t>
+      </w:r>
+      <w:r>
+        <w:rPr/>
+        <w:t>loss</w:t>
+      </w:r>
+      <w:r>
+        <w:rPr/>
+        <w:t xml:space="preserve"> in the back propagation passes. </w:t>
+      </w:r>
+      <w:r>
+        <w:rPr/>
+        <w:t xml:space="preserve">The performance of the model was poor, so I explored other options. </w:t>
+      </w:r>
+    </w:p>
+    <w:p>
+      <w:pPr>
+        <w:pStyle w:val="Normal"/>
+        <w:rPr/>
+      </w:pPr>
+      <w:r>
+        <w:rPr/>
+      </w:r>
+    </w:p>
+    <w:p>
+      <w:pPr>
+        <w:pStyle w:val="Normal"/>
+        <w:rPr/>
+      </w:pPr>
+      <w:r>
+        <w:rPr/>
+        <w:t xml:space="preserve">Following the recommendations of </w:t>
+      </w:r>
+      <w:r>
+        <w:rPr/>
+        <w:t>Bishop 2006</w:t>
+      </w:r>
+      <w:r>
+        <w:rPr/>
+        <w:t xml:space="preserve">, the loss function was transitioned from Mean Squared Error to Binary Cross-Entropy. </w:t>
+      </w:r>
+      <w:r>
+        <w:rPr/>
+        <w:t xml:space="preserve">This gave much improved results. </w:t>
+      </w:r>
+      <w:r>
+        <w:rPr>
+          <w:b w:val="false"/>
+          <w:bCs w:val="false"/>
+        </w:rPr>
+        <w:t xml:space="preserve">MSE assumes </w:t>
+      </w:r>
+      <w:r>
+        <w:rPr>
+          <w:b w:val="false"/>
+          <w:bCs w:val="false"/>
+        </w:rPr>
+        <w:t>the data</w:t>
+      </w:r>
+      <w:r>
+        <w:rPr>
+          <w:b w:val="false"/>
+          <w:bCs w:val="false"/>
+        </w:rPr>
+        <w:t xml:space="preserve"> follow</w:t>
+      </w:r>
+      <w:r>
+        <w:rPr>
+          <w:b w:val="false"/>
+          <w:bCs w:val="false"/>
+        </w:rPr>
+        <w:t>s</w:t>
+      </w:r>
+      <w:r>
+        <w:rPr>
+          <w:b w:val="false"/>
+          <w:bCs w:val="false"/>
+        </w:rPr>
+        <w:t xml:space="preserve"> a Normal distribution, </w:t>
+      </w:r>
+      <w:r>
+        <w:rPr>
+          <w:b w:val="false"/>
+          <w:bCs w:val="false"/>
+        </w:rPr>
+        <w:t xml:space="preserve">whereas </w:t>
+      </w:r>
+      <w:r>
+        <w:rPr>
+          <w:b w:val="false"/>
+          <w:bCs w:val="false"/>
+        </w:rPr>
+        <w:t xml:space="preserve">BCE </w:t>
+      </w:r>
+      <w:r>
+        <w:rPr>
+          <w:b w:val="false"/>
+          <w:bCs w:val="false"/>
+        </w:rPr>
+        <w:t>works with data</w:t>
+      </w:r>
+      <w:r>
+        <w:rPr>
+          <w:b w:val="false"/>
+          <w:bCs w:val="false"/>
+        </w:rPr>
+        <w:t xml:space="preserve"> </w:t>
+      </w:r>
+      <w:r>
+        <w:rPr>
+          <w:b w:val="false"/>
+          <w:bCs w:val="false"/>
+        </w:rPr>
+        <w:t xml:space="preserve">that </w:t>
+      </w:r>
+      <w:r>
+        <w:rPr>
+          <w:b w:val="false"/>
+          <w:bCs w:val="false"/>
+        </w:rPr>
+        <w:t xml:space="preserve">follows a Bernoulli distribution , </w:t>
+      </w:r>
+      <w:r>
+        <w:rPr>
+          <w:b w:val="false"/>
+          <w:bCs w:val="false"/>
+        </w:rPr>
+        <w:t xml:space="preserve">in this case </w:t>
+      </w:r>
+      <w:r>
+        <w:rPr>
+          <w:b w:val="false"/>
+          <w:bCs w:val="false"/>
+        </w:rPr>
+        <w:t xml:space="preserve">yes or no. It cancels out the "flatness" of the sigmoid </w:t>
+      </w:r>
+      <w:r>
+        <w:rPr>
+          <w:b w:val="false"/>
+          <w:bCs w:val="false"/>
+        </w:rPr>
+        <w:t xml:space="preserve">function </w:t>
+      </w:r>
+      <w:r>
+        <w:rPr>
+          <w:b w:val="false"/>
+          <w:bCs w:val="false"/>
+        </w:rPr>
+        <w:t xml:space="preserve">and prevents the learning from slowing down </w:t>
+      </w:r>
+      <w:r>
+        <w:rPr>
+          <w:b w:val="false"/>
+          <w:bCs w:val="false"/>
+        </w:rPr>
+        <w:t>over time.</w:t>
+      </w:r>
+    </w:p>
+    <w:p>
+      <w:pPr>
+        <w:pStyle w:val="Normal"/>
+        <w:rPr/>
+      </w:pPr>
+      <w:r>
+        <w:rPr/>
+      </w:r>
+    </w:p>
+    <w:p>
+      <w:pPr>
+        <w:pStyle w:val="Normal"/>
+        <w:rPr/>
+      </w:pPr>
+      <w:r>
+        <w:rPr/>
+        <w:t>“</w:t>
+      </w:r>
+      <w:r>
+        <w:rPr/>
+        <w:t xml:space="preserve">It is specifically designed to be used with models that output a probability via a sigmoid activation function, as it avoids the 'saturation' issues associated with sum-of-squares error.” </w:t>
+      </w:r>
+      <w:r>
+        <w:rPr/>
+        <w:t>(Bishop 2006).</w:t>
+      </w:r>
+    </w:p>
+    <w:p>
+      <w:pPr>
+        <w:pStyle w:val="Normal"/>
+        <w:rPr/>
+      </w:pPr>
+      <w:r>
+        <w:rPr/>
+      </w:r>
+    </w:p>
+    <w:p>
+      <w:pPr>
+        <w:pStyle w:val="Heading3"/>
+        <w:numPr>
+          <w:ilvl w:val="2"/>
+          <w:numId w:val="1"/>
+        </w:numPr>
+        <w:ind w:hanging="0" w:start="0"/>
+        <w:rPr/>
+      </w:pPr>
+      <w:r>
+        <w:rPr/>
+        <w:t xml:space="preserve">Weight </w:t>
+      </w:r>
+      <w:r>
+        <w:rPr/>
+        <w:t xml:space="preserve">and Bias </w:t>
+      </w:r>
+      <w:r>
+        <w:rPr/>
+        <w:t xml:space="preserve">Update </w:t>
+      </w:r>
+      <w:r>
+        <w:rPr/>
+        <w:t>Step</w:t>
+      </w:r>
+    </w:p>
+    <w:p>
+      <w:pPr>
+        <w:pStyle w:val="Normal"/>
+        <w:rPr/>
+      </w:pPr>
+      <w:r>
+        <w:rPr/>
+      </w:r>
+    </w:p>
+    <w:p>
+      <w:pPr>
+        <w:pStyle w:val="Normal"/>
+        <w:rPr/>
+      </w:pPr>
+      <w:r>
+        <w:rPr/>
+        <w:t>Adjusting weights via Gradient Descent: $w = w - (\eta \cdot \frac{\partial L}{\partial w})$.</w:t>
+      </w:r>
+    </w:p>
+    <w:p>
+      <w:pPr>
+        <w:pStyle w:val="Normal"/>
+        <w:rPr/>
+      </w:pPr>
+      <w:r>
+        <w:rPr/>
+      </w:r>
+    </w:p>
+    <w:p>
+      <w:pPr>
+        <w:pStyle w:val="Normal"/>
+        <w:rPr/>
+      </w:pPr>
+      <w:r>
+        <w:rPr/>
+      </w:r>
+    </w:p>
+    <w:p>
+      <w:pPr>
+        <w:pStyle w:val="Normal"/>
+        <w:rPr/>
+      </w:pPr>
+      <w:r>
+        <w:rPr/>
+      </w:r>
+    </w:p>
+    <w:p>
+      <w:pPr>
+        <w:pStyle w:val="Heading3"/>
+        <w:numPr>
+          <w:ilvl w:val="2"/>
+          <w:numId w:val="1"/>
+        </w:numPr>
+        <w:ind w:hanging="0" w:start="0"/>
+        <w:rPr/>
+      </w:pPr>
+      <w:r>
+        <w:rPr/>
+        <w:t xml:space="preserve">Performance Evaluation </w:t>
+      </w:r>
+    </w:p>
+    <w:p>
+      <w:pPr>
+        <w:pStyle w:val="Normal"/>
+        <w:rPr/>
+      </w:pPr>
+      <w:r>
+        <w:rPr/>
+        <w:t xml:space="preserve">The training of the model was validated every 100 epochs by using a validation dataset. This is split from the supplied training dataset automatically on model initialisation. </w:t>
+      </w:r>
+    </w:p>
+    <w:p>
+      <w:pPr>
+        <w:pStyle w:val="Normal"/>
+        <w:rPr/>
+      </w:pPr>
+      <w:r>
+        <w:rPr/>
+      </w:r>
+    </w:p>
+    <w:p>
+      <w:pPr>
+        <w:pStyle w:val="Normal"/>
+        <w:rPr/>
+      </w:pPr>
+      <w:r>
+        <w:rPr/>
+        <w:t>During initial testing over 10,000 epochs, the loss function exhibited divergence. This was identified as a consequence of an aggressive learning rate causing the gradient descent algorithm to overshoot the local minima. By implementing a learning rate decay schedule and verifying the weights remained within a stable range, the model successfully converged."</w:t>
+      </w:r>
+    </w:p>
+    <w:p>
+      <w:pPr>
+        <w:pStyle w:val="Normal"/>
+        <w:rPr/>
+      </w:pPr>
+      <w:r>
+        <w:rPr/>
+      </w:r>
+    </w:p>
+    <w:p>
+      <w:pPr>
+        <w:pStyle w:val="Normal"/>
+        <w:spacing w:lineRule="atLeast" w:line="285"/>
+        <w:ind w:hanging="0" w:start="0" w:end="0"/>
+        <w:rPr>
+          <w:rFonts w:ascii="Droid Sans Mono;monospace" w:hAnsi="Droid Sans Mono;monospace"/>
+          <w:b w:val="false"/>
+          <w:color w:val="8B949E"/>
+          <w:sz w:val="21"/>
+          <w:shd w:fill="121314" w:val="clear"/>
+        </w:rPr>
+      </w:pPr>
+      <w:r>
+        <w:rPr>
+          <w:rFonts w:ascii="Droid Sans Mono;monospace" w:hAnsi="Droid Sans Mono;monospace"/>
+          <w:b w:val="false"/>
+          <w:color w:val="8B949E"/>
+          <w:sz w:val="21"/>
+          <w:shd w:fill="121314" w:val="clear"/>
+        </w:rPr>
+        <w:t>IMPORTANT: With BCE, we don't multiply by sigmoid_derivative here!</w:t>
+      </w:r>
+    </w:p>
+    <w:p>
+      <w:pPr>
+        <w:pStyle w:val="Normal"/>
+        <w:spacing w:lineRule="atLeast" w:line="285"/>
+        <w:ind w:hanging="0" w:start="0" w:end="0"/>
+        <w:rPr>
+          <w:rFonts w:ascii="Droid Sans Mono;monospace" w:hAnsi="Droid Sans Mono;monospace"/>
+          <w:b w:val="false"/>
+          <w:color w:val="8B949E"/>
+          <w:sz w:val="21"/>
+          <w:shd w:fill="121314" w:val="clear"/>
+        </w:rPr>
+      </w:pPr>
+      <w:r>
+        <w:rPr>
+          <w:rFonts w:ascii="Droid Sans Mono;monospace" w:hAnsi="Droid Sans Mono;monospace"/>
+          <w:b w:val="false"/>
+          <w:color w:val="8B949E"/>
+          <w:sz w:val="21"/>
+          <w:shd w:fill="121314" w:val="clear"/>
+        </w:rPr>
+        <w:t xml:space="preserve"># This is why your error was getting worse; Sigmoid derivative </w:t>
+      </w:r>
+    </w:p>
+    <w:p>
+      <w:pPr>
+        <w:pStyle w:val="Normal"/>
+        <w:spacing w:lineRule="atLeast" w:line="285"/>
+        <w:ind w:hanging="0" w:start="0" w:end="0"/>
+        <w:rPr>
+          <w:rFonts w:ascii="Droid Sans Mono;monospace" w:hAnsi="Droid Sans Mono;monospace"/>
+          <w:b w:val="false"/>
+          <w:color w:val="8B949E"/>
+          <w:sz w:val="21"/>
+          <w:shd w:fill="121314" w:val="clear"/>
+        </w:rPr>
+      </w:pPr>
+      <w:r>
+        <w:rPr>
+          <w:rFonts w:ascii="Droid Sans Mono;monospace" w:hAnsi="Droid Sans Mono;monospace"/>
+          <w:b w:val="false"/>
+          <w:color w:val="8B949E"/>
+          <w:sz w:val="21"/>
+          <w:shd w:fill="121314" w:val="clear"/>
+        </w:rPr>
+        <w:t># becomes near-zero when the model is very wrong, stopping learning.</w:t>
+      </w:r>
+    </w:p>
+    <w:p>
+      <w:pPr>
+        <w:pStyle w:val="Normal"/>
+        <w:rPr/>
+      </w:pPr>
+      <w:r>
+        <w:rPr/>
+      </w:r>
+    </w:p>
+    <w:p>
+      <w:pPr>
+        <w:pStyle w:val="Normal"/>
+        <w:rPr/>
+      </w:pPr>
+      <w:r>
+        <w:rPr/>
+      </w:r>
+    </w:p>
+    <w:p>
+      <w:pPr>
+        <w:pStyle w:val="Normal"/>
+        <w:rPr/>
+      </w:pPr>
+      <w:r>
+        <w:rPr/>
+        <w:t>"To monitor the model's ability to generalize to unseen data, the Binary Cross-Entropy loss was calculated for both the training and validation subsets every 100 epochs. This allowed for the implementation of an 'early stopping' logic (mental or coded), ensuring the MLP did not begin to memorize noise within the training set—a common risk in imbalanced binary classification tasks."</w:t>
+      </w:r>
+    </w:p>
+    <w:p>
+      <w:pPr>
+        <w:pStyle w:val="Normal"/>
+        <w:rPr/>
+      </w:pPr>
+      <w:r>
+        <w:rPr/>
+      </w:r>
+    </w:p>
+    <w:p>
+      <w:pPr>
+        <w:pStyle w:val="Normal"/>
+        <w:rPr/>
+      </w:pPr>
+      <w:r>
+        <w:rPr/>
+      </w:r>
+    </w:p>
+    <w:p>
+      <w:pPr>
+        <w:pStyle w:val="Normal"/>
+        <w:rPr/>
+      </w:pPr>
+      <w:r>
+        <w:rPr/>
+        <w:t xml:space="preserve">When using Binary Cross-Entropy with a Sigmoid output, the math simplifies so that you don't actually need to multiply by the </w:t>
+      </w:r>
+      <w:r>
+        <w:rPr>
+          <w:rStyle w:val="SourceText"/>
+        </w:rPr>
+        <w:t>_sigmoid_derivative</w:t>
+      </w:r>
+      <w:r>
+        <w:rPr/>
+        <w:t xml:space="preserve"> in the final layer. </w:t>
+      </w:r>
+    </w:p>
+    <w:p>
+      <w:pPr>
+        <w:pStyle w:val="Normal"/>
+        <w:rPr/>
+      </w:pPr>
+      <w:r>
+        <w:rPr/>
+      </w:r>
+    </w:p>
+    <w:p>
+      <w:pPr>
+        <w:pStyle w:val="Normal"/>
+        <w:rPr/>
+      </w:pPr>
+      <w:r>
+        <w:rPr/>
+      </w:r>
+    </w:p>
+    <w:tbl>
+      <w:tblPr>
+        <w:tblW w:w="5000" w:type="pct"/>
+        <w:jc w:val="start"/>
+        <w:tblInd w:w="0" w:type="dxa"/>
+        <w:tblLayout w:type="fixed"/>
+        <w:tblCellMar>
+          <w:top w:w="0" w:type="dxa"/>
+          <w:start w:w="0" w:type="dxa"/>
+          <w:bottom w:w="0" w:type="dxa"/>
+          <w:end w:w="0" w:type="dxa"/>
+        </w:tblCellMar>
+      </w:tblPr>
+      <w:tblGrid>
+        <w:gridCol w:w="1873"/>
+        <w:gridCol w:w="2941"/>
+        <w:gridCol w:w="1606"/>
+        <w:gridCol w:w="2407"/>
+      </w:tblGrid>
+      <w:tr>
+        <w:trPr/>
+        <w:tc>
+          <w:tcPr>
+            <w:tcW w:w="1873" w:type="dxa"/>
+            <w:tcBorders/>
+          </w:tcPr>
+          <w:p>
+            <w:pPr>
+              <w:pStyle w:val="Normal"/>
+              <w:rPr/>
+            </w:pPr>
+            <w:r>
+              <w:rPr/>
+              <w:t xml:space="preserve"> </w:t>
+            </w:r>
+            <w:r>
+              <w:rPr/>
+              <w:t xml:space="preserve">Metric </w:t>
+            </w:r>
+          </w:p>
+        </w:tc>
+        <w:tc>
+          <w:tcPr>
+            <w:tcW w:w="2941" w:type="dxa"/>
+            <w:tcBorders/>
+          </w:tcPr>
+          <w:p>
+            <w:pPr>
+              <w:pStyle w:val="Normal"/>
+              <w:rPr/>
+            </w:pPr>
+            <w:r>
+              <w:rPr/>
+              <w:t xml:space="preserve"> </w:t>
+            </w:r>
+            <w:r>
+              <w:rPr/>
+              <w:t xml:space="preserve">Mathematical Formula </w:t>
+            </w:r>
+          </w:p>
+        </w:tc>
+        <w:tc>
+          <w:tcPr>
+            <w:tcW w:w="1606" w:type="dxa"/>
+            <w:tcBorders/>
+          </w:tcPr>
+          <w:p>
+            <w:pPr>
+              <w:pStyle w:val="Normal"/>
+              <w:rPr/>
+            </w:pPr>
+            <w:r>
+              <w:rPr/>
+              <w:t xml:space="preserve"> </w:t>
+            </w:r>
+            <w:r>
+              <w:rPr/>
+              <w:t xml:space="preserve">Description </w:t>
+            </w:r>
+          </w:p>
+        </w:tc>
+        <w:tc>
+          <w:tcPr>
+            <w:tcW w:w="2407" w:type="dxa"/>
+            <w:tcBorders/>
+          </w:tcPr>
+          <w:p>
+            <w:pPr>
+              <w:pStyle w:val="Normal"/>
+              <w:rPr/>
+            </w:pPr>
+            <w:r>
+              <w:rPr/>
+              <w:t xml:space="preserve"> </w:t>
+            </w:r>
+            <w:r>
+              <w:rPr/>
+              <w:t xml:space="preserve">What it tells the Bank </w:t>
+            </w:r>
+          </w:p>
+        </w:tc>
+      </w:tr>
+      <w:tr>
+        <w:trPr/>
+        <w:tc>
+          <w:tcPr>
+            <w:tcW w:w="1873" w:type="dxa"/>
+            <w:tcBorders/>
+          </w:tcPr>
+          <w:p>
+            <w:pPr>
+              <w:pStyle w:val="Normal"/>
+              <w:rPr/>
+            </w:pPr>
+            <w:r>
+              <w:rPr/>
+              <w:t xml:space="preserve"> </w:t>
+            </w:r>
+            <w:r>
+              <w:rPr/>
+              <w:t>Accuracy</w:t>
+            </w:r>
+          </w:p>
+        </w:tc>
+        <w:tc>
+          <w:tcPr>
+            <w:tcW w:w="2941" w:type="dxa"/>
+            <w:tcBorders/>
+          </w:tcPr>
+          <w:p>
+            <w:pPr>
+              <w:pStyle w:val="Normal"/>
+              <w:rPr/>
+            </w:pPr>
+            <w:r>
+              <w:rPr/>
+              <w:t xml:space="preserve"> </w:t>
+            </w:r>
+            <w:r>
+              <w:rPr/>
+              <w:t xml:space="preserve">$\frac{TP + TN}{TP + TN + FP + FN}$ </w:t>
+            </w:r>
+          </w:p>
+        </w:tc>
+        <w:tc>
+          <w:tcPr>
+            <w:tcW w:w="1606" w:type="dxa"/>
+            <w:tcBorders/>
+          </w:tcPr>
+          <w:p>
+            <w:pPr>
+              <w:pStyle w:val="Normal"/>
+              <w:rPr/>
+            </w:pPr>
+            <w:r>
+              <w:rPr/>
+              <w:t xml:space="preserve"> </w:t>
+            </w:r>
+            <w:r>
+              <w:rPr/>
+              <w:t xml:space="preserve">The proportion of total predictions that were correct. </w:t>
+            </w:r>
+          </w:p>
+        </w:tc>
+        <w:tc>
+          <w:tcPr>
+            <w:tcW w:w="2407" w:type="dxa"/>
+            <w:tcBorders/>
+          </w:tcPr>
+          <w:p>
+            <w:pPr>
+              <w:pStyle w:val="Normal"/>
+              <w:rPr/>
+            </w:pPr>
+            <w:r>
+              <w:rPr/>
+              <w:t xml:space="preserve"> </w:t>
+            </w:r>
+            <w:r>
+              <w:rPr/>
+              <w:t xml:space="preserve">Overall success rate  </w:t>
+            </w:r>
+          </w:p>
+        </w:tc>
+      </w:tr>
+      <w:tr>
+        <w:trPr/>
+        <w:tc>
+          <w:tcPr>
+            <w:tcW w:w="1873" w:type="dxa"/>
+            <w:tcBorders/>
+          </w:tcPr>
+          <w:p>
+            <w:pPr>
+              <w:pStyle w:val="Normal"/>
+              <w:rPr/>
+            </w:pPr>
+            <w:r>
+              <w:rPr/>
+              <w:t xml:space="preserve"> </w:t>
+            </w:r>
+            <w:r>
+              <w:rPr/>
+              <w:t>Precision</w:t>
+            </w:r>
+          </w:p>
+        </w:tc>
+        <w:tc>
+          <w:tcPr>
+            <w:tcW w:w="2941" w:type="dxa"/>
+            <w:tcBorders/>
+          </w:tcPr>
+          <w:p>
+            <w:pPr>
+              <w:pStyle w:val="Normal"/>
+              <w:rPr/>
+            </w:pPr>
+            <w:r>
+              <w:rPr/>
+              <w:t xml:space="preserve"> </w:t>
+            </w:r>
+            <w:r>
+              <w:rPr/>
+              <w:t xml:space="preserve">$\frac{TP}{TP + FP}$ </w:t>
+            </w:r>
+          </w:p>
+        </w:tc>
+        <w:tc>
+          <w:tcPr>
+            <w:tcW w:w="1606" w:type="dxa"/>
+            <w:tcBorders/>
+          </w:tcPr>
+          <w:p>
+            <w:pPr>
+              <w:pStyle w:val="Normal"/>
+              <w:rPr/>
+            </w:pPr>
+            <w:r>
+              <w:rPr/>
+              <w:t xml:space="preserve"> </w:t>
+            </w:r>
+            <w:r>
+              <w:rPr/>
+              <w:t xml:space="preserve">The proportion of positive identifications that were actually correct. </w:t>
+            </w:r>
+          </w:p>
+        </w:tc>
+        <w:tc>
+          <w:tcPr>
+            <w:tcW w:w="2407" w:type="dxa"/>
+            <w:tcBorders/>
+          </w:tcPr>
+          <w:p>
+            <w:pPr>
+              <w:pStyle w:val="Normal"/>
+              <w:rPr/>
+            </w:pPr>
+            <w:r>
+              <w:rPr/>
+              <w:t xml:space="preserve"> </w:t>
+            </w:r>
+            <w:r>
+              <w:rPr/>
+              <w:t xml:space="preserve">"When we call someone a potential customer, how often are we right?" </w:t>
+            </w:r>
+          </w:p>
+        </w:tc>
+      </w:tr>
+      <w:tr>
+        <w:trPr/>
+        <w:tc>
+          <w:tcPr>
+            <w:tcW w:w="1873" w:type="dxa"/>
+            <w:tcBorders/>
+          </w:tcPr>
+          <w:p>
+            <w:pPr>
+              <w:pStyle w:val="Normal"/>
+              <w:rPr/>
+            </w:pPr>
+            <w:r>
+              <w:rPr/>
+              <w:t xml:space="preserve"> </w:t>
+            </w:r>
+            <w:r>
+              <w:rPr/>
+              <w:t>Recall</w:t>
+            </w:r>
+          </w:p>
+        </w:tc>
+        <w:tc>
+          <w:tcPr>
+            <w:tcW w:w="2941" w:type="dxa"/>
+            <w:tcBorders/>
+          </w:tcPr>
+          <w:p>
+            <w:pPr>
+              <w:pStyle w:val="Normal"/>
+              <w:rPr/>
+            </w:pPr>
+            <w:r>
+              <w:rPr/>
+              <w:t xml:space="preserve"> </w:t>
+            </w:r>
+            <w:r>
+              <w:rPr/>
+              <w:t xml:space="preserve">$\frac{TP}{TP + FN}$ </w:t>
+            </w:r>
+          </w:p>
+        </w:tc>
+        <w:tc>
+          <w:tcPr>
+            <w:tcW w:w="1606" w:type="dxa"/>
+            <w:tcBorders/>
+          </w:tcPr>
+          <w:p>
+            <w:pPr>
+              <w:pStyle w:val="Normal"/>
+              <w:rPr/>
+            </w:pPr>
+            <w:r>
+              <w:rPr/>
+              <w:t xml:space="preserve"> </w:t>
+            </w:r>
+            <w:r>
+              <w:rPr/>
+              <w:t xml:space="preserve">The proportion of actual positives that were identified correctly. </w:t>
+            </w:r>
+          </w:p>
+        </w:tc>
+        <w:tc>
+          <w:tcPr>
+            <w:tcW w:w="2407" w:type="dxa"/>
+            <w:tcBorders/>
+          </w:tcPr>
+          <w:p>
+            <w:pPr>
+              <w:pStyle w:val="Normal"/>
+              <w:rPr/>
+            </w:pPr>
+            <w:r>
+              <w:rPr/>
+              <w:t xml:space="preserve"> </w:t>
+            </w:r>
+            <w:r>
+              <w:rPr/>
+              <w:t xml:space="preserve">Out of everyone who would have said 'Yes', how many did we actually find? </w:t>
+            </w:r>
+          </w:p>
+        </w:tc>
+      </w:tr>
+      <w:tr>
+        <w:trPr/>
+        <w:tc>
+          <w:tcPr>
+            <w:tcW w:w="1873" w:type="dxa"/>
+            <w:tcBorders/>
+          </w:tcPr>
+          <w:p>
+            <w:pPr>
+              <w:pStyle w:val="Normal"/>
+              <w:rPr/>
+            </w:pPr>
+            <w:r>
+              <w:rPr/>
+              <w:t xml:space="preserve"> </w:t>
+            </w:r>
+            <w:r>
+              <w:rPr/>
+              <w:t>F1-Score</w:t>
+            </w:r>
+          </w:p>
+        </w:tc>
+        <w:tc>
+          <w:tcPr>
+            <w:tcW w:w="2941" w:type="dxa"/>
+            <w:tcBorders/>
+          </w:tcPr>
+          <w:p>
+            <w:pPr>
+              <w:pStyle w:val="Normal"/>
+              <w:rPr/>
+            </w:pPr>
+            <w:r>
+              <w:rPr/>
+              <w:t xml:space="preserve"> </w:t>
+            </w:r>
+            <w:r>
+              <w:rPr/>
+              <w:t xml:space="preserve">$2 \times \frac{\text{Precision} \times \text{Recall}}{\text{Precision} + \text{Recall}}$ </w:t>
+            </w:r>
+          </w:p>
+        </w:tc>
+        <w:tc>
+          <w:tcPr>
+            <w:tcW w:w="1606" w:type="dxa"/>
+            <w:tcBorders/>
+          </w:tcPr>
+          <w:p>
+            <w:pPr>
+              <w:pStyle w:val="Normal"/>
+              <w:rPr/>
+            </w:pPr>
+            <w:r>
+              <w:rPr/>
+              <w:t xml:space="preserve"> </w:t>
+            </w:r>
+            <w:r>
+              <w:rPr/>
+              <w:t xml:space="preserve">The mean of Precision and Recall. </w:t>
+            </w:r>
+          </w:p>
+        </w:tc>
+        <w:tc>
+          <w:tcPr>
+            <w:tcW w:w="2407" w:type="dxa"/>
+            <w:tcBorders/>
+          </w:tcPr>
+          <w:p>
+            <w:pPr>
+              <w:pStyle w:val="Normal"/>
+              <w:rPr/>
+            </w:pPr>
+            <w:r>
+              <w:rPr/>
+              <w:t xml:space="preserve"> </w:t>
+            </w:r>
+            <w:r>
+              <w:rPr/>
+              <w:t xml:space="preserve">The "balanced" score that punishes models for ignoring the minority class. </w:t>
+            </w:r>
+          </w:p>
+        </w:tc>
+      </w:tr>
+    </w:tbl>
+    <w:p>
+      <w:pPr>
+        <w:pStyle w:val="Normal"/>
+        <w:rPr/>
+      </w:pPr>
+      <w:r>
+        <w:rPr/>
+      </w:r>
+    </w:p>
+    <w:p>
+      <w:pPr>
+        <w:pStyle w:val="Normal"/>
+        <w:rPr/>
+      </w:pPr>
+      <w:r>
+        <w:rPr/>
+        <w:t>Dealing with Model Bias</w:t>
+      </w:r>
+    </w:p>
+    <w:p>
+      <w:pPr>
+        <w:pStyle w:val="Normal"/>
+        <w:rPr/>
+      </w:pPr>
+      <w:r>
+        <w:rPr/>
+      </w:r>
+    </w:p>
+    <w:p>
+      <w:pPr>
+        <w:pStyle w:val="Normal"/>
+        <w:rPr/>
+      </w:pPr>
+      <w:r>
+        <w:rPr/>
+      </w:r>
+    </w:p>
+    <w:p>
+      <w:pPr>
+        <w:pStyle w:val="Normal"/>
+        <w:rPr/>
+      </w:pPr>
+      <w:r>
+        <w:rPr/>
+        <w:drawing>
+          <wp:anchor behindDoc="0" distT="0" distB="0" distL="0" distR="0" simplePos="0" locked="0" layoutInCell="0" allowOverlap="1" relativeHeight="12">
+            <wp:simplePos x="0" y="0"/>
+            <wp:positionH relativeFrom="column">
+              <wp:align>center</wp:align>
+            </wp:positionH>
+            <wp:positionV relativeFrom="paragraph">
+              <wp:posOffset>635</wp:posOffset>
+            </wp:positionV>
+            <wp:extent cx="6120130" cy="3569970"/>
+            <wp:effectExtent l="0" t="0" r="0" b="0"/>
+            <wp:wrapSquare wrapText="largest"/>
+            <wp:docPr id="11" name="Image11" descr="" title=""/>
+            <wp:cNvGraphicFramePr>
+              <a:graphicFrameLocks xmlns:a="http://schemas.openxmlformats.org/drawingml/2006/main" noChangeAspect="1"/>
+            </wp:cNvGraphicFramePr>
+            <a:graphic xmlns:a="http://schemas.openxmlformats.org/drawingml/2006/main">
+              <a:graphicData uri="http://schemas.openxmlformats.org/drawingml/2006/picture">
+                <pic:pic xmlns:pic="http://schemas.openxmlformats.org/drawingml/2006/picture">
+                  <pic:nvPicPr>
+                    <pic:cNvPr id="11" name="Image11" descr="" title=""/>
+                    <pic:cNvPicPr>
+                      <a:picLocks noChangeAspect="1" noChangeArrowheads="1"/>
+                    </pic:cNvPicPr>
+                  </pic:nvPicPr>
+                  <pic:blipFill>
+                    <a:blip r:embed="rId15"/>
+                    <a:stretch>
+                      <a:fillRect/>
+                    </a:stretch>
+                  </pic:blipFill>
+                  <pic:spPr bwMode="auto">
+                    <a:xfrm>
+                      <a:off x="0" y="0"/>
+                      <a:ext cx="6120130" cy="3569970"/>
+                    </a:xfrm>
+                    <a:prstGeom prst="rect">
+                      <a:avLst/>
+                    </a:prstGeom>
+                  </pic:spPr>
+                </pic:pic>
+              </a:graphicData>
+            </a:graphic>
+          </wp:anchor>
+        </w:drawing>
+      </w:r>
+    </w:p>
+    <w:p>
+      <w:pPr>
+        <w:pStyle w:val="Normal"/>
+        <w:rPr/>
+      </w:pPr>
+      <w:r>
+        <w:rPr/>
+      </w:r>
+    </w:p>
+    <w:p>
+      <w:pPr>
+        <w:pStyle w:val="Normal"/>
+        <w:rPr/>
+      </w:pPr>
+      <w:r>
+        <w:rPr/>
+      </w:r>
+    </w:p>
+    <w:p>
+      <w:pPr>
+        <w:pStyle w:val="Normal"/>
+        <w:rPr/>
+      </w:pPr>
+      <w:r>
+        <w:rPr/>
+      </w:r>
+      <w:r>
+        <w:br w:type="page"/>
+      </w:r>
+    </w:p>
+    <w:p>
+      <w:pPr>
+        <w:pStyle w:val="Normal"/>
+        <w:rPr/>
+      </w:pPr>
+      <w:r>
+        <w:rPr/>
+        <w:t>ANN Implementation with Libraries</w:t>
+      </w:r>
+    </w:p>
+    <w:p>
+      <w:pPr>
+        <w:pStyle w:val="Normal"/>
+        <w:rPr/>
+      </w:pPr>
+      <w:r>
+        <w:rPr/>
+      </w:r>
+    </w:p>
+    <w:p>
+      <w:pPr>
+        <w:pStyle w:val="Normal"/>
+        <w:rPr/>
+      </w:pPr>
+      <w:r>
+        <w:rPr/>
+      </w:r>
+    </w:p>
+    <w:p>
+      <w:pPr>
+        <w:pStyle w:val="Normal"/>
+        <w:rPr/>
+      </w:pPr>
+      <w:r>
+        <w:rPr/>
+        <w:t>Parameter Tuning and Model Optimisation</w:t>
+      </w:r>
+    </w:p>
+    <w:p>
+      <w:pPr>
+        <w:pStyle w:val="Normal"/>
+        <w:rPr/>
+      </w:pPr>
+      <w:r>
+        <w:rPr/>
+      </w:r>
+    </w:p>
+    <w:p>
+      <w:pPr>
+        <w:pStyle w:val="Normal"/>
+        <w:rPr/>
+      </w:pPr>
+      <w:r>
+        <w:rPr/>
+      </w:r>
+    </w:p>
+    <w:p>
+      <w:pPr>
+        <w:pStyle w:val="Normal"/>
+        <w:widowControl/>
+        <w:numPr>
+          <w:ilvl w:val="0"/>
+          <w:numId w:val="0"/>
+        </w:numPr>
+        <w:suppressAutoHyphens w:val="true"/>
+        <w:jc w:val="both"/>
+        <w:rPr/>
+      </w:pPr>
+      <w:r>
+        <w:rPr/>
+      </w:r>
+      <w:r>
+        <w:br w:type="page"/>
+      </w:r>
+    </w:p>
+    <w:p>
+      <w:pPr>
         <w:pStyle w:val="Normal"/>
         <w:rPr/>
       </w:pPr>
@@ -9799,11 +12564,54 @@
         <w:pStyle w:val="Normal"/>
         <w:rPr/>
       </w:pPr>
-      <w:r>
-        <w:rPr>
+      <w:hyperlink r:id="rId17">
+        <w:r>
+          <w:rPr>
+            <w:rStyle w:val="Hyperlink"/>
+            <w:shd w:fill="FFFF00" w:val="clear"/>
+          </w:rPr>
+          <w:t>https://www.cognism.com/blog/cold-calling-success-rates</w:t>
+        </w:r>
+      </w:hyperlink>
+    </w:p>
+    <w:p>
+      <w:pPr>
+        <w:pStyle w:val="Normal"/>
+        <w:rPr>
+          <w:highlight w:val="none"/>
           <w:shd w:fill="FFFF00" w:val="clear"/>
         </w:rPr>
-        <w:t>https://www.cognism.com/blog/cold-calling-success-rates</w:t>
+      </w:pPr>
+      <w:r>
+        <w:rPr/>
+      </w:r>
+    </w:p>
+    <w:p>
+      <w:pPr>
+        <w:pStyle w:val="Normal"/>
+        <w:rPr>
+          <w:highlight w:val="none"/>
+          <w:shd w:fill="FFFF00" w:val="clear"/>
+        </w:rPr>
+      </w:pPr>
+      <w:r>
+        <w:rPr>
+          <w:shd w:fill="FFFF00" w:val="clear"/>
+        </w:rPr>
+        <w:t xml:space="preserve">Bishop, C. M. (2006). </w:t>
+      </w:r>
+      <w:r>
+        <w:rPr>
+          <w:i/>
+          <w:shd w:fill="FFFF00" w:val="clear"/>
+        </w:rPr>
+        <w:t>Pattern Recognition and Machine Learning</w:t>
+      </w:r>
+      <w:r>
+        <w:rPr>
+          <w:shd w:fill="FFFF00" w:val="clear"/>
+        </w:rPr>
+        <w:t>. Springer.</w:t>
       </w:r>
       <w:r>
         <w:br w:type="page"/>
@@ -9819,8 +12627,8 @@
         <w:ind w:hanging="0" w:start="0"/>
         <w:rPr/>
       </w:pPr>
-      <w:bookmarkStart w:id="30" w:name="__RefHeading___Toc2858_500896196"/>
-      <w:bookmarkEnd w:id="30"/>
+      <w:bookmarkStart w:id="29" w:name="__RefHeading___Toc2858_500896196"/>
+      <w:bookmarkEnd w:id="29"/>
       <w:r>
         <w:rPr/>
         <w:t xml:space="preserve">Appendix A – Prolog Rule </w:t>
@@ -10257,8 +13065,8 @@
         <w:ind w:hanging="0" w:start="0"/>
         <w:rPr/>
       </w:pPr>
-      <w:bookmarkStart w:id="31" w:name="__RefHeading___Toc2860_500896196"/>
-      <w:bookmarkEnd w:id="31"/>
+      <w:bookmarkStart w:id="30" w:name="__RefHeading___Toc2860_500896196"/>
+      <w:bookmarkEnd w:id="30"/>
       <w:r>
         <w:rPr/>
         <w:t>Rules</w:t>
@@ -14700,9 +17508,9 @@
       </w:r>
     </w:p>
     <w:sectPr>
-      <w:footerReference w:type="even" r:id="rId13"/>
-      <w:footerReference w:type="default" r:id="rId14"/>
-      <w:footerReference w:type="first" r:id="rId15"/>
+      <w:footerReference w:type="even" r:id="rId18"/>
+      <w:footerReference w:type="default" r:id="rId19"/>
+      <w:footerReference w:type="first" r:id="rId20"/>
       <w:type w:val="nextPage"/>
       <w:pgSz w:w="11906" w:h="16838"/>
       <w:pgMar w:left="1134" w:right="1134" w:gutter="0" w:header="0" w:top="1134" w:footer="1134" w:bottom="1693"/>
@@ -14755,7 +17563,7 @@
     </w:r>
     <w:r>
       <w:rPr/>
-      <w:t>22</w:t>
+      <w:t>28</w:t>
     </w:r>
     <w:r>
       <w:rPr/>
@@ -14779,7 +17587,7 @@
     </w:r>
     <w:r>
       <w:rPr/>
-      <w:t>22</w:t>
+      <w:t>28</w:t>
     </w:r>
     <w:r>
       <w:rPr/>
@@ -14815,7 +17623,7 @@
     </w:r>
     <w:r>
       <w:rPr/>
-      <w:t>22</w:t>
+      <w:t>28</w:t>
     </w:r>
     <w:r>
       <w:rPr/>
@@ -14839,7 +17647,7 @@
     </w:r>
     <w:r>
       <w:rPr/>
-      <w:t>22</w:t>
+      <w:t>28</w:t>
     </w:r>
     <w:r>
       <w:rPr/>
@@ -15537,7 +18345,7 @@
         <w:tabs>
           <w:tab w:val="num" w:pos="720"/>
         </w:tabs>
-        <w:ind w:start="720" w:hanging="283"/>
+        <w:ind w:start="720" w:hanging="360"/>
       </w:pPr>
       <w:rPr>
         <w:rFonts w:ascii="Symbol" w:hAnsi="Symbol" w:cs="Symbol" w:hint="default"/>
@@ -15545,8 +18353,8 @@
     </w:lvl>
     <w:lvl w:ilvl="1">
       <w:start w:val="1"/>
-      <w:numFmt w:val="decimal"/>
-      <w:lvlText w:val="%2."/>
+      <w:numFmt w:val="bullet"/>
+      <w:lvlText w:val="◦"/>
       <w:lvlJc w:val="start"/>
       <w:pPr>
         <w:tabs>
@@ -15554,11 +18362,14 @@
         </w:tabs>
         <w:ind w:start="1080" w:hanging="360"/>
       </w:pPr>
+      <w:rPr>
+        <w:rFonts w:ascii="OpenSymbol" w:hAnsi="OpenSymbol" w:cs="OpenSymbol" w:hint="default"/>
+      </w:rPr>
     </w:lvl>
     <w:lvl w:ilvl="2">
       <w:start w:val="1"/>
-      <w:numFmt w:val="decimal"/>
-      <w:lvlText w:val="%3."/>
+      <w:numFmt w:val="bullet"/>
+      <w:lvlText w:val="▪"/>
       <w:lvlJc w:val="start"/>
       <w:pPr>
         <w:tabs>
@@ -15566,11 +18377,14 @@
         </w:tabs>
         <w:ind w:start="1440" w:hanging="360"/>
       </w:pPr>
+      <w:rPr>
+        <w:rFonts w:ascii="OpenSymbol" w:hAnsi="OpenSymbol" w:cs="OpenSymbol" w:hint="default"/>
+      </w:rPr>
     </w:lvl>
     <w:lvl w:ilvl="3">
       <w:start w:val="1"/>
-      <w:numFmt w:val="decimal"/>
-      <w:lvlText w:val="%4."/>
+      <w:numFmt w:val="bullet"/>
+      <w:lvlText w:val=""/>
       <w:lvlJc w:val="start"/>
       <w:pPr>
         <w:tabs>
@@ -15578,11 +18392,14 @@
         </w:tabs>
         <w:ind w:start="1800" w:hanging="360"/>
       </w:pPr>
+      <w:rPr>
+        <w:rFonts w:ascii="Symbol" w:hAnsi="Symbol" w:cs="Symbol" w:hint="default"/>
+      </w:rPr>
     </w:lvl>
     <w:lvl w:ilvl="4">
       <w:start w:val="1"/>
-      <w:numFmt w:val="decimal"/>
-      <w:lvlText w:val="%5."/>
+      <w:numFmt w:val="bullet"/>
+      <w:lvlText w:val="◦"/>
       <w:lvlJc w:val="start"/>
       <w:pPr>
         <w:tabs>
@@ -15590,11 +18407,14 @@
         </w:tabs>
         <w:ind w:start="2160" w:hanging="360"/>
       </w:pPr>
+      <w:rPr>
+        <w:rFonts w:ascii="OpenSymbol" w:hAnsi="OpenSymbol" w:cs="OpenSymbol" w:hint="default"/>
+      </w:rPr>
     </w:lvl>
     <w:lvl w:ilvl="5">
       <w:start w:val="1"/>
-      <w:numFmt w:val="decimal"/>
-      <w:lvlText w:val="%6."/>
+      <w:numFmt w:val="bullet"/>
+      <w:lvlText w:val="▪"/>
       <w:lvlJc w:val="start"/>
       <w:pPr>
         <w:tabs>
@@ -15602,11 +18422,14 @@
         </w:tabs>
         <w:ind w:start="2520" w:hanging="360"/>
       </w:pPr>
+      <w:rPr>
+        <w:rFonts w:ascii="OpenSymbol" w:hAnsi="OpenSymbol" w:cs="OpenSymbol" w:hint="default"/>
+      </w:rPr>
     </w:lvl>
     <w:lvl w:ilvl="6">
       <w:start w:val="1"/>
-      <w:numFmt w:val="decimal"/>
-      <w:lvlText w:val="%7."/>
+      <w:numFmt w:val="bullet"/>
+      <w:lvlText w:val=""/>
       <w:lvlJc w:val="start"/>
       <w:pPr>
         <w:tabs>
@@ -15614,11 +18437,14 @@
         </w:tabs>
         <w:ind w:start="2880" w:hanging="360"/>
       </w:pPr>
+      <w:rPr>
+        <w:rFonts w:ascii="Symbol" w:hAnsi="Symbol" w:cs="Symbol" w:hint="default"/>
+      </w:rPr>
     </w:lvl>
     <w:lvl w:ilvl="7">
       <w:start w:val="1"/>
-      <w:numFmt w:val="decimal"/>
-      <w:lvlText w:val="%8."/>
+      <w:numFmt w:val="bullet"/>
+      <w:lvlText w:val="◦"/>
       <w:lvlJc w:val="start"/>
       <w:pPr>
         <w:tabs>
@@ -15626,11 +18452,14 @@
         </w:tabs>
         <w:ind w:start="3240" w:hanging="360"/>
       </w:pPr>
+      <w:rPr>
+        <w:rFonts w:ascii="OpenSymbol" w:hAnsi="OpenSymbol" w:cs="OpenSymbol" w:hint="default"/>
+      </w:rPr>
     </w:lvl>
     <w:lvl w:ilvl="8">
       <w:start w:val="1"/>
-      <w:numFmt w:val="decimal"/>
-      <w:lvlText w:val="%9."/>
+      <w:numFmt w:val="bullet"/>
+      <w:lvlText w:val="▪"/>
       <w:lvlJc w:val="start"/>
       <w:pPr>
         <w:tabs>
@@ -15638,9 +18467,149 @@
         </w:tabs>
         <w:ind w:start="3600" w:hanging="360"/>
       </w:pPr>
+      <w:rPr>
+        <w:rFonts w:ascii="OpenSymbol" w:hAnsi="OpenSymbol" w:cs="OpenSymbol" w:hint="default"/>
+      </w:rPr>
     </w:lvl>
   </w:abstractNum>
   <w:abstractNum w:abstractNumId="7">
+    <w:lvl w:ilvl="0">
+      <w:start w:val="1"/>
+      <w:numFmt w:val="bullet"/>
+      <w:lvlText w:val=""/>
+      <w:lvlJc w:val="start"/>
+      <w:pPr>
+        <w:tabs>
+          <w:tab w:val="num" w:pos="720"/>
+        </w:tabs>
+        <w:ind w:start="720" w:hanging="360"/>
+      </w:pPr>
+      <w:rPr>
+        <w:rFonts w:ascii="Symbol" w:hAnsi="Symbol" w:cs="Symbol" w:hint="default"/>
+      </w:rPr>
+    </w:lvl>
+    <w:lvl w:ilvl="1">
+      <w:start w:val="1"/>
+      <w:numFmt w:val="bullet"/>
+      <w:lvlText w:val="◦"/>
+      <w:lvlJc w:val="start"/>
+      <w:pPr>
+        <w:tabs>
+          <w:tab w:val="num" w:pos="1080"/>
+        </w:tabs>
+        <w:ind w:start="1080" w:hanging="360"/>
+      </w:pPr>
+      <w:rPr>
+        <w:rFonts w:ascii="OpenSymbol" w:hAnsi="OpenSymbol" w:cs="OpenSymbol" w:hint="default"/>
+      </w:rPr>
+    </w:lvl>
+    <w:lvl w:ilvl="2">
+      <w:start w:val="1"/>
+      <w:numFmt w:val="bullet"/>
+      <w:lvlText w:val="▪"/>
+      <w:lvlJc w:val="start"/>
+      <w:pPr>
+        <w:tabs>
+          <w:tab w:val="num" w:pos="1440"/>
+        </w:tabs>
+        <w:ind w:start="1440" w:hanging="360"/>
+      </w:pPr>
+      <w:rPr>
+        <w:rFonts w:ascii="OpenSymbol" w:hAnsi="OpenSymbol" w:cs="OpenSymbol" w:hint="default"/>
+      </w:rPr>
+    </w:lvl>
+    <w:lvl w:ilvl="3">
+      <w:start w:val="1"/>
+      <w:numFmt w:val="bullet"/>
+      <w:lvlText w:val=""/>
+      <w:lvlJc w:val="start"/>
+      <w:pPr>
+        <w:tabs>
+          <w:tab w:val="num" w:pos="1800"/>
+        </w:tabs>
+        <w:ind w:start="1800" w:hanging="360"/>
+      </w:pPr>
+      <w:rPr>
+        <w:rFonts w:ascii="Symbol" w:hAnsi="Symbol" w:cs="Symbol" w:hint="default"/>
+      </w:rPr>
+    </w:lvl>
+    <w:lvl w:ilvl="4">
+      <w:start w:val="1"/>
+      <w:numFmt w:val="bullet"/>
+      <w:lvlText w:val="◦"/>
+      <w:lvlJc w:val="start"/>
+      <w:pPr>
+        <w:tabs>
+          <w:tab w:val="num" w:pos="2160"/>
+        </w:tabs>
+        <w:ind w:start="2160" w:hanging="360"/>
+      </w:pPr>
+      <w:rPr>
+        <w:rFonts w:ascii="OpenSymbol" w:hAnsi="OpenSymbol" w:cs="OpenSymbol" w:hint="default"/>
+      </w:rPr>
+    </w:lvl>
+    <w:lvl w:ilvl="5">
+      <w:start w:val="1"/>
+      <w:numFmt w:val="bullet"/>
+      <w:lvlText w:val="▪"/>
+      <w:lvlJc w:val="start"/>
+      <w:pPr>
+        <w:tabs>
+          <w:tab w:val="num" w:pos="2520"/>
+        </w:tabs>
+        <w:ind w:start="2520" w:hanging="360"/>
+      </w:pPr>
+      <w:rPr>
+        <w:rFonts w:ascii="OpenSymbol" w:hAnsi="OpenSymbol" w:cs="OpenSymbol" w:hint="default"/>
+      </w:rPr>
+    </w:lvl>
+    <w:lvl w:ilvl="6">
+      <w:start w:val="1"/>
+      <w:numFmt w:val="bullet"/>
+      <w:lvlText w:val=""/>
+      <w:lvlJc w:val="start"/>
+      <w:pPr>
+        <w:tabs>
+          <w:tab w:val="num" w:pos="2880"/>
+        </w:tabs>
+        <w:ind w:start="2880" w:hanging="360"/>
+      </w:pPr>
+      <w:rPr>
+        <w:rFonts w:ascii="Symbol" w:hAnsi="Symbol" w:cs="Symbol" w:hint="default"/>
+      </w:rPr>
+    </w:lvl>
+    <w:lvl w:ilvl="7">
+      <w:start w:val="1"/>
+      <w:numFmt w:val="bullet"/>
+      <w:lvlText w:val="◦"/>
+      <w:lvlJc w:val="start"/>
+      <w:pPr>
+        <w:tabs>
+          <w:tab w:val="num" w:pos="3240"/>
+        </w:tabs>
+        <w:ind w:start="3240" w:hanging="360"/>
+      </w:pPr>
+      <w:rPr>
+        <w:rFonts w:ascii="OpenSymbol" w:hAnsi="OpenSymbol" w:cs="OpenSymbol" w:hint="default"/>
+      </w:rPr>
+    </w:lvl>
+    <w:lvl w:ilvl="8">
+      <w:start w:val="1"/>
+      <w:numFmt w:val="bullet"/>
+      <w:lvlText w:val="▪"/>
+      <w:lvlJc w:val="start"/>
+      <w:pPr>
+        <w:tabs>
+          <w:tab w:val="num" w:pos="3600"/>
+        </w:tabs>
+        <w:ind w:start="3600" w:hanging="360"/>
+      </w:pPr>
+      <w:rPr>
+        <w:rFonts w:ascii="OpenSymbol" w:hAnsi="OpenSymbol" w:cs="OpenSymbol" w:hint="default"/>
+      </w:rPr>
+    </w:lvl>
+  </w:abstractNum>
+  <w:abstractNum w:abstractNumId="8">
     <w:lvl w:ilvl="0">
       <w:start w:val="1"/>
       <w:numFmt w:val="none"/>
@@ -15779,6 +18748,9 @@
   </w:num>
   <w:num w:numId="7">
     <w:abstractNumId w:val="7"/>
+  </w:num>
+  <w:num w:numId="8">
+    <w:abstractNumId w:val="8"/>
   </w:num>
 </w:numbering>
 </file>

</xml_diff>

<commit_message>
Report updated for GA, SKL notebook commeted and finished.
</commit_message>
<xml_diff>
--- a/assessment/Writ1_Artificial-Intelligence_ST20285213-Tom-Rowan.docx
+++ b/assessment/Writ1_Artificial-Intelligence_ST20285213-Tom-Rowan.docx
@@ -293,8 +293,8 @@
                 <w:lang w:val="en-US" w:eastAsia="zh-CN" w:bidi="hi-IN"/>
               </w:rPr>
             </w:pPr>
-            <w:bookmarkStart w:id="0" w:name="_Toc229176267"/>
-            <w:bookmarkStart w:id="1" w:name="_Toc216033695"/>
+            <w:bookmarkStart w:id="0" w:name="_Toc216033695"/>
+            <w:bookmarkStart w:id="1" w:name="_Toc229176267"/>
             <w:r>
               <w:rPr>
                 <w:rFonts w:cs="Noto Sans Devanagari"/>
@@ -460,8 +460,8 @@
                 <w:lang w:val="en-US" w:eastAsia="zh-CN" w:bidi="hi-IN"/>
               </w:rPr>
             </w:pPr>
-            <w:bookmarkStart w:id="2" w:name="_Toc229176268"/>
-            <w:bookmarkStart w:id="3" w:name="_Toc216033696"/>
+            <w:bookmarkStart w:id="2" w:name="_Toc216033696"/>
+            <w:bookmarkStart w:id="3" w:name="_Toc229176268"/>
             <w:r>
               <w:rPr>
                 <w:rFonts w:cs="Noto Sans Devanagari"/>
@@ -534,8 +534,8 @@
                 <w:lang w:val="en-US" w:eastAsia="zh-CN" w:bidi="hi-IN"/>
               </w:rPr>
             </w:pPr>
-            <w:bookmarkStart w:id="4" w:name="_Toc229176269"/>
-            <w:bookmarkStart w:id="5" w:name="_Toc216033697"/>
+            <w:bookmarkStart w:id="4" w:name="_Toc216033697"/>
+            <w:bookmarkStart w:id="5" w:name="_Toc229176269"/>
             <w:r>
               <w:rPr>
                 <w:rFonts w:cs="Noto Sans Devanagari"/>
@@ -652,6 +652,13 @@
             </w:r>
             <w:r>
               <w:rPr>
+                <w:rStyle w:val="IndexLink"/>
+                <w:vanish/>
+              </w:rPr>
+              <w:tab/>
+            </w:r>
+            <w:r>
+              <w:rPr>
                 <w:webHidden/>
               </w:rPr>
               <w:fldChar w:fldCharType="begin"/>
@@ -672,7 +679,6 @@
               <w:rPr>
                 <w:rStyle w:val="IndexLink"/>
               </w:rPr>
-              <w:tab/>
               <w:t>1</w:t>
             </w:r>
             <w:r>
@@ -3173,9 +3179,9 @@
             <wp:wrapTight wrapText="bothSides">
               <wp:wrapPolygon edited="0">
                 <wp:start x="-15" y="0"/>
-                <wp:lineTo x="-15" y="21522"/>
-                <wp:lineTo x="21553" y="21522"/>
-                <wp:lineTo x="21553" y="0"/>
+                <wp:lineTo x="-15" y="21490"/>
+                <wp:lineTo x="21537" y="21490"/>
+                <wp:lineTo x="21537" y="0"/>
                 <wp:lineTo x="-15" y="0"/>
               </wp:wrapPolygon>
             </wp:wrapTight>
@@ -3228,7 +3234,7 @@
         <mc:AlternateContent>
           <mc:Choice Requires="wps">
             <w:drawing>
-              <wp:anchor behindDoc="0" distT="635" distB="0" distL="114300" distR="113665" simplePos="0" locked="0" layoutInCell="0" allowOverlap="1" relativeHeight="18" wp14:anchorId="0BA0B62E">
+              <wp:anchor behindDoc="0" distT="635" distB="280670" distL="114300" distR="113030" simplePos="0" locked="0" layoutInCell="0" allowOverlap="1" relativeHeight="18" wp14:anchorId="0BA0B62E">
                 <wp:simplePos x="0" y="0"/>
                 <wp:positionH relativeFrom="column">
                   <wp:posOffset>43180</wp:posOffset>
@@ -3283,31 +3289,45 @@
                               <w:rPr/>
                             </w:pPr>
                             <w:r>
-                              <w:rPr/>
+                              <w:rPr>
+                                <w:color w:val="000000"/>
+                              </w:rPr>
                               <w:t xml:space="preserve">Figure </w:t>
                             </w:r>
                             <w:r>
-                              <w:rPr/>
+                              <w:rPr>
+                                <w:color w:val="000000"/>
+                              </w:rPr>
                               <w:fldChar w:fldCharType="begin"/>
                             </w:r>
                             <w:r>
-                              <w:rPr/>
+                              <w:rPr>
+                                <w:color w:val="000000"/>
+                              </w:rPr>
                               <w:instrText xml:space="preserve"> SEQ Figure \* ARABIC </w:instrText>
                             </w:r>
                             <w:r>
-                              <w:rPr/>
+                              <w:rPr>
+                                <w:color w:val="000000"/>
+                              </w:rPr>
                               <w:fldChar w:fldCharType="separate"/>
                             </w:r>
                             <w:r>
-                              <w:rPr/>
+                              <w:rPr>
+                                <w:color w:val="000000"/>
+                              </w:rPr>
                               <w:t>2</w:t>
                             </w:r>
                             <w:r>
-                              <w:rPr/>
+                              <w:rPr>
+                                <w:color w:val="000000"/>
+                              </w:rPr>
                               <w:fldChar w:fldCharType="end"/>
                             </w:r>
                             <w:r>
-                              <w:rPr/>
+                              <w:rPr>
+                                <w:color w:val="000000"/>
+                              </w:rPr>
                               <w:t xml:space="preserve"> Showing a small part of a node-based visualisation.</w:t>
                             </w:r>
                           </w:p>
@@ -3338,31 +3358,45 @@
                         <w:rPr/>
                       </w:pPr>
                       <w:r>
-                        <w:rPr/>
+                        <w:rPr>
+                          <w:color w:val="000000"/>
+                        </w:rPr>
                         <w:t xml:space="preserve">Figure </w:t>
                       </w:r>
                       <w:r>
-                        <w:rPr/>
+                        <w:rPr>
+                          <w:color w:val="000000"/>
+                        </w:rPr>
                         <w:fldChar w:fldCharType="begin"/>
                       </w:r>
                       <w:r>
-                        <w:rPr/>
+                        <w:rPr>
+                          <w:color w:val="000000"/>
+                        </w:rPr>
                         <w:instrText xml:space="preserve"> SEQ Figure \* ARABIC </w:instrText>
                       </w:r>
                       <w:r>
-                        <w:rPr/>
+                        <w:rPr>
+                          <w:color w:val="000000"/>
+                        </w:rPr>
                         <w:fldChar w:fldCharType="separate"/>
                       </w:r>
                       <w:r>
-                        <w:rPr/>
+                        <w:rPr>
+                          <w:color w:val="000000"/>
+                        </w:rPr>
                         <w:t>2</w:t>
                       </w:r>
                       <w:r>
-                        <w:rPr/>
+                        <w:rPr>
+                          <w:color w:val="000000"/>
+                        </w:rPr>
                         <w:fldChar w:fldCharType="end"/>
                       </w:r>
                       <w:r>
-                        <w:rPr/>
+                        <w:rPr>
+                          <w:color w:val="000000"/>
+                        </w:rPr>
                         <w:t xml:space="preserve"> Showing a small part of a node-based visualisation.</w:t>
                       </w:r>
                     </w:p>
@@ -4683,9 +4717,9 @@
             <wp:wrapTight wrapText="bothSides">
               <wp:wrapPolygon edited="0">
                 <wp:start x="-74" y="0"/>
-                <wp:lineTo x="-74" y="21451"/>
-                <wp:lineTo x="21449" y="21451"/>
-                <wp:lineTo x="21449" y="0"/>
+                <wp:lineTo x="-74" y="21376"/>
+                <wp:lineTo x="21374" y="21376"/>
+                <wp:lineTo x="21374" y="0"/>
                 <wp:lineTo x="-74" y="0"/>
               </wp:wrapPolygon>
             </wp:wrapTight>
@@ -5140,7 +5174,7 @@
         <mc:AlternateContent>
           <mc:Choice Requires="wps">
             <w:drawing>
-              <wp:anchor behindDoc="0" distT="635" distB="635" distL="114300" distR="113665" simplePos="0" locked="0" layoutInCell="0" allowOverlap="1" relativeHeight="21" wp14:anchorId="0F509A63">
+              <wp:anchor behindDoc="0" distT="635" distB="486410" distL="114300" distR="112395" simplePos="0" locked="0" layoutInCell="0" allowOverlap="1" relativeHeight="21" wp14:anchorId="0F509A63">
                 <wp:simplePos x="0" y="0"/>
                 <wp:positionH relativeFrom="column">
                   <wp:posOffset>3544570</wp:posOffset>
@@ -5195,31 +5229,45 @@
                               <w:rPr/>
                             </w:pPr>
                             <w:r>
-                              <w:rPr/>
+                              <w:rPr>
+                                <w:color w:val="000000"/>
+                              </w:rPr>
                               <w:t xml:space="preserve">Figure </w:t>
                             </w:r>
                             <w:r>
-                              <w:rPr/>
+                              <w:rPr>
+                                <w:color w:val="000000"/>
+                              </w:rPr>
                               <w:fldChar w:fldCharType="begin"/>
                             </w:r>
                             <w:r>
-                              <w:rPr/>
+                              <w:rPr>
+                                <w:color w:val="000000"/>
+                              </w:rPr>
                               <w:instrText xml:space="preserve"> SEQ Figure \* ARABIC </w:instrText>
                             </w:r>
                             <w:r>
-                              <w:rPr/>
+                              <w:rPr>
+                                <w:color w:val="000000"/>
+                              </w:rPr>
                               <w:fldChar w:fldCharType="separate"/>
                             </w:r>
                             <w:r>
-                              <w:rPr/>
+                              <w:rPr>
+                                <w:color w:val="000000"/>
+                              </w:rPr>
                               <w:t>3</w:t>
                             </w:r>
                             <w:r>
-                              <w:rPr/>
+                              <w:rPr>
+                                <w:color w:val="000000"/>
+                              </w:rPr>
                               <w:fldChar w:fldCharType="end"/>
                             </w:r>
                             <w:r>
-                              <w:rPr/>
+                              <w:rPr>
+                                <w:color w:val="000000"/>
+                              </w:rPr>
                               <w:t xml:space="preserve"> Showing properties in one branch of the tree.</w:t>
                             </w:r>
                           </w:p>
@@ -5250,31 +5298,45 @@
                         <w:rPr/>
                       </w:pPr>
                       <w:r>
-                        <w:rPr/>
+                        <w:rPr>
+                          <w:color w:val="000000"/>
+                        </w:rPr>
                         <w:t xml:space="preserve">Figure </w:t>
                       </w:r>
                       <w:r>
-                        <w:rPr/>
+                        <w:rPr>
+                          <w:color w:val="000000"/>
+                        </w:rPr>
                         <w:fldChar w:fldCharType="begin"/>
                       </w:r>
                       <w:r>
-                        <w:rPr/>
+                        <w:rPr>
+                          <w:color w:val="000000"/>
+                        </w:rPr>
                         <w:instrText xml:space="preserve"> SEQ Figure \* ARABIC </w:instrText>
                       </w:r>
                       <w:r>
-                        <w:rPr/>
+                        <w:rPr>
+                          <w:color w:val="000000"/>
+                        </w:rPr>
                         <w:fldChar w:fldCharType="separate"/>
                       </w:r>
                       <w:r>
-                        <w:rPr/>
+                        <w:rPr>
+                          <w:color w:val="000000"/>
+                        </w:rPr>
                         <w:t>3</w:t>
                       </w:r>
                       <w:r>
-                        <w:rPr/>
+                        <w:rPr>
+                          <w:color w:val="000000"/>
+                        </w:rPr>
                         <w:fldChar w:fldCharType="end"/>
                       </w:r>
                       <w:r>
-                        <w:rPr/>
+                        <w:rPr>
+                          <w:color w:val="000000"/>
+                        </w:rPr>
                         <w:t xml:space="preserve"> Showing properties in one branch of the tree.</w:t>
                       </w:r>
                     </w:p>
@@ -8937,6 +8999,40 @@
         <w:t>Part 2: Connectionist Methods</w:t>
       </w:r>
       <w:bookmarkEnd w:id="15"/>
+    </w:p>
+    <w:p>
+      <w:pPr>
+        <w:pStyle w:val="Normal"/>
+        <w:numPr>
+          <w:ilvl w:val="1"/>
+          <w:numId w:val="1"/>
+        </w:numPr>
+        <w:rPr/>
+      </w:pPr>
+      <w:r>
+        <w:rPr/>
+        <w:t>In 1943, Warren McCulloch and Walter Pitts proposed that the brain works like a series of logic gates (</w:t>
+      </w:r>
+      <w:r>
+        <w:rPr/>
+        <w:t>0’s and 1’s</w:t>
+      </w:r>
+      <w:r>
+        <w:rPr/>
+        <w:t xml:space="preserve">). They proved that </w:t>
+      </w:r>
+      <w:r>
+        <w:rPr/>
+        <w:t>neural</w:t>
+      </w:r>
+      <w:r>
+        <w:rPr/>
+        <w:t xml:space="preserve"> activity is a biological way of doing math</w:t>
+      </w:r>
+      <w:r>
+        <w:rPr/>
+        <w:t>s. Modelling this behaviour in a digital neural network is a well known problem solving approach. In this section, I will discuss the creation and performance of several neural networks aiming to help ‘a bank’ determine which customers to call with a view to making a deposit with the bank.</w:t>
+      </w:r>
     </w:p>
     <w:p>
       <w:pPr>
@@ -9206,15 +9302,7 @@
       </w:pPr>
       <w:r>
         <w:rPr/>
-        <w:t xml:space="preserve">Four features that were likely to contain outliers and/or very wide distributions: age, balance, campaign and previous </w:t>
-      </w:r>
-      <w:r>
-        <w:rPr/>
-        <w:t>[number of times contacted]</w:t>
-      </w:r>
-      <w:r>
-        <w:rPr/>
-        <w:t xml:space="preserve">. </w:t>
+        <w:t xml:space="preserve">Four features that were likely to contain outliers and/or very wide distributions: age, balance, campaign and previous [number of times contacted]. </w:t>
       </w:r>
     </w:p>
     <w:p>
@@ -9361,23 +9449,7 @@
       </w:pPr>
       <w:r>
         <w:rPr/>
-        <w:t xml:space="preserve">Standardised Z-Score Scaler was used </w:t>
-      </w:r>
-      <w:r>
-        <w:rPr/>
-        <w:t>t</w:t>
-      </w:r>
-      <w:r>
-        <w:rPr/>
-        <w:t xml:space="preserve">o encode </w:t>
-      </w:r>
-      <w:r>
-        <w:rPr/>
-        <w:t>all of the</w:t>
-      </w:r>
-      <w:r>
-        <w:rPr/>
-        <w:t xml:space="preserve"> the features with outliers, as described below.</w:t>
+        <w:t>Standardised Z-Score Scaler was used to encode all of the the features with outliers, as described below.</w:t>
       </w:r>
     </w:p>
     <w:p>
@@ -11808,9 +11880,9 @@
         <w:tblLook w:val="04a0" w:noHBand="0" w:noVBand="1" w:firstColumn="1" w:lastRow="0" w:lastColumn="0" w:firstRow="1"/>
       </w:tblPr>
       <w:tblGrid>
-        <w:gridCol w:w="1523"/>
+        <w:gridCol w:w="1522"/>
         <w:gridCol w:w="2715"/>
-        <w:gridCol w:w="5400"/>
+        <w:gridCol w:w="5401"/>
       </w:tblGrid>
       <w:tr>
         <w:trPr>
@@ -11818,7 +11890,7 @@
         </w:trPr>
         <w:tc>
           <w:tcPr>
-            <w:tcW w:w="1523" w:type="dxa"/>
+            <w:tcW w:w="1522" w:type="dxa"/>
             <w:cnfStyle w:val="001000000000" w:firstRow="0" w:lastRow="0" w:firstColumn="1" w:lastColumn="0" w:oddVBand="0" w:evenVBand="0" w:oddHBand="0" w:evenHBand="0" w:firstRowFirstColumn="0" w:firstRowLastColumn="0" w:lastRowFirstColumn="0" w:lastRowLastColumn="0"/>
             <w:tcBorders>
               <w:top w:val="single" w:sz="4" w:space="0" w:color="000000"/>
@@ -11900,7 +11972,7 @@
         </w:tc>
         <w:tc>
           <w:tcPr>
-            <w:tcW w:w="5400" w:type="dxa"/>
+            <w:tcW w:w="5401" w:type="dxa"/>
             <w:tcBorders>
               <w:top w:val="single" w:sz="4" w:space="0" w:color="000000"/>
               <w:start w:val="single" w:sz="4" w:space="0" w:color="000000"/>
@@ -11945,7 +12017,7 @@
         </w:trPr>
         <w:tc>
           <w:tcPr>
-            <w:tcW w:w="1523" w:type="dxa"/>
+            <w:tcW w:w="1522" w:type="dxa"/>
             <w:cnfStyle w:val="001000000000" w:firstRow="0" w:lastRow="0" w:firstColumn="1" w:lastColumn="0" w:oddVBand="0" w:evenVBand="0" w:oddHBand="0" w:evenHBand="0" w:firstRowFirstColumn="0" w:firstRowLastColumn="0" w:lastRowFirstColumn="0" w:lastRowLastColumn="0"/>
             <w:tcBorders/>
             <w:shd w:color="auto" w:fill="CCCCCC" w:themeFill="text1" w:themeFillTint="33" w:val="clear"/>
@@ -12009,7 +12081,7 @@
         </w:tc>
         <w:tc>
           <w:tcPr>
-            <w:tcW w:w="5400" w:type="dxa"/>
+            <w:tcW w:w="5401" w:type="dxa"/>
             <w:tcBorders/>
             <w:shd w:color="auto" w:fill="CCCCCC" w:themeFill="text1" w:themeFillTint="33" w:val="clear"/>
           </w:tcPr>
@@ -12042,7 +12114,7 @@
         <w:trPr/>
         <w:tc>
           <w:tcPr>
-            <w:tcW w:w="1523" w:type="dxa"/>
+            <w:tcW w:w="1522" w:type="dxa"/>
             <w:cnfStyle w:val="001000000000" w:firstRow="0" w:lastRow="0" w:firstColumn="1" w:lastColumn="0" w:oddVBand="0" w:evenVBand="0" w:oddHBand="0" w:evenHBand="0" w:firstRowFirstColumn="0" w:firstRowLastColumn="0" w:lastRowFirstColumn="0" w:lastRowLastColumn="0"/>
             <w:tcBorders/>
           </w:tcPr>
@@ -12104,7 +12176,7 @@
         </w:tc>
         <w:tc>
           <w:tcPr>
-            <w:tcW w:w="5400" w:type="dxa"/>
+            <w:tcW w:w="5401" w:type="dxa"/>
             <w:tcBorders/>
           </w:tcPr>
           <w:p>
@@ -12138,7 +12210,7 @@
         </w:trPr>
         <w:tc>
           <w:tcPr>
-            <w:tcW w:w="1523" w:type="dxa"/>
+            <w:tcW w:w="1522" w:type="dxa"/>
             <w:cnfStyle w:val="001000000000" w:firstRow="0" w:lastRow="0" w:firstColumn="1" w:lastColumn="0" w:oddVBand="0" w:evenVBand="0" w:oddHBand="0" w:evenHBand="0" w:firstRowFirstColumn="0" w:firstRowLastColumn="0" w:lastRowFirstColumn="0" w:lastRowLastColumn="0"/>
             <w:tcBorders/>
             <w:shd w:color="auto" w:fill="CCCCCC" w:themeFill="text1" w:themeFillTint="33" w:val="clear"/>
@@ -12200,7 +12272,7 @@
         </w:tc>
         <w:tc>
           <w:tcPr>
-            <w:tcW w:w="5400" w:type="dxa"/>
+            <w:tcW w:w="5401" w:type="dxa"/>
             <w:tcBorders/>
             <w:shd w:color="auto" w:fill="CCCCCC" w:themeFill="text1" w:themeFillTint="33" w:val="clear"/>
           </w:tcPr>
@@ -12233,7 +12305,7 @@
         <w:trPr/>
         <w:tc>
           <w:tcPr>
-            <w:tcW w:w="1523" w:type="dxa"/>
+            <w:tcW w:w="1522" w:type="dxa"/>
             <w:cnfStyle w:val="001000000000" w:firstRow="0" w:lastRow="0" w:firstColumn="1" w:lastColumn="0" w:oddVBand="0" w:evenVBand="0" w:oddHBand="0" w:evenHBand="0" w:firstRowFirstColumn="0" w:firstRowLastColumn="0" w:lastRowFirstColumn="0" w:lastRowLastColumn="0"/>
             <w:tcBorders/>
           </w:tcPr>
@@ -12294,7 +12366,7 @@
         </w:tc>
         <w:tc>
           <w:tcPr>
-            <w:tcW w:w="5400" w:type="dxa"/>
+            <w:tcW w:w="5401" w:type="dxa"/>
             <w:tcBorders/>
           </w:tcPr>
           <w:p>
@@ -12328,7 +12400,7 @@
         </w:trPr>
         <w:tc>
           <w:tcPr>
-            <w:tcW w:w="1523" w:type="dxa"/>
+            <w:tcW w:w="1522" w:type="dxa"/>
             <w:cnfStyle w:val="001000000000" w:firstRow="0" w:lastRow="0" w:firstColumn="1" w:lastColumn="0" w:oddVBand="0" w:evenVBand="0" w:oddHBand="0" w:evenHBand="0" w:firstRowFirstColumn="0" w:firstRowLastColumn="0" w:lastRowFirstColumn="0" w:lastRowLastColumn="0"/>
             <w:tcBorders/>
             <w:shd w:color="auto" w:fill="CCCCCC" w:themeFill="text1" w:themeFillTint="33" w:val="clear"/>
@@ -12390,7 +12462,7 @@
         </w:tc>
         <w:tc>
           <w:tcPr>
-            <w:tcW w:w="5400" w:type="dxa"/>
+            <w:tcW w:w="5401" w:type="dxa"/>
             <w:tcBorders/>
             <w:shd w:color="auto" w:fill="CCCCCC" w:themeFill="text1" w:themeFillTint="33" w:val="clear"/>
           </w:tcPr>
@@ -12423,7 +12495,7 @@
         <w:trPr/>
         <w:tc>
           <w:tcPr>
-            <w:tcW w:w="1523" w:type="dxa"/>
+            <w:tcW w:w="1522" w:type="dxa"/>
             <w:cnfStyle w:val="001000000000" w:firstRow="0" w:lastRow="0" w:firstColumn="1" w:lastColumn="0" w:oddVBand="0" w:evenVBand="0" w:oddHBand="0" w:evenHBand="0" w:firstRowFirstColumn="0" w:firstRowLastColumn="0" w:lastRowFirstColumn="0" w:lastRowLastColumn="0"/>
             <w:tcBorders/>
           </w:tcPr>
@@ -12483,7 +12555,7 @@
         </w:tc>
         <w:tc>
           <w:tcPr>
-            <w:tcW w:w="5400" w:type="dxa"/>
+            <w:tcW w:w="5401" w:type="dxa"/>
             <w:tcBorders/>
           </w:tcPr>
           <w:p>
@@ -12517,7 +12589,7 @@
         </w:trPr>
         <w:tc>
           <w:tcPr>
-            <w:tcW w:w="1523" w:type="dxa"/>
+            <w:tcW w:w="1522" w:type="dxa"/>
             <w:cnfStyle w:val="001000000000" w:firstRow="0" w:lastRow="0" w:firstColumn="1" w:lastColumn="0" w:oddVBand="0" w:evenVBand="0" w:oddHBand="0" w:evenHBand="0" w:firstRowFirstColumn="0" w:firstRowLastColumn="0" w:lastRowFirstColumn="0" w:lastRowLastColumn="0"/>
             <w:tcBorders/>
             <w:shd w:color="auto" w:fill="CCCCCC" w:themeFill="text1" w:themeFillTint="33" w:val="clear"/>
@@ -12579,7 +12651,7 @@
         </w:tc>
         <w:tc>
           <w:tcPr>
-            <w:tcW w:w="5400" w:type="dxa"/>
+            <w:tcW w:w="5401" w:type="dxa"/>
             <w:tcBorders/>
             <w:shd w:color="auto" w:fill="CCCCCC" w:themeFill="text1" w:themeFillTint="33" w:val="clear"/>
           </w:tcPr>
@@ -13287,11 +13359,8 @@
             </w:pPr>
             <w:r>
               <w:rPr>
-                <w:rFonts w:eastAsia="Noto Serif CJK SC" w:cs="Noto Sans Devanagari"/>
-                <w:kern w:val="2"/>
-                <w:sz w:val="22"/>
-                <w:szCs w:val="22"/>
-                <w:lang w:val="en-GB" w:eastAsia="zh-CN" w:bidi="hi-IN"/>
+                <w:sz w:val="22"/>
+                <w:szCs w:val="22"/>
               </w:rPr>
             </w:r>
           </w:p>
@@ -13532,11 +13601,8 @@
             </w:pPr>
             <w:r>
               <w:rPr>
-                <w:rFonts w:eastAsia="Noto Serif CJK SC" w:cs="Noto Sans Devanagari"/>
-                <w:kern w:val="2"/>
-                <w:sz w:val="22"/>
-                <w:szCs w:val="22"/>
-                <w:lang w:val="en-GB" w:eastAsia="zh-CN" w:bidi="hi-IN"/>
+                <w:sz w:val="22"/>
+                <w:szCs w:val="22"/>
               </w:rPr>
             </w:r>
           </w:p>
@@ -14231,11 +14297,11 @@
             <wp:effectExtent l="0" t="0" r="0" b="0"/>
             <wp:wrapTight wrapText="bothSides">
               <wp:wrapPolygon edited="0">
-                <wp:start x="-3" y="0"/>
-                <wp:lineTo x="-3" y="21541"/>
-                <wp:lineTo x="21528" y="21541"/>
-                <wp:lineTo x="21528" y="0"/>
-                <wp:lineTo x="-3" y="0"/>
+                <wp:start x="-7" y="0"/>
+                <wp:lineTo x="-7" y="21536"/>
+                <wp:lineTo x="21524" y="21536"/>
+                <wp:lineTo x="21524" y="0"/>
+                <wp:lineTo x="-7" y="0"/>
               </wp:wrapPolygon>
             </wp:wrapTight>
             <wp:docPr id="14" name="Picture 23" descr="" title=""/>
@@ -14275,7 +14341,7 @@
         <mc:AlternateContent>
           <mc:Choice Requires="wps">
             <w:drawing>
-              <wp:anchor behindDoc="0" distT="635" distB="0" distL="114300" distR="113030" simplePos="0" locked="0" layoutInCell="0" allowOverlap="1" relativeHeight="24" wp14:anchorId="071E8BA3">
+              <wp:anchor behindDoc="0" distT="635" distB="280670" distL="114300" distR="111760" simplePos="0" locked="0" layoutInCell="0" allowOverlap="1" relativeHeight="24" wp14:anchorId="071E8BA3">
                 <wp:simplePos x="0" y="0"/>
                 <wp:positionH relativeFrom="column">
                   <wp:posOffset>2502535</wp:posOffset>
@@ -14334,31 +14400,45 @@
                               </w:rPr>
                             </w:pPr>
                             <w:r>
-                              <w:rPr/>
+                              <w:rPr>
+                                <w:color w:val="000000"/>
+                              </w:rPr>
                               <w:t xml:space="preserve">Figure </w:t>
                             </w:r>
                             <w:r>
-                              <w:rPr/>
+                              <w:rPr>
+                                <w:color w:val="000000"/>
+                              </w:rPr>
                               <w:fldChar w:fldCharType="begin"/>
                             </w:r>
                             <w:r>
-                              <w:rPr/>
+                              <w:rPr>
+                                <w:color w:val="000000"/>
+                              </w:rPr>
                               <w:instrText xml:space="preserve"> SEQ Figure \* ARABIC </w:instrText>
                             </w:r>
                             <w:r>
-                              <w:rPr/>
+                              <w:rPr>
+                                <w:color w:val="000000"/>
+                              </w:rPr>
                               <w:fldChar w:fldCharType="separate"/>
                             </w:r>
                             <w:r>
-                              <w:rPr/>
+                              <w:rPr>
+                                <w:color w:val="000000"/>
+                              </w:rPr>
                               <w:t>12</w:t>
                             </w:r>
                             <w:r>
-                              <w:rPr/>
+                              <w:rPr>
+                                <w:color w:val="000000"/>
+                              </w:rPr>
                               <w:fldChar w:fldCharType="end"/>
                             </w:r>
                             <w:r>
-                              <w:rPr/>
+                              <w:rPr>
+                                <w:color w:val="000000"/>
+                              </w:rPr>
                               <w:t xml:space="preserve"> Neural network architecture</w:t>
                             </w:r>
                           </w:p>
@@ -14393,31 +14473,45 @@
                         </w:rPr>
                       </w:pPr>
                       <w:r>
-                        <w:rPr/>
+                        <w:rPr>
+                          <w:color w:val="000000"/>
+                        </w:rPr>
                         <w:t xml:space="preserve">Figure </w:t>
                       </w:r>
                       <w:r>
-                        <w:rPr/>
+                        <w:rPr>
+                          <w:color w:val="000000"/>
+                        </w:rPr>
                         <w:fldChar w:fldCharType="begin"/>
                       </w:r>
                       <w:r>
-                        <w:rPr/>
+                        <w:rPr>
+                          <w:color w:val="000000"/>
+                        </w:rPr>
                         <w:instrText xml:space="preserve"> SEQ Figure \* ARABIC </w:instrText>
                       </w:r>
                       <w:r>
-                        <w:rPr/>
+                        <w:rPr>
+                          <w:color w:val="000000"/>
+                        </w:rPr>
                         <w:fldChar w:fldCharType="separate"/>
                       </w:r>
                       <w:r>
-                        <w:rPr/>
+                        <w:rPr>
+                          <w:color w:val="000000"/>
+                        </w:rPr>
                         <w:t>12</w:t>
                       </w:r>
                       <w:r>
-                        <w:rPr/>
+                        <w:rPr>
+                          <w:color w:val="000000"/>
+                        </w:rPr>
                         <w:fldChar w:fldCharType="end"/>
                       </w:r>
                       <w:r>
-                        <w:rPr/>
+                        <w:rPr>
+                          <w:color w:val="000000"/>
+                        </w:rPr>
                         <w:t xml:space="preserve"> Neural network architecture</w:t>
                       </w:r>
                     </w:p>
@@ -15757,8 +15851,8 @@
         <w:tblLook w:val="04a0" w:noHBand="0" w:noVBand="1" w:firstColumn="1" w:lastRow="0" w:lastColumn="0" w:firstRow="1"/>
       </w:tblPr>
       <w:tblGrid>
-        <w:gridCol w:w="1695"/>
-        <w:gridCol w:w="1276"/>
+        <w:gridCol w:w="1694"/>
+        <w:gridCol w:w="1277"/>
         <w:gridCol w:w="1277"/>
       </w:tblGrid>
       <w:tr>
@@ -15767,7 +15861,7 @@
         </w:trPr>
         <w:tc>
           <w:tcPr>
-            <w:tcW w:w="1695" w:type="dxa"/>
+            <w:tcW w:w="1694" w:type="dxa"/>
             <w:cnfStyle w:val="001000000000" w:firstRow="0" w:lastRow="0" w:firstColumn="1" w:lastColumn="0" w:oddVBand="0" w:evenVBand="0" w:oddHBand="0" w:evenHBand="0" w:firstRowFirstColumn="0" w:firstRowLastColumn="0" w:lastRowFirstColumn="0" w:lastRowLastColumn="0"/>
             <w:tcBorders>
               <w:top w:val="single" w:sz="4" w:space="0" w:color="000000"/>
@@ -15807,51 +15901,6 @@
                 <w:lang w:val="en-GB" w:eastAsia="zh-CN" w:bidi="hi-IN"/>
               </w:rPr>
               <w:t>Metric</w:t>
-            </w:r>
-          </w:p>
-        </w:tc>
-        <w:tc>
-          <w:tcPr>
-            <w:tcW w:w="1276" w:type="dxa"/>
-            <w:tcBorders>
-              <w:top w:val="single" w:sz="4" w:space="0" w:color="000000"/>
-              <w:start w:val="single" w:sz="4" w:space="0" w:color="000000"/>
-              <w:bottom w:val="single" w:sz="4" w:space="0" w:color="000000"/>
-              <w:end w:val="single" w:sz="4" w:space="0" w:color="000000"/>
-            </w:tcBorders>
-            <w:shd w:color="auto" w:fill="000000" w:themeFill="text1" w:val="clear"/>
-          </w:tcPr>
-          <w:p>
-            <w:pPr>
-              <w:pStyle w:val="Normal"/>
-              <w:widowControl/>
-              <w:suppressAutoHyphens w:val="true"/>
-              <w:spacing w:before="0" w:after="0"/>
-              <w:jc w:val="center"/>
-              <w:cnfStyle w:val="100000000000" w:firstRow="1" w:lastRow="0" w:firstColumn="0" w:lastColumn="0" w:oddVBand="0" w:evenVBand="0" w:oddHBand="0" w:evenHBand="0" w:firstRowFirstColumn="0" w:firstRowLastColumn="0" w:lastRowFirstColumn="0" w:lastRowLastColumn="0"/>
-              <w:rPr>
-                <w:rFonts w:eastAsia="Noto Serif CJK SC" w:cs="Noto Sans Devanagari"/>
-                <w:b/>
-                <w:bCs/>
-                <w:color w:themeColor="background1" w:val="FFFFFF"/>
-                <w:kern w:val="2"/>
-                <w:sz w:val="24"/>
-                <w:szCs w:val="24"/>
-                <w:lang w:val="en-GB" w:eastAsia="zh-CN" w:bidi="hi-IN"/>
-              </w:rPr>
-            </w:pPr>
-            <w:r>
-              <w:rPr>
-                <w:rFonts w:eastAsia="Noto Serif CJK SC" w:cs="Noto Sans Devanagari"/>
-                <w:b/>
-                <w:bCs/>
-                <w:color w:themeColor="background1" w:val="FFFFFF"/>
-                <w:kern w:val="2"/>
-                <w:sz w:val="24"/>
-                <w:szCs w:val="24"/>
-                <w:lang w:val="en-GB" w:eastAsia="zh-CN" w:bidi="hi-IN"/>
-              </w:rPr>
-              <w:t>Score</w:t>
             </w:r>
           </w:p>
         </w:tc>
@@ -15896,6 +15945,51 @@
                 <w:szCs w:val="24"/>
                 <w:lang w:val="en-GB" w:eastAsia="zh-CN" w:bidi="hi-IN"/>
               </w:rPr>
+              <w:t>Score</w:t>
+            </w:r>
+          </w:p>
+        </w:tc>
+        <w:tc>
+          <w:tcPr>
+            <w:tcW w:w="1277" w:type="dxa"/>
+            <w:tcBorders>
+              <w:top w:val="single" w:sz="4" w:space="0" w:color="000000"/>
+              <w:start w:val="single" w:sz="4" w:space="0" w:color="000000"/>
+              <w:bottom w:val="single" w:sz="4" w:space="0" w:color="000000"/>
+              <w:end w:val="single" w:sz="4" w:space="0" w:color="000000"/>
+            </w:tcBorders>
+            <w:shd w:color="auto" w:fill="000000" w:themeFill="text1" w:val="clear"/>
+          </w:tcPr>
+          <w:p>
+            <w:pPr>
+              <w:pStyle w:val="Normal"/>
+              <w:widowControl/>
+              <w:suppressAutoHyphens w:val="true"/>
+              <w:spacing w:before="0" w:after="0"/>
+              <w:jc w:val="center"/>
+              <w:cnfStyle w:val="100000000000" w:firstRow="1" w:lastRow="0" w:firstColumn="0" w:lastColumn="0" w:oddVBand="0" w:evenVBand="0" w:oddHBand="0" w:evenHBand="0" w:firstRowFirstColumn="0" w:firstRowLastColumn="0" w:lastRowFirstColumn="0" w:lastRowLastColumn="0"/>
+              <w:rPr>
+                <w:rFonts w:eastAsia="Noto Serif CJK SC" w:cs="Noto Sans Devanagari"/>
+                <w:b/>
+                <w:bCs/>
+                <w:color w:themeColor="background1" w:val="FFFFFF"/>
+                <w:kern w:val="2"/>
+                <w:sz w:val="24"/>
+                <w:szCs w:val="24"/>
+                <w:lang w:val="en-GB" w:eastAsia="zh-CN" w:bidi="hi-IN"/>
+              </w:rPr>
+            </w:pPr>
+            <w:r>
+              <w:rPr>
+                <w:rFonts w:eastAsia="Noto Serif CJK SC" w:cs="Noto Sans Devanagari"/>
+                <w:b/>
+                <w:bCs/>
+                <w:color w:themeColor="background1" w:val="FFFFFF"/>
+                <w:kern w:val="2"/>
+                <w:sz w:val="24"/>
+                <w:szCs w:val="24"/>
+                <w:lang w:val="en-GB" w:eastAsia="zh-CN" w:bidi="hi-IN"/>
+              </w:rPr>
               <w:t>%</w:t>
             </w:r>
           </w:p>
@@ -15907,7 +16001,7 @@
         </w:trPr>
         <w:tc>
           <w:tcPr>
-            <w:tcW w:w="1695" w:type="dxa"/>
+            <w:tcW w:w="1694" w:type="dxa"/>
             <w:cnfStyle w:val="001000000000" w:firstRow="0" w:lastRow="0" w:firstColumn="1" w:lastColumn="0" w:oddVBand="0" w:evenVBand="0" w:oddHBand="0" w:evenHBand="0" w:firstRowFirstColumn="0" w:firstRowLastColumn="0" w:lastRowFirstColumn="0" w:lastRowLastColumn="0"/>
             <w:tcBorders/>
             <w:shd w:color="auto" w:fill="CCCCCC" w:themeFill="text1" w:themeFillTint="33" w:val="clear"/>
@@ -15940,40 +16034,6 @@
                 <w:lang w:val="en-GB" w:eastAsia="zh-CN" w:bidi="hi-IN"/>
               </w:rPr>
               <w:t>Accuracy</w:t>
-            </w:r>
-          </w:p>
-        </w:tc>
-        <w:tc>
-          <w:tcPr>
-            <w:tcW w:w="1276" w:type="dxa"/>
-            <w:tcBorders/>
-            <w:shd w:color="auto" w:fill="CCCCCC" w:themeFill="text1" w:themeFillTint="33" w:val="clear"/>
-          </w:tcPr>
-          <w:p>
-            <w:pPr>
-              <w:pStyle w:val="Normal"/>
-              <w:widowControl/>
-              <w:suppressAutoHyphens w:val="true"/>
-              <w:spacing w:before="0" w:after="0"/>
-              <w:jc w:val="center"/>
-              <w:cnfStyle w:val="000000100000" w:firstRow="0" w:lastRow="0" w:firstColumn="0" w:lastColumn="0" w:oddVBand="0" w:evenVBand="0" w:oddHBand="1" w:evenHBand="0" w:firstRowFirstColumn="0" w:firstRowLastColumn="0" w:lastRowFirstColumn="0" w:lastRowLastColumn="0"/>
-              <w:rPr>
-                <w:rFonts w:eastAsia="Noto Serif CJK SC" w:cs="Noto Sans Devanagari"/>
-                <w:kern w:val="2"/>
-                <w:sz w:val="24"/>
-                <w:szCs w:val="24"/>
-                <w:lang w:val="en-GB" w:eastAsia="zh-CN" w:bidi="hi-IN"/>
-              </w:rPr>
-            </w:pPr>
-            <w:r>
-              <w:rPr>
-                <w:rFonts w:eastAsia="Noto Serif CJK SC" w:cs="Noto Sans Devanagari"/>
-                <w:kern w:val="2"/>
-                <w:sz w:val="24"/>
-                <w:szCs w:val="24"/>
-                <w:lang w:val="en-GB" w:eastAsia="zh-CN" w:bidi="hi-IN"/>
-              </w:rPr>
-              <w:t>0.8858</w:t>
             </w:r>
           </w:p>
         </w:tc>
@@ -16007,6 +16067,40 @@
                 <w:szCs w:val="24"/>
                 <w:lang w:val="en-GB" w:eastAsia="zh-CN" w:bidi="hi-IN"/>
               </w:rPr>
+              <w:t>0.8858</w:t>
+            </w:r>
+          </w:p>
+        </w:tc>
+        <w:tc>
+          <w:tcPr>
+            <w:tcW w:w="1277" w:type="dxa"/>
+            <w:tcBorders/>
+            <w:shd w:color="auto" w:fill="CCCCCC" w:themeFill="text1" w:themeFillTint="33" w:val="clear"/>
+          </w:tcPr>
+          <w:p>
+            <w:pPr>
+              <w:pStyle w:val="Normal"/>
+              <w:widowControl/>
+              <w:suppressAutoHyphens w:val="true"/>
+              <w:spacing w:before="0" w:after="0"/>
+              <w:jc w:val="center"/>
+              <w:cnfStyle w:val="000000100000" w:firstRow="0" w:lastRow="0" w:firstColumn="0" w:lastColumn="0" w:oddVBand="0" w:evenVBand="0" w:oddHBand="1" w:evenHBand="0" w:firstRowFirstColumn="0" w:firstRowLastColumn="0" w:lastRowFirstColumn="0" w:lastRowLastColumn="0"/>
+              <w:rPr>
+                <w:rFonts w:eastAsia="Noto Serif CJK SC" w:cs="Noto Sans Devanagari"/>
+                <w:kern w:val="2"/>
+                <w:sz w:val="24"/>
+                <w:szCs w:val="24"/>
+                <w:lang w:val="en-GB" w:eastAsia="zh-CN" w:bidi="hi-IN"/>
+              </w:rPr>
+            </w:pPr>
+            <w:r>
+              <w:rPr>
+                <w:rFonts w:eastAsia="Noto Serif CJK SC" w:cs="Noto Sans Devanagari"/>
+                <w:kern w:val="2"/>
+                <w:sz w:val="24"/>
+                <w:szCs w:val="24"/>
+                <w:lang w:val="en-GB" w:eastAsia="zh-CN" w:bidi="hi-IN"/>
+              </w:rPr>
               <w:t>88.6%</w:t>
             </w:r>
           </w:p>
@@ -16016,7 +16110,7 @@
         <w:trPr/>
         <w:tc>
           <w:tcPr>
-            <w:tcW w:w="1695" w:type="dxa"/>
+            <w:tcW w:w="1694" w:type="dxa"/>
             <w:cnfStyle w:val="001000000000" w:firstRow="0" w:lastRow="0" w:firstColumn="1" w:lastColumn="0" w:oddVBand="0" w:evenVBand="0" w:oddHBand="0" w:evenHBand="0" w:firstRowFirstColumn="0" w:firstRowLastColumn="0" w:lastRowFirstColumn="0" w:lastRowLastColumn="0"/>
             <w:tcBorders/>
           </w:tcPr>
@@ -16053,7 +16147,7 @@
         </w:tc>
         <w:tc>
           <w:tcPr>
-            <w:tcW w:w="1276" w:type="dxa"/>
+            <w:tcW w:w="1277" w:type="dxa"/>
             <w:tcBorders/>
           </w:tcPr>
           <w:p>
@@ -16124,7 +16218,7 @@
         </w:trPr>
         <w:tc>
           <w:tcPr>
-            <w:tcW w:w="1695" w:type="dxa"/>
+            <w:tcW w:w="1694" w:type="dxa"/>
             <w:cnfStyle w:val="001000000000" w:firstRow="0" w:lastRow="0" w:firstColumn="1" w:lastColumn="0" w:oddVBand="0" w:evenVBand="0" w:oddHBand="0" w:evenHBand="0" w:firstRowFirstColumn="0" w:firstRowLastColumn="0" w:lastRowFirstColumn="0" w:lastRowLastColumn="0"/>
             <w:tcBorders/>
             <w:shd w:color="auto" w:fill="CCCCCC" w:themeFill="text1" w:themeFillTint="33" w:val="clear"/>
@@ -16157,40 +16251,6 @@
                 <w:lang w:val="en-GB" w:eastAsia="zh-CN" w:bidi="hi-IN"/>
               </w:rPr>
               <w:t>Recall</w:t>
-            </w:r>
-          </w:p>
-        </w:tc>
-        <w:tc>
-          <w:tcPr>
-            <w:tcW w:w="1276" w:type="dxa"/>
-            <w:tcBorders/>
-            <w:shd w:color="auto" w:fill="CCCCCC" w:themeFill="text1" w:themeFillTint="33" w:val="clear"/>
-          </w:tcPr>
-          <w:p>
-            <w:pPr>
-              <w:pStyle w:val="Normal"/>
-              <w:widowControl/>
-              <w:suppressAutoHyphens w:val="true"/>
-              <w:spacing w:before="0" w:after="0"/>
-              <w:jc w:val="center"/>
-              <w:cnfStyle w:val="000000100000" w:firstRow="0" w:lastRow="0" w:firstColumn="0" w:lastColumn="0" w:oddVBand="0" w:evenVBand="0" w:oddHBand="1" w:evenHBand="0" w:firstRowFirstColumn="0" w:firstRowLastColumn="0" w:lastRowFirstColumn="0" w:lastRowLastColumn="0"/>
-              <w:rPr>
-                <w:rFonts w:eastAsia="Noto Serif CJK SC" w:cs="Noto Sans Devanagari"/>
-                <w:kern w:val="2"/>
-                <w:sz w:val="24"/>
-                <w:szCs w:val="24"/>
-                <w:lang w:val="en-GB" w:eastAsia="zh-CN" w:bidi="hi-IN"/>
-              </w:rPr>
-            </w:pPr>
-            <w:r>
-              <w:rPr>
-                <w:rFonts w:eastAsia="Noto Serif CJK SC" w:cs="Noto Sans Devanagari"/>
-                <w:kern w:val="2"/>
-                <w:sz w:val="24"/>
-                <w:szCs w:val="24"/>
-                <w:lang w:val="en-GB" w:eastAsia="zh-CN" w:bidi="hi-IN"/>
-              </w:rPr>
-              <w:t>0.0548</w:t>
             </w:r>
           </w:p>
         </w:tc>
@@ -16224,6 +16284,40 @@
                 <w:szCs w:val="24"/>
                 <w:lang w:val="en-GB" w:eastAsia="zh-CN" w:bidi="hi-IN"/>
               </w:rPr>
+              <w:t>0.0548</w:t>
+            </w:r>
+          </w:p>
+        </w:tc>
+        <w:tc>
+          <w:tcPr>
+            <w:tcW w:w="1277" w:type="dxa"/>
+            <w:tcBorders/>
+            <w:shd w:color="auto" w:fill="CCCCCC" w:themeFill="text1" w:themeFillTint="33" w:val="clear"/>
+          </w:tcPr>
+          <w:p>
+            <w:pPr>
+              <w:pStyle w:val="Normal"/>
+              <w:widowControl/>
+              <w:suppressAutoHyphens w:val="true"/>
+              <w:spacing w:before="0" w:after="0"/>
+              <w:jc w:val="center"/>
+              <w:cnfStyle w:val="000000100000" w:firstRow="0" w:lastRow="0" w:firstColumn="0" w:lastColumn="0" w:oddVBand="0" w:evenVBand="0" w:oddHBand="1" w:evenHBand="0" w:firstRowFirstColumn="0" w:firstRowLastColumn="0" w:lastRowFirstColumn="0" w:lastRowLastColumn="0"/>
+              <w:rPr>
+                <w:rFonts w:eastAsia="Noto Serif CJK SC" w:cs="Noto Sans Devanagari"/>
+                <w:kern w:val="2"/>
+                <w:sz w:val="24"/>
+                <w:szCs w:val="24"/>
+                <w:lang w:val="en-GB" w:eastAsia="zh-CN" w:bidi="hi-IN"/>
+              </w:rPr>
+            </w:pPr>
+            <w:r>
+              <w:rPr>
+                <w:rFonts w:eastAsia="Noto Serif CJK SC" w:cs="Noto Sans Devanagari"/>
+                <w:kern w:val="2"/>
+                <w:sz w:val="24"/>
+                <w:szCs w:val="24"/>
+                <w:lang w:val="en-GB" w:eastAsia="zh-CN" w:bidi="hi-IN"/>
+              </w:rPr>
               <w:t>5.5%</w:t>
             </w:r>
           </w:p>
@@ -16233,7 +16327,7 @@
         <w:trPr/>
         <w:tc>
           <w:tcPr>
-            <w:tcW w:w="1695" w:type="dxa"/>
+            <w:tcW w:w="1694" w:type="dxa"/>
             <w:cnfStyle w:val="001000000000" w:firstRow="0" w:lastRow="0" w:firstColumn="1" w:lastColumn="0" w:oddVBand="0" w:evenVBand="0" w:oddHBand="0" w:evenHBand="0" w:firstRowFirstColumn="0" w:firstRowLastColumn="0" w:lastRowFirstColumn="0" w:lastRowLastColumn="0"/>
             <w:tcBorders/>
           </w:tcPr>
@@ -16270,7 +16364,7 @@
         </w:tc>
         <w:tc>
           <w:tcPr>
-            <w:tcW w:w="1276" w:type="dxa"/>
+            <w:tcW w:w="1277" w:type="dxa"/>
             <w:tcBorders/>
           </w:tcPr>
           <w:p>
@@ -16666,11 +16760,8 @@
             </w:pPr>
             <w:r>
               <w:rPr>
-                <w:rFonts w:eastAsia="Noto Serif CJK SC" w:cs="Noto Sans Devanagari"/>
-                <w:kern w:val="2"/>
-                <w:sz w:val="22"/>
-                <w:szCs w:val="22"/>
-                <w:lang w:val="en-GB" w:eastAsia="zh-CN" w:bidi="hi-IN"/>
+                <w:sz w:val="22"/>
+                <w:szCs w:val="22"/>
               </w:rPr>
             </w:r>
           </w:p>
@@ -16689,11 +16780,7 @@
               </w:rPr>
             </w:pPr>
             <w:r>
-              <w:rPr>
-                <w:rFonts w:eastAsia="Noto Serif CJK SC"/>
-                <w:kern w:val="2"/>
-                <w:lang w:val="en-GB" w:eastAsia="zh-CN" w:bidi="hi-IN"/>
-              </w:rPr>
+              <w:rPr/>
             </w:r>
             <m:oMathPara xmlns:m="http://schemas.openxmlformats.org/officeDocument/2006/math">
               <m:oMathParaPr>
@@ -16754,11 +16841,9 @@
             </w:pPr>
             <w:r>
               <w:rPr>
-                <w:rFonts w:eastAsia="Noto Serif CJK SC" w:cs="Arial" w:cstheme="majorHAnsi" w:ascii="Arial" w:hAnsi="Arial"/>
-                <w:kern w:val="2"/>
-                <w:sz w:val="22"/>
-                <w:szCs w:val="22"/>
-                <w:lang w:val="en-GB" w:eastAsia="zh-CN" w:bidi="hi-IN"/>
+                <w:rFonts w:cs="Arial" w:cstheme="majorHAnsi" w:ascii="Arial" w:hAnsi="Arial"/>
+                <w:sz w:val="22"/>
+                <w:szCs w:val="22"/>
               </w:rPr>
             </w:r>
           </w:p>
@@ -16912,13 +16997,7 @@
               <w:br/>
             </w:r>
             <w:r>
-              <w:rPr>
-                <w:rFonts w:eastAsia="Noto Serif CJK SC" w:cs="Noto Sans Devanagari"/>
-                <w:kern w:val="2"/>
-                <w:sz w:val="24"/>
-                <w:szCs w:val="24"/>
-                <w:lang w:val="en-GB" w:eastAsia="zh-CN" w:bidi="hi-IN"/>
-              </w:rPr>
+              <w:rPr/>
             </w:r>
             <m:oMath xmlns:m="http://schemas.openxmlformats.org/officeDocument/2006/math">
               <m:f>
@@ -16958,11 +17037,8 @@
             </w:pPr>
             <w:r>
               <w:rPr>
-                <w:rFonts w:eastAsia="Noto Serif CJK SC" w:cs="Noto Sans Devanagari"/>
-                <w:kern w:val="2"/>
-                <w:sz w:val="22"/>
-                <w:szCs w:val="22"/>
-                <w:lang w:val="en-GB" w:eastAsia="zh-CN" w:bidi="hi-IN"/>
+                <w:sz w:val="22"/>
+                <w:szCs w:val="22"/>
               </w:rPr>
             </w:r>
           </w:p>
@@ -17117,11 +17193,7 @@
               </w:rPr>
             </w:pPr>
             <w:r>
-              <w:rPr>
-                <w:rFonts w:eastAsia="Noto Serif CJK SC" w:cs="Noto Sans Devanagari"/>
-                <w:kern w:val="2"/>
-                <w:lang w:val="en-GB" w:eastAsia="zh-CN" w:bidi="hi-IN"/>
-              </w:rPr>
+              <w:rPr/>
             </w:r>
             <m:oMathPara xmlns:m="http://schemas.openxmlformats.org/officeDocument/2006/math">
               <m:oMathParaPr>
@@ -17311,11 +17383,7 @@
               </w:rPr>
             </w:pPr>
             <w:r>
-              <w:rPr>
-                <w:rFonts w:eastAsia="Noto Serif CJK SC" w:cs="Noto Sans Devanagari"/>
-                <w:kern w:val="2"/>
-                <w:lang w:val="en-GB" w:eastAsia="zh-CN" w:bidi="hi-IN"/>
-              </w:rPr>
+              <w:rPr/>
             </w:r>
             <m:oMathPara xmlns:m="http://schemas.openxmlformats.org/officeDocument/2006/math">
               <m:oMathParaPr>
@@ -17369,11 +17437,8 @@
             </w:pPr>
             <w:r>
               <w:rPr>
-                <w:rFonts w:eastAsia="Noto Serif CJK SC" w:cs="Noto Sans Devanagari"/>
-                <w:kern w:val="2"/>
-                <w:sz w:val="22"/>
-                <w:szCs w:val="22"/>
-                <w:lang w:val="en-GB" w:eastAsia="zh-CN" w:bidi="hi-IN"/>
+                <w:sz w:val="22"/>
+                <w:szCs w:val="22"/>
               </w:rPr>
             </w:r>
           </w:p>
@@ -17743,9 +17808,9 @@
         <w:tblLook w:val="04a0" w:noHBand="0" w:noVBand="1" w:firstColumn="1" w:lastRow="0" w:lastColumn="0" w:firstRow="1"/>
       </w:tblPr>
       <w:tblGrid>
-        <w:gridCol w:w="1837"/>
+        <w:gridCol w:w="1836"/>
         <w:gridCol w:w="1418"/>
-        <w:gridCol w:w="1419"/>
+        <w:gridCol w:w="1420"/>
       </w:tblGrid>
       <w:tr>
         <w:trPr>
@@ -17753,7 +17818,7 @@
         </w:trPr>
         <w:tc>
           <w:tcPr>
-            <w:tcW w:w="1837" w:type="dxa"/>
+            <w:tcW w:w="1836" w:type="dxa"/>
             <w:cnfStyle w:val="001000000000" w:firstRow="0" w:lastRow="0" w:firstColumn="1" w:lastColumn="0" w:oddVBand="0" w:evenVBand="0" w:oddHBand="0" w:evenHBand="0" w:firstRowFirstColumn="0" w:firstRowLastColumn="0" w:lastRowFirstColumn="0" w:lastRowLastColumn="0"/>
             <w:tcBorders>
               <w:top w:val="single" w:sz="4" w:space="0" w:color="000000"/>
@@ -17842,7 +17907,7 @@
         </w:tc>
         <w:tc>
           <w:tcPr>
-            <w:tcW w:w="1419" w:type="dxa"/>
+            <w:tcW w:w="1420" w:type="dxa"/>
             <w:tcBorders>
               <w:top w:val="single" w:sz="4" w:space="0" w:color="000000"/>
               <w:start w:val="single" w:sz="4" w:space="0" w:color="000000"/>
@@ -17892,7 +17957,7 @@
         </w:trPr>
         <w:tc>
           <w:tcPr>
-            <w:tcW w:w="1837" w:type="dxa"/>
+            <w:tcW w:w="1836" w:type="dxa"/>
             <w:cnfStyle w:val="001000000000" w:firstRow="0" w:lastRow="0" w:firstColumn="1" w:lastColumn="0" w:oddVBand="0" w:evenVBand="0" w:oddHBand="0" w:evenHBand="0" w:firstRowFirstColumn="0" w:firstRowLastColumn="0" w:lastRowFirstColumn="0" w:lastRowLastColumn="0"/>
             <w:tcBorders/>
             <w:shd w:color="auto" w:fill="CCCCCC" w:themeFill="text1" w:themeFillTint="33" w:val="clear"/>
@@ -17963,7 +18028,7 @@
         </w:tc>
         <w:tc>
           <w:tcPr>
-            <w:tcW w:w="1419" w:type="dxa"/>
+            <w:tcW w:w="1420" w:type="dxa"/>
             <w:tcBorders/>
             <w:shd w:color="auto" w:fill="CCCCCC" w:themeFill="text1" w:themeFillTint="33" w:val="clear"/>
           </w:tcPr>
@@ -18000,7 +18065,7 @@
         <w:trPr/>
         <w:tc>
           <w:tcPr>
-            <w:tcW w:w="1837" w:type="dxa"/>
+            <w:tcW w:w="1836" w:type="dxa"/>
             <w:cnfStyle w:val="001000000000" w:firstRow="0" w:lastRow="0" w:firstColumn="1" w:lastColumn="0" w:oddVBand="0" w:evenVBand="0" w:oddHBand="0" w:evenHBand="0" w:firstRowFirstColumn="0" w:firstRowLastColumn="0" w:lastRowFirstColumn="0" w:lastRowLastColumn="0"/>
             <w:tcBorders/>
           </w:tcPr>
@@ -18069,7 +18134,7 @@
         </w:tc>
         <w:tc>
           <w:tcPr>
-            <w:tcW w:w="1419" w:type="dxa"/>
+            <w:tcW w:w="1420" w:type="dxa"/>
             <w:tcBorders/>
           </w:tcPr>
           <w:p>
@@ -18107,7 +18172,7 @@
         </w:trPr>
         <w:tc>
           <w:tcPr>
-            <w:tcW w:w="1837" w:type="dxa"/>
+            <w:tcW w:w="1836" w:type="dxa"/>
             <w:cnfStyle w:val="001000000000" w:firstRow="0" w:lastRow="0" w:firstColumn="1" w:lastColumn="0" w:oddVBand="0" w:evenVBand="0" w:oddHBand="0" w:evenHBand="0" w:firstRowFirstColumn="0" w:firstRowLastColumn="0" w:lastRowFirstColumn="0" w:lastRowLastColumn="0"/>
             <w:tcBorders/>
             <w:shd w:color="auto" w:fill="CCCCCC" w:themeFill="text1" w:themeFillTint="33" w:val="clear"/>
@@ -18178,7 +18243,7 @@
         </w:tc>
         <w:tc>
           <w:tcPr>
-            <w:tcW w:w="1419" w:type="dxa"/>
+            <w:tcW w:w="1420" w:type="dxa"/>
             <w:tcBorders/>
             <w:shd w:color="auto" w:fill="CCCCCC" w:themeFill="text1" w:themeFillTint="33" w:val="clear"/>
           </w:tcPr>
@@ -18215,7 +18280,7 @@
         <w:trPr/>
         <w:tc>
           <w:tcPr>
-            <w:tcW w:w="1837" w:type="dxa"/>
+            <w:tcW w:w="1836" w:type="dxa"/>
             <w:cnfStyle w:val="001000000000" w:firstRow="0" w:lastRow="0" w:firstColumn="1" w:lastColumn="0" w:oddVBand="0" w:evenVBand="0" w:oddHBand="0" w:evenHBand="0" w:firstRowFirstColumn="0" w:firstRowLastColumn="0" w:lastRowFirstColumn="0" w:lastRowLastColumn="0"/>
             <w:tcBorders/>
           </w:tcPr>
@@ -18284,7 +18349,7 @@
         </w:tc>
         <w:tc>
           <w:tcPr>
-            <w:tcW w:w="1419" w:type="dxa"/>
+            <w:tcW w:w="1420" w:type="dxa"/>
             <w:tcBorders/>
           </w:tcPr>
           <w:p>
@@ -19228,14 +19293,11 @@
             </w:pPr>
             <w:r>
               <w:rPr>
-                <w:rFonts w:eastAsia="Noto Serif CJK SC" w:cs="Noto Sans Devanagari"/>
                 <w:b w:val="false"/>
                 <w:bCs w:val="false"/>
-                <w:color w:themeColor="background1" w:val="FFFFFF"/>
-                <w:kern w:val="2"/>
-                <w:sz w:val="22"/>
-                <w:szCs w:val="22"/>
-                <w:lang w:val="en-GB" w:eastAsia="zh-CN" w:bidi="hi-IN"/>
+                <w:color w:themeColor="background1" w:val="auto"/>
+                <w:sz w:val="22"/>
+                <w:szCs w:val="22"/>
               </w:rPr>
             </w:r>
           </w:p>
@@ -21593,10 +21655,10 @@
         <w:tblLook w:val="04a0" w:noHBand="0" w:noVBand="1" w:firstColumn="1" w:lastRow="0" w:lastColumn="0" w:firstRow="1"/>
       </w:tblPr>
       <w:tblGrid>
-        <w:gridCol w:w="2691"/>
-        <w:gridCol w:w="1987"/>
-        <w:gridCol w:w="1844"/>
-        <w:gridCol w:w="1561"/>
+        <w:gridCol w:w="2690"/>
+        <w:gridCol w:w="1988"/>
+        <w:gridCol w:w="1843"/>
+        <w:gridCol w:w="1562"/>
         <w:gridCol w:w="1555"/>
       </w:tblGrid>
       <w:tr>
@@ -21605,7 +21667,7 @@
         </w:trPr>
         <w:tc>
           <w:tcPr>
-            <w:tcW w:w="2691" w:type="dxa"/>
+            <w:tcW w:w="2690" w:type="dxa"/>
             <w:cnfStyle w:val="001000000000" w:firstRow="0" w:lastRow="0" w:firstColumn="1" w:lastColumn="0" w:oddVBand="0" w:evenVBand="0" w:oddHBand="0" w:evenHBand="0" w:firstRowFirstColumn="0" w:firstRowLastColumn="0" w:lastRowFirstColumn="0" w:lastRowLastColumn="0"/>
             <w:tcBorders>
               <w:top w:val="single" w:sz="4" w:space="0" w:color="000000"/>
@@ -21627,21 +21689,18 @@
             </w:pPr>
             <w:r>
               <w:rPr>
-                <w:rFonts w:eastAsia="Noto Serif CJK SC" w:cs="Noto Sans Devanagari"/>
                 <w:b/>
                 <w:bCs/>
-                <w:color w:themeColor="background1" w:val="FFFFFF"/>
-                <w:kern w:val="2"/>
-                <w:sz w:val="22"/>
-                <w:szCs w:val="22"/>
-                <w:lang w:val="en-GB" w:eastAsia="zh-CN" w:bidi="hi-IN"/>
+                <w:color w:themeColor="background1" w:val="auto"/>
+                <w:sz w:val="22"/>
+                <w:szCs w:val="22"/>
               </w:rPr>
             </w:r>
           </w:p>
         </w:tc>
         <w:tc>
           <w:tcPr>
-            <w:tcW w:w="1987" w:type="dxa"/>
+            <w:tcW w:w="1988" w:type="dxa"/>
             <w:tcBorders>
               <w:top w:val="single" w:sz="4" w:space="0" w:color="000000"/>
               <w:start w:val="single" w:sz="4" w:space="0" w:color="000000"/>
@@ -21681,7 +21740,7 @@
         </w:tc>
         <w:tc>
           <w:tcPr>
-            <w:tcW w:w="1844" w:type="dxa"/>
+            <w:tcW w:w="1843" w:type="dxa"/>
             <w:tcBorders>
               <w:top w:val="single" w:sz="4" w:space="0" w:color="000000"/>
               <w:start w:val="single" w:sz="4" w:space="0" w:color="000000"/>
@@ -21721,7 +21780,7 @@
         </w:tc>
         <w:tc>
           <w:tcPr>
-            <w:tcW w:w="1561" w:type="dxa"/>
+            <w:tcW w:w="1562" w:type="dxa"/>
             <w:tcBorders>
               <w:top w:val="single" w:sz="4" w:space="0" w:color="000000"/>
               <w:start w:val="single" w:sz="4" w:space="0" w:color="000000"/>
@@ -21802,7 +21861,7 @@
         </w:trPr>
         <w:tc>
           <w:tcPr>
-            <w:tcW w:w="2691" w:type="dxa"/>
+            <w:tcW w:w="2690" w:type="dxa"/>
             <w:cnfStyle w:val="001000000000" w:firstRow="0" w:lastRow="0" w:firstColumn="1" w:lastColumn="0" w:oddVBand="0" w:evenVBand="0" w:oddHBand="0" w:evenHBand="0" w:firstRowFirstColumn="0" w:firstRowLastColumn="0" w:lastRowFirstColumn="0" w:lastRowLastColumn="0"/>
             <w:tcBorders/>
             <w:shd w:color="auto" w:fill="CCCCCC" w:themeFill="text1" w:themeFillTint="33" w:val="clear"/>
@@ -21835,7 +21894,7 @@
         </w:tc>
         <w:tc>
           <w:tcPr>
-            <w:tcW w:w="1987" w:type="dxa"/>
+            <w:tcW w:w="1988" w:type="dxa"/>
             <w:tcBorders/>
             <w:shd w:color="auto" w:fill="CCCCCC" w:themeFill="text1" w:themeFillTint="33" w:val="clear"/>
           </w:tcPr>
@@ -21865,7 +21924,7 @@
         </w:tc>
         <w:tc>
           <w:tcPr>
-            <w:tcW w:w="1844" w:type="dxa"/>
+            <w:tcW w:w="1843" w:type="dxa"/>
             <w:tcBorders/>
             <w:shd w:color="auto" w:fill="CCCCCC" w:themeFill="text1" w:themeFillTint="33" w:val="clear"/>
           </w:tcPr>
@@ -21895,7 +21954,7 @@
         </w:tc>
         <w:tc>
           <w:tcPr>
-            <w:tcW w:w="1561" w:type="dxa"/>
+            <w:tcW w:w="1562" w:type="dxa"/>
             <w:tcBorders/>
             <w:shd w:color="auto" w:fill="CCCCCC" w:themeFill="text1" w:themeFillTint="33" w:val="clear"/>
           </w:tcPr>
@@ -21958,7 +22017,7 @@
         <w:trPr/>
         <w:tc>
           <w:tcPr>
-            <w:tcW w:w="2691" w:type="dxa"/>
+            <w:tcW w:w="2690" w:type="dxa"/>
             <w:cnfStyle w:val="001000000000" w:firstRow="0" w:lastRow="0" w:firstColumn="1" w:lastColumn="0" w:oddVBand="0" w:evenVBand="0" w:oddHBand="0" w:evenHBand="0" w:firstRowFirstColumn="0" w:firstRowLastColumn="0" w:lastRowFirstColumn="0" w:lastRowLastColumn="0"/>
             <w:tcBorders/>
           </w:tcPr>
@@ -21990,7 +22049,7 @@
         </w:tc>
         <w:tc>
           <w:tcPr>
-            <w:tcW w:w="1987" w:type="dxa"/>
+            <w:tcW w:w="1988" w:type="dxa"/>
             <w:tcBorders/>
           </w:tcPr>
           <w:p>
@@ -22019,7 +22078,7 @@
         </w:tc>
         <w:tc>
           <w:tcPr>
-            <w:tcW w:w="1844" w:type="dxa"/>
+            <w:tcW w:w="1843" w:type="dxa"/>
             <w:tcBorders/>
           </w:tcPr>
           <w:p>
@@ -22048,7 +22107,7 @@
         </w:tc>
         <w:tc>
           <w:tcPr>
-            <w:tcW w:w="1561" w:type="dxa"/>
+            <w:tcW w:w="1562" w:type="dxa"/>
             <w:tcBorders/>
           </w:tcPr>
           <w:p>
@@ -22111,7 +22170,7 @@
         </w:trPr>
         <w:tc>
           <w:tcPr>
-            <w:tcW w:w="2691" w:type="dxa"/>
+            <w:tcW w:w="2690" w:type="dxa"/>
             <w:cnfStyle w:val="001000000000" w:firstRow="0" w:lastRow="0" w:firstColumn="1" w:lastColumn="0" w:oddVBand="0" w:evenVBand="0" w:oddHBand="0" w:evenHBand="0" w:firstRowFirstColumn="0" w:firstRowLastColumn="0" w:lastRowFirstColumn="0" w:lastRowLastColumn="0"/>
             <w:tcBorders/>
             <w:shd w:color="auto" w:fill="CCCCCC" w:themeFill="text1" w:themeFillTint="33" w:val="clear"/>
@@ -22144,7 +22203,7 @@
         </w:tc>
         <w:tc>
           <w:tcPr>
-            <w:tcW w:w="1987" w:type="dxa"/>
+            <w:tcW w:w="1988" w:type="dxa"/>
             <w:tcBorders/>
             <w:shd w:color="auto" w:fill="CCCCCC" w:themeFill="text1" w:themeFillTint="33" w:val="clear"/>
           </w:tcPr>
@@ -22174,7 +22233,7 @@
         </w:tc>
         <w:tc>
           <w:tcPr>
-            <w:tcW w:w="1844" w:type="dxa"/>
+            <w:tcW w:w="1843" w:type="dxa"/>
             <w:tcBorders/>
             <w:shd w:color="auto" w:fill="CCCCCC" w:themeFill="text1" w:themeFillTint="33" w:val="clear"/>
           </w:tcPr>
@@ -22204,7 +22263,7 @@
         </w:tc>
         <w:tc>
           <w:tcPr>
-            <w:tcW w:w="1561" w:type="dxa"/>
+            <w:tcW w:w="1562" w:type="dxa"/>
             <w:tcBorders/>
             <w:shd w:color="auto" w:fill="CCCCCC" w:themeFill="text1" w:themeFillTint="33" w:val="clear"/>
           </w:tcPr>
@@ -22267,7 +22326,7 @@
         <w:trPr/>
         <w:tc>
           <w:tcPr>
-            <w:tcW w:w="2691" w:type="dxa"/>
+            <w:tcW w:w="2690" w:type="dxa"/>
             <w:cnfStyle w:val="001000000000" w:firstRow="0" w:lastRow="0" w:firstColumn="1" w:lastColumn="0" w:oddVBand="0" w:evenVBand="0" w:oddHBand="0" w:evenHBand="0" w:firstRowFirstColumn="0" w:firstRowLastColumn="0" w:lastRowFirstColumn="0" w:lastRowLastColumn="0"/>
             <w:tcBorders/>
           </w:tcPr>
@@ -22299,7 +22358,7 @@
         </w:tc>
         <w:tc>
           <w:tcPr>
-            <w:tcW w:w="1987" w:type="dxa"/>
+            <w:tcW w:w="1988" w:type="dxa"/>
             <w:tcBorders/>
           </w:tcPr>
           <w:p>
@@ -22328,7 +22387,7 @@
         </w:tc>
         <w:tc>
           <w:tcPr>
-            <w:tcW w:w="1844" w:type="dxa"/>
+            <w:tcW w:w="1843" w:type="dxa"/>
             <w:tcBorders/>
           </w:tcPr>
           <w:p>
@@ -22357,7 +22416,7 @@
         </w:tc>
         <w:tc>
           <w:tcPr>
-            <w:tcW w:w="1561" w:type="dxa"/>
+            <w:tcW w:w="1562" w:type="dxa"/>
             <w:tcBorders/>
           </w:tcPr>
           <w:p>
@@ -22459,10 +22518,10 @@
         <w:tblLook w:val="04a0" w:noHBand="0" w:noVBand="1" w:firstColumn="1" w:lastRow="0" w:lastColumn="0" w:firstRow="1"/>
       </w:tblPr>
       <w:tblGrid>
-        <w:gridCol w:w="1926"/>
-        <w:gridCol w:w="1930"/>
         <w:gridCol w:w="1925"/>
-        <w:gridCol w:w="1930"/>
+        <w:gridCol w:w="1931"/>
+        <w:gridCol w:w="1924"/>
+        <w:gridCol w:w="1931"/>
         <w:gridCol w:w="1927"/>
       </w:tblGrid>
       <w:tr>
@@ -22471,7 +22530,7 @@
         </w:trPr>
         <w:tc>
           <w:tcPr>
-            <w:tcW w:w="1926" w:type="dxa"/>
+            <w:tcW w:w="1925" w:type="dxa"/>
             <w:cnfStyle w:val="001000000000" w:firstRow="0" w:lastRow="0" w:firstColumn="1" w:lastColumn="0" w:oddVBand="0" w:evenVBand="0" w:oddHBand="0" w:evenHBand="0" w:firstRowFirstColumn="0" w:firstRowLastColumn="0" w:lastRowFirstColumn="0" w:lastRowLastColumn="0"/>
             <w:tcBorders>
               <w:top w:val="single" w:sz="4" w:space="0" w:color="000000"/>
@@ -22511,7 +22570,7 @@
         </w:tc>
         <w:tc>
           <w:tcPr>
-            <w:tcW w:w="1930" w:type="dxa"/>
+            <w:tcW w:w="1931" w:type="dxa"/>
             <w:tcBorders>
               <w:top w:val="single" w:sz="4" w:space="0" w:color="000000"/>
               <w:start w:val="single" w:sz="4" w:space="0" w:color="000000"/>
@@ -22552,7 +22611,7 @@
         </w:tc>
         <w:tc>
           <w:tcPr>
-            <w:tcW w:w="1925" w:type="dxa"/>
+            <w:tcW w:w="1924" w:type="dxa"/>
             <w:tcBorders>
               <w:top w:val="single" w:sz="4" w:space="0" w:color="000000"/>
               <w:start w:val="single" w:sz="4" w:space="0" w:color="000000"/>
@@ -22593,7 +22652,7 @@
         </w:tc>
         <w:tc>
           <w:tcPr>
-            <w:tcW w:w="1930" w:type="dxa"/>
+            <w:tcW w:w="1931" w:type="dxa"/>
             <w:tcBorders>
               <w:top w:val="single" w:sz="4" w:space="0" w:color="000000"/>
               <w:start w:val="single" w:sz="4" w:space="0" w:color="000000"/>
@@ -22680,7 +22739,7 @@
         </w:trPr>
         <w:tc>
           <w:tcPr>
-            <w:tcW w:w="1926" w:type="dxa"/>
+            <w:tcW w:w="1925" w:type="dxa"/>
             <w:cnfStyle w:val="001000000000" w:firstRow="0" w:lastRow="0" w:firstColumn="1" w:lastColumn="0" w:oddVBand="0" w:evenVBand="0" w:oddHBand="0" w:evenHBand="0" w:firstRowFirstColumn="0" w:firstRowLastColumn="0" w:lastRowFirstColumn="0" w:lastRowLastColumn="0"/>
             <w:tcBorders/>
             <w:shd w:color="auto" w:fill="CCCCCC" w:themeFill="text1" w:themeFillTint="33" w:val="clear"/>
@@ -22712,7 +22771,7 @@
         </w:tc>
         <w:tc>
           <w:tcPr>
-            <w:tcW w:w="1930" w:type="dxa"/>
+            <w:tcW w:w="1931" w:type="dxa"/>
             <w:tcBorders/>
             <w:shd w:color="auto" w:fill="CCCCCC" w:themeFill="text1" w:themeFillTint="33" w:val="clear"/>
           </w:tcPr>
@@ -22743,7 +22802,7 @@
         </w:tc>
         <w:tc>
           <w:tcPr>
-            <w:tcW w:w="1925" w:type="dxa"/>
+            <w:tcW w:w="1924" w:type="dxa"/>
             <w:tcBorders/>
             <w:shd w:color="auto" w:fill="CCCCCC" w:themeFill="text1" w:themeFillTint="33" w:val="clear"/>
           </w:tcPr>
@@ -22774,7 +22833,7 @@
         </w:tc>
         <w:tc>
           <w:tcPr>
-            <w:tcW w:w="1930" w:type="dxa"/>
+            <w:tcW w:w="1931" w:type="dxa"/>
             <w:tcBorders/>
             <w:shd w:color="auto" w:fill="CCCCCC" w:themeFill="text1" w:themeFillTint="33" w:val="clear"/>
           </w:tcPr>
@@ -22851,7 +22910,7 @@
         <w:trPr/>
         <w:tc>
           <w:tcPr>
-            <w:tcW w:w="1926" w:type="dxa"/>
+            <w:tcW w:w="1925" w:type="dxa"/>
             <w:cnfStyle w:val="001000000000" w:firstRow="0" w:lastRow="0" w:firstColumn="1" w:lastColumn="0" w:oddVBand="0" w:evenVBand="0" w:oddHBand="0" w:evenHBand="0" w:firstRowFirstColumn="0" w:firstRowLastColumn="0" w:lastRowFirstColumn="0" w:lastRowLastColumn="0"/>
             <w:tcBorders/>
           </w:tcPr>
@@ -22882,7 +22941,7 @@
         </w:tc>
         <w:tc>
           <w:tcPr>
-            <w:tcW w:w="1930" w:type="dxa"/>
+            <w:tcW w:w="1931" w:type="dxa"/>
             <w:tcBorders/>
           </w:tcPr>
           <w:p>
@@ -22912,7 +22971,7 @@
         </w:tc>
         <w:tc>
           <w:tcPr>
-            <w:tcW w:w="1925" w:type="dxa"/>
+            <w:tcW w:w="1924" w:type="dxa"/>
             <w:tcBorders/>
           </w:tcPr>
           <w:p>
@@ -22942,7 +23001,7 @@
         </w:tc>
         <w:tc>
           <w:tcPr>
-            <w:tcW w:w="1930" w:type="dxa"/>
+            <w:tcW w:w="1931" w:type="dxa"/>
             <w:tcBorders/>
           </w:tcPr>
           <w:p>
@@ -23019,7 +23078,7 @@
         </w:trPr>
         <w:tc>
           <w:tcPr>
-            <w:tcW w:w="1926" w:type="dxa"/>
+            <w:tcW w:w="1925" w:type="dxa"/>
             <w:cnfStyle w:val="001000000000" w:firstRow="0" w:lastRow="0" w:firstColumn="1" w:lastColumn="0" w:oddVBand="0" w:evenVBand="0" w:oddHBand="0" w:evenHBand="0" w:firstRowFirstColumn="0" w:firstRowLastColumn="0" w:lastRowFirstColumn="0" w:lastRowLastColumn="0"/>
             <w:tcBorders/>
             <w:shd w:color="auto" w:fill="CCCCCC" w:themeFill="text1" w:themeFillTint="33" w:val="clear"/>
@@ -23051,7 +23110,7 @@
         </w:tc>
         <w:tc>
           <w:tcPr>
-            <w:tcW w:w="1930" w:type="dxa"/>
+            <w:tcW w:w="1931" w:type="dxa"/>
             <w:tcBorders/>
             <w:shd w:color="auto" w:fill="CCCCCC" w:themeFill="text1" w:themeFillTint="33" w:val="clear"/>
           </w:tcPr>
@@ -23082,7 +23141,7 @@
         </w:tc>
         <w:tc>
           <w:tcPr>
-            <w:tcW w:w="1925" w:type="dxa"/>
+            <w:tcW w:w="1924" w:type="dxa"/>
             <w:tcBorders/>
             <w:shd w:color="auto" w:fill="CCCCCC" w:themeFill="text1" w:themeFillTint="33" w:val="clear"/>
           </w:tcPr>
@@ -23113,7 +23172,7 @@
         </w:tc>
         <w:tc>
           <w:tcPr>
-            <w:tcW w:w="1930" w:type="dxa"/>
+            <w:tcW w:w="1931" w:type="dxa"/>
             <w:tcBorders/>
             <w:shd w:color="auto" w:fill="CCCCCC" w:themeFill="text1" w:themeFillTint="33" w:val="clear"/>
           </w:tcPr>
@@ -23190,7 +23249,7 @@
         <w:trPr/>
         <w:tc>
           <w:tcPr>
-            <w:tcW w:w="1926" w:type="dxa"/>
+            <w:tcW w:w="1925" w:type="dxa"/>
             <w:cnfStyle w:val="001000000000" w:firstRow="0" w:lastRow="0" w:firstColumn="1" w:lastColumn="0" w:oddVBand="0" w:evenVBand="0" w:oddHBand="0" w:evenHBand="0" w:firstRowFirstColumn="0" w:firstRowLastColumn="0" w:lastRowFirstColumn="0" w:lastRowLastColumn="0"/>
             <w:tcBorders/>
           </w:tcPr>
@@ -23221,7 +23280,7 @@
         </w:tc>
         <w:tc>
           <w:tcPr>
-            <w:tcW w:w="1930" w:type="dxa"/>
+            <w:tcW w:w="1931" w:type="dxa"/>
             <w:tcBorders/>
           </w:tcPr>
           <w:p>
@@ -23251,7 +23310,7 @@
         </w:tc>
         <w:tc>
           <w:tcPr>
-            <w:tcW w:w="1925" w:type="dxa"/>
+            <w:tcW w:w="1924" w:type="dxa"/>
             <w:tcBorders/>
           </w:tcPr>
           <w:p>
@@ -23281,7 +23340,7 @@
         </w:tc>
         <w:tc>
           <w:tcPr>
-            <w:tcW w:w="1930" w:type="dxa"/>
+            <w:tcW w:w="1931" w:type="dxa"/>
             <w:tcBorders/>
           </w:tcPr>
           <w:p>
@@ -23404,50 +23463,99 @@
       </w:pPr>
       <w:r>
         <w:rPr/>
-        <w:t>I implemented a genetic algorithm version of my ‘from scratch’ MLP class code. In a standard MLP, back propagation using derivatives is used to find the gradient. In the Genetic Algorithm (GA) version the back propagation process was removed and replaced with evolutionary operators.</w:t>
-      </w:r>
-    </w:p>
-    <w:p>
-      <w:pPr>
-        <w:pStyle w:val="Normal"/>
-        <w:rPr/>
-      </w:pPr>
-      <w:r>
-        <w:rPr/>
-      </w:r>
-    </w:p>
-    <w:p>
-      <w:pPr>
-        <w:pStyle w:val="Normal"/>
-        <w:rPr/>
-      </w:pPr>
-      <w:r>
-        <w:rPr/>
-        <w:t>Diagram – take from the slides, add vectorisatrion and recombination into weights.</w:t>
-      </w:r>
-    </w:p>
-    <w:p>
-      <w:pPr>
-        <w:pStyle w:val="Normal"/>
-        <w:rPr/>
-      </w:pPr>
-      <w:r>
-        <w:rPr/>
-      </w:r>
-    </w:p>
-    <w:p>
-      <w:pPr>
-        <w:pStyle w:val="Normal"/>
-        <w:rPr/>
-      </w:pPr>
-      <w:r>
-        <w:rPr/>
-        <w:t>Three possible ways to use GA:</w:t>
-      </w:r>
-    </w:p>
-    <w:p>
-      <w:pPr>
-        <w:pStyle w:val="ListParagraph"/>
+        <w:t xml:space="preserve">I implemented a genetic algorithm version of my ‘from scratch’ MLP class code. In a standard MLP, back propagation using </w:t>
+      </w:r>
+      <w:r>
+        <w:rPr/>
+        <w:t>gradient descent and partial der</w:t>
+      </w:r>
+      <w:r>
+        <w:rPr/>
+        <w:t xml:space="preserve">ivatives is used to </w:t>
+      </w:r>
+      <w:r>
+        <w:rPr/>
+        <w:t>minimise loss.</w:t>
+      </w:r>
+    </w:p>
+    <w:p>
+      <w:pPr>
+        <w:pStyle w:val="Normal"/>
+        <w:rPr/>
+      </w:pPr>
+      <w:r>
+        <w:rPr/>
+      </w:r>
+    </w:p>
+    <w:p>
+      <w:pPr>
+        <w:pStyle w:val="Normal"/>
+        <w:rPr/>
+      </w:pPr>
+      <w:r>
+        <w:rPr/>
+        <w:t>In the Genetic Algorithm (GA) version the back propagation process was removed and replaced with evolutionary operators. Rather than calculating gradients, the GA treats the neural network’s weights as a chromosome and use</w:t>
+      </w:r>
+      <w:r>
+        <w:rPr/>
+        <w:t>s</w:t>
+      </w:r>
+      <w:r>
+        <w:rPr/>
+        <w:t xml:space="preserve"> </w:t>
+      </w:r>
+      <w:r>
+        <w:rPr/>
+        <w:t xml:space="preserve">the </w:t>
+      </w:r>
+      <w:r>
+        <w:rPr/>
+        <w:t xml:space="preserve">principles of natural selection </w:t>
+      </w:r>
+      <w:r>
+        <w:rPr/>
+        <w:t>to find a solution.</w:t>
+      </w:r>
+    </w:p>
+    <w:p>
+      <w:pPr>
+        <w:pStyle w:val="Normal"/>
+        <w:rPr/>
+      </w:pPr>
+      <w:r>
+        <w:rPr/>
+      </w:r>
+    </w:p>
+    <w:p>
+      <w:pPr>
+        <w:pStyle w:val="Normal"/>
+        <w:rPr/>
+      </w:pPr>
+      <w:r>
+        <w:rPr/>
+        <w:t xml:space="preserve">I implemented a genetic algorithm version of my ‘from scratch’ MLP Python Class, and some surrounding functions to run the evolutionary process. </w:t>
+      </w:r>
+      <w:r>
+        <w:rPr/>
+        <w:t xml:space="preserve">The following steps are followed </w:t>
+      </w:r>
+      <w:r>
+        <w:rPr/>
+        <w:t>to evolve the ‘best’ MLP:</w:t>
+      </w:r>
+    </w:p>
+    <w:p>
+      <w:pPr>
+        <w:pStyle w:val="Normal"/>
+        <w:rPr/>
+      </w:pPr>
+      <w:r>
+        <w:rPr/>
+      </w:r>
+    </w:p>
+    <w:p>
+      <w:pPr>
+        <w:pStyle w:val="Normal"/>
         <w:numPr>
           <w:ilvl w:val="0"/>
           <w:numId w:val="10"/>
@@ -23456,12 +23564,24 @@
       </w:pPr>
       <w:r>
         <w:rPr/>
-        <w:t>Replace back prop</w:t>
-      </w:r>
-    </w:p>
-    <w:p>
-      <w:pPr>
-        <w:pStyle w:val="ListParagraph"/>
+        <w:t>Crea</w:t>
+      </w:r>
+      <w:r>
+        <w:rPr/>
+        <w:t>tion of</w:t>
+      </w:r>
+      <w:r>
+        <w:rPr/>
+        <w:t xml:space="preserve"> an initial population </w:t>
+      </w:r>
+      <w:r>
+        <w:rPr/>
+        <w:t>of candidate MLP objects.</w:t>
+      </w:r>
+    </w:p>
+    <w:p>
+      <w:pPr>
+        <w:pStyle w:val="Normal"/>
         <w:numPr>
           <w:ilvl w:val="0"/>
           <w:numId w:val="10"/>
@@ -23470,40 +23590,1322 @@
       </w:pPr>
       <w:r>
         <w:rPr/>
-        <w:t>??</w:t>
-      </w:r>
-    </w:p>
-    <w:p>
-      <w:pPr>
-        <w:pStyle w:val="ListParagraph"/>
+        <w:t xml:space="preserve">Loop through the generations. </w:t>
+      </w:r>
+    </w:p>
+    <w:p>
+      <w:pPr>
+        <w:pStyle w:val="Normal"/>
         <w:numPr>
           <w:ilvl w:val="0"/>
-          <w:numId w:val="10"/>
+          <w:numId w:val="0"/>
         </w:numPr>
-        <w:rPr/>
-      </w:pPr>
-      <w:r>
-        <w:rPr/>
-        <w:t>Hybrid</w:t>
-      </w:r>
-    </w:p>
-    <w:p>
-      <w:pPr>
-        <w:pStyle w:val="Normal"/>
-        <w:rPr/>
-      </w:pPr>
-      <w:r>
-        <w:rPr/>
-      </w:r>
-    </w:p>
-    <w:p>
-      <w:pPr>
-        <w:pStyle w:val="Normal"/>
-        <w:rPr/>
-      </w:pPr>
-      <w:r>
-        <w:rPr/>
-        <w:t>Research.</w:t>
+        <w:ind w:hanging="0" w:start="720"/>
+        <w:rPr/>
+      </w:pPr>
+      <w:r>
+        <w:rPr/>
+      </w:r>
+    </w:p>
+    <w:p>
+      <w:pPr>
+        <w:pStyle w:val="Normal"/>
+        <w:numPr>
+          <w:ilvl w:val="0"/>
+          <w:numId w:val="0"/>
+        </w:numPr>
+        <w:ind w:hanging="0" w:start="720"/>
+        <w:rPr/>
+      </w:pPr>
+      <w:r>
+        <w:rPr/>
+        <w:t>For each generation:</w:t>
+      </w:r>
+    </w:p>
+    <w:p>
+      <w:pPr>
+        <w:pStyle w:val="Normal"/>
+        <w:rPr/>
+      </w:pPr>
+      <w:r>
+        <w:rPr/>
+      </w:r>
+    </w:p>
+    <w:p>
+      <w:pPr>
+        <w:pStyle w:val="Normal"/>
+        <w:numPr>
+          <w:ilvl w:val="0"/>
+          <w:numId w:val="11"/>
+        </w:numPr>
+        <w:rPr/>
+      </w:pPr>
+      <w:r>
+        <w:rPr/>
+        <w:t>Calculate the fitness m</w:t>
+      </w:r>
+      <w:r>
+        <w:rPr/>
+        <w:t>etric</w:t>
+      </w:r>
+      <w:r>
+        <w:rPr/>
+        <w:t xml:space="preserve"> for each individual.</w:t>
+      </w:r>
+    </w:p>
+    <w:p>
+      <w:pPr>
+        <w:pStyle w:val="Normal"/>
+        <w:numPr>
+          <w:ilvl w:val="0"/>
+          <w:numId w:val="11"/>
+        </w:numPr>
+        <w:rPr/>
+      </w:pPr>
+      <w:r>
+        <w:rPr/>
+        <w:t xml:space="preserve">Sort the individuals based on fitness (in descending order, highest at the top). </w:t>
+      </w:r>
+      <w:r>
+        <w:rPr/>
+        <w:t>The fitness function is simply one of the four metrics: accuracy, recall, precision or F1-Score. (Recall is used as the default as this gives the best possible outcome for true positives, but this is tunable as needed.)</w:t>
+      </w:r>
+    </w:p>
+    <w:p>
+      <w:pPr>
+        <w:pStyle w:val="Normal"/>
+        <w:numPr>
+          <w:ilvl w:val="0"/>
+          <w:numId w:val="11"/>
+        </w:numPr>
+        <w:rPr/>
+      </w:pPr>
+      <w:r>
+        <w:rPr/>
+        <w:t xml:space="preserve">Keep the very best individuals each time. This </w:t>
+      </w:r>
+      <w:r>
+        <w:rPr/>
+        <w:t>process is known as</w:t>
+      </w:r>
+      <w:r>
+        <w:rPr/>
+        <w:t xml:space="preserve"> elitism, </w:t>
+      </w:r>
+      <w:r>
+        <w:rPr/>
+        <w:t xml:space="preserve">where the best survive regardless of their age in the population. The top-performing models are retained to prevent the loss of </w:t>
+      </w:r>
+      <w:r>
+        <w:rPr/>
+        <w:t>the the highest performing</w:t>
+      </w:r>
+      <w:r>
+        <w:rPr/>
+        <w:t xml:space="preserve"> traits </w:t>
+      </w:r>
+      <w:r>
+        <w:rPr/>
+        <w:t>so far.</w:t>
+      </w:r>
+    </w:p>
+    <w:p>
+      <w:pPr>
+        <w:pStyle w:val="Normal"/>
+        <w:numPr>
+          <w:ilvl w:val="0"/>
+          <w:numId w:val="11"/>
+        </w:numPr>
+        <w:rPr/>
+      </w:pPr>
+      <w:r>
+        <w:rPr/>
+        <w:t>Cull the bottom half of the population. The culling_rate variable is used to remove the bottom percentage of the population with each generation. This is set to 50% by default, leaving the top 50% of parents available to create the next generation.</w:t>
+      </w:r>
+    </w:p>
+    <w:p>
+      <w:pPr>
+        <w:pStyle w:val="Normal"/>
+        <w:numPr>
+          <w:ilvl w:val="0"/>
+          <w:numId w:val="11"/>
+        </w:numPr>
+        <w:rPr/>
+      </w:pPr>
+      <w:r>
+        <w:rPr/>
+        <w:t>Generate new children to fill the population using crossover and possible mutation.</w:t>
+      </w:r>
+    </w:p>
+    <w:p>
+      <w:pPr>
+        <w:pStyle w:val="Normal"/>
+        <w:rPr/>
+      </w:pPr>
+      <w:r>
+        <w:rPr/>
+      </w:r>
+    </w:p>
+    <w:p>
+      <w:pPr>
+        <w:pStyle w:val="Normal"/>
+        <w:rPr>
+          <w:b/>
+          <w:bCs/>
+        </w:rPr>
+      </w:pPr>
+      <w:r>
+        <w:rPr>
+          <w:b/>
+          <w:bCs/>
+        </w:rPr>
+        <w:t>Crossover</w:t>
+      </w:r>
+    </w:p>
+    <w:p>
+      <w:pPr>
+        <w:pStyle w:val="Normal"/>
+        <w:rPr/>
+      </w:pPr>
+      <w:r>
+        <w:rPr/>
+        <w:t>Pairs of parents exchange ‘genetic material’ (</w:t>
+      </w:r>
+      <w:r>
+        <w:rPr/>
+        <w:t xml:space="preserve">their </w:t>
+      </w:r>
+      <w:r>
+        <w:rPr/>
+        <w:t xml:space="preserve">weights </w:t>
+      </w:r>
+      <w:r>
+        <w:rPr/>
+        <w:t>and biases data</w:t>
+      </w:r>
+      <w:r>
+        <w:rPr/>
+        <w:t xml:space="preserve">), combining successful patterns to create offspring. </w:t>
+      </w:r>
+      <w:r>
+        <w:rPr/>
+        <w:t>I chose to find a random point and then swap the ‘tails’ of data after that point.</w:t>
+      </w:r>
+    </w:p>
+    <w:p>
+      <w:pPr>
+        <w:pStyle w:val="Normal"/>
+        <w:rPr/>
+      </w:pPr>
+      <w:r>
+        <w:rPr/>
+      </w:r>
+    </w:p>
+    <w:p>
+      <w:pPr>
+        <w:pStyle w:val="Normal"/>
+        <w:rPr>
+          <w:b/>
+          <w:bCs/>
+        </w:rPr>
+      </w:pPr>
+      <w:r>
+        <w:rPr>
+          <w:b/>
+          <w:bCs/>
+        </w:rPr>
+        <w:t>Mutation</w:t>
+      </w:r>
+    </w:p>
+    <w:p>
+      <w:pPr>
+        <w:pStyle w:val="Normal"/>
+        <w:rPr/>
+      </w:pPr>
+      <w:r>
+        <w:rPr/>
+        <w:t xml:space="preserve">Random </w:t>
+      </w:r>
+      <w:r>
+        <w:rPr/>
+        <w:t>variations</w:t>
+      </w:r>
+      <w:r>
+        <w:rPr/>
+        <w:t xml:space="preserve"> are introduced to </w:t>
+      </w:r>
+      <w:r>
+        <w:rPr/>
+        <w:t>the chromosome to mimic real life mutations, and to</w:t>
+      </w:r>
+      <w:r>
+        <w:rPr/>
+        <w:t xml:space="preserve"> prevent the algorithm from getting stuck in </w:t>
+      </w:r>
+      <w:r>
+        <w:rPr/>
+        <w:t xml:space="preserve">a </w:t>
+      </w:r>
+      <w:r>
+        <w:rPr/>
+        <w:t xml:space="preserve">local minima. </w:t>
+      </w:r>
+      <w:r>
+        <w:rPr/>
+        <w:t>A mutation is only applied when a random dice roll is below the mutation rate value (this is user configurable).</w:t>
+      </w:r>
+    </w:p>
+    <w:p>
+      <w:pPr>
+        <w:pStyle w:val="Normal"/>
+        <w:rPr/>
+      </w:pPr>
+      <w:r>
+        <w:rPr/>
+      </w:r>
+    </w:p>
+    <w:p>
+      <w:pPr>
+        <w:pStyle w:val="Normal"/>
+        <w:rPr/>
+      </w:pPr>
+      <w:r>
+        <w:rPr/>
+        <w:t>To implement the chromosome, the weights and biases are flattened into a single one dimensional array. To put this back together into arrays after crossover and mutation, I used the stored lengths of the weights and biases to chop up the chromosome.</w:t>
+      </w:r>
+    </w:p>
+    <w:p>
+      <w:pPr>
+        <w:pStyle w:val="Normal"/>
+        <w:rPr/>
+      </w:pPr>
+      <w:r>
+        <w:rPr/>
+      </w:r>
+    </w:p>
+    <w:p>
+      <w:pPr>
+        <w:pStyle w:val="Normal"/>
+        <w:rPr/>
+      </w:pPr>
+      <w:r>
+        <w:rPr/>
+        <w:t>The first run oif the algorithm used he following parameters. Recall was used as the fitness function to give it the best chance of finding the True Positive responses.</w:t>
+      </w:r>
+    </w:p>
+    <w:p>
+      <w:pPr>
+        <w:pStyle w:val="Normal"/>
+        <w:rPr/>
+      </w:pPr>
+      <w:r>
+        <w:rPr/>
+      </w:r>
+    </w:p>
+    <w:tbl>
+      <w:tblPr>
+        <w:tblW w:w="6228" w:type="dxa"/>
+        <w:jc w:val="start"/>
+        <w:tblInd w:w="-5" w:type="dxa"/>
+        <w:tblLayout w:type="fixed"/>
+        <w:tblCellMar>
+          <w:top w:w="55" w:type="dxa"/>
+          <w:start w:w="55" w:type="dxa"/>
+          <w:bottom w:w="55" w:type="dxa"/>
+          <w:end w:w="55" w:type="dxa"/>
+        </w:tblCellMar>
+      </w:tblPr>
+      <w:tblGrid>
+        <w:gridCol w:w="4193"/>
+        <w:gridCol w:w="2035"/>
+      </w:tblGrid>
+      <w:tr>
+        <w:trPr/>
+        <w:tc>
+          <w:tcPr>
+            <w:tcW w:w="4193" w:type="dxa"/>
+            <w:tcBorders>
+              <w:top w:val="single" w:sz="4" w:space="0" w:color="000000"/>
+              <w:start w:val="single" w:sz="4" w:space="0" w:color="000000"/>
+              <w:bottom w:val="single" w:sz="4" w:space="0" w:color="000000"/>
+            </w:tcBorders>
+          </w:tcPr>
+          <w:p>
+            <w:pPr>
+              <w:pStyle w:val="TableContents"/>
+              <w:rPr/>
+            </w:pPr>
+            <w:r>
+              <w:rPr/>
+              <w:t>Parameter</w:t>
+            </w:r>
+          </w:p>
+        </w:tc>
+        <w:tc>
+          <w:tcPr>
+            <w:tcW w:w="2035" w:type="dxa"/>
+            <w:tcBorders>
+              <w:top w:val="single" w:sz="4" w:space="0" w:color="000000"/>
+              <w:start w:val="single" w:sz="4" w:space="0" w:color="000000"/>
+              <w:bottom w:val="single" w:sz="4" w:space="0" w:color="000000"/>
+              <w:end w:val="single" w:sz="4" w:space="0" w:color="000000"/>
+            </w:tcBorders>
+          </w:tcPr>
+          <w:p>
+            <w:pPr>
+              <w:pStyle w:val="TableContents"/>
+              <w:rPr/>
+            </w:pPr>
+            <w:r>
+              <w:rPr/>
+              <w:t>Value</w:t>
+            </w:r>
+          </w:p>
+        </w:tc>
+      </w:tr>
+      <w:tr>
+        <w:trPr/>
+        <w:tc>
+          <w:tcPr>
+            <w:tcW w:w="4193" w:type="dxa"/>
+            <w:tcBorders>
+              <w:start w:val="single" w:sz="4" w:space="0" w:color="000000"/>
+              <w:bottom w:val="single" w:sz="4" w:space="0" w:color="000000"/>
+            </w:tcBorders>
+          </w:tcPr>
+          <w:p>
+            <w:pPr>
+              <w:pStyle w:val="TableContents"/>
+              <w:rPr/>
+            </w:pPr>
+            <w:r>
+              <w:rPr/>
+              <w:t>Fitness Function</w:t>
+            </w:r>
+          </w:p>
+        </w:tc>
+        <w:tc>
+          <w:tcPr>
+            <w:tcW w:w="2035" w:type="dxa"/>
+            <w:tcBorders>
+              <w:start w:val="single" w:sz="4" w:space="0" w:color="000000"/>
+              <w:bottom w:val="single" w:sz="4" w:space="0" w:color="000000"/>
+              <w:end w:val="single" w:sz="4" w:space="0" w:color="000000"/>
+            </w:tcBorders>
+          </w:tcPr>
+          <w:p>
+            <w:pPr>
+              <w:pStyle w:val="TableContents"/>
+              <w:rPr/>
+            </w:pPr>
+            <w:r>
+              <w:rPr/>
+              <w:t>Recall</w:t>
+            </w:r>
+          </w:p>
+        </w:tc>
+      </w:tr>
+      <w:tr>
+        <w:trPr/>
+        <w:tc>
+          <w:tcPr>
+            <w:tcW w:w="4193" w:type="dxa"/>
+            <w:tcBorders>
+              <w:start w:val="single" w:sz="4" w:space="0" w:color="000000"/>
+              <w:bottom w:val="single" w:sz="4" w:space="0" w:color="000000"/>
+            </w:tcBorders>
+          </w:tcPr>
+          <w:p>
+            <w:pPr>
+              <w:pStyle w:val="TableContents"/>
+              <w:rPr/>
+            </w:pPr>
+            <w:r>
+              <w:rPr/>
+              <w:t>Population Size</w:t>
+            </w:r>
+          </w:p>
+        </w:tc>
+        <w:tc>
+          <w:tcPr>
+            <w:tcW w:w="2035" w:type="dxa"/>
+            <w:tcBorders>
+              <w:start w:val="single" w:sz="4" w:space="0" w:color="000000"/>
+              <w:bottom w:val="single" w:sz="4" w:space="0" w:color="000000"/>
+              <w:end w:val="single" w:sz="4" w:space="0" w:color="000000"/>
+            </w:tcBorders>
+          </w:tcPr>
+          <w:p>
+            <w:pPr>
+              <w:pStyle w:val="TableContents"/>
+              <w:rPr/>
+            </w:pPr>
+            <w:r>
+              <w:rPr/>
+              <w:t>20</w:t>
+            </w:r>
+          </w:p>
+        </w:tc>
+      </w:tr>
+      <w:tr>
+        <w:trPr/>
+        <w:tc>
+          <w:tcPr>
+            <w:tcW w:w="4193" w:type="dxa"/>
+            <w:tcBorders>
+              <w:start w:val="single" w:sz="4" w:space="0" w:color="000000"/>
+              <w:bottom w:val="single" w:sz="4" w:space="0" w:color="000000"/>
+            </w:tcBorders>
+          </w:tcPr>
+          <w:p>
+            <w:pPr>
+              <w:pStyle w:val="TableContents"/>
+              <w:rPr/>
+            </w:pPr>
+            <w:r>
+              <w:rPr/>
+              <w:t>Generations</w:t>
+            </w:r>
+          </w:p>
+        </w:tc>
+        <w:tc>
+          <w:tcPr>
+            <w:tcW w:w="2035" w:type="dxa"/>
+            <w:tcBorders>
+              <w:start w:val="single" w:sz="4" w:space="0" w:color="000000"/>
+              <w:bottom w:val="single" w:sz="4" w:space="0" w:color="000000"/>
+              <w:end w:val="single" w:sz="4" w:space="0" w:color="000000"/>
+            </w:tcBorders>
+          </w:tcPr>
+          <w:p>
+            <w:pPr>
+              <w:pStyle w:val="TableContents"/>
+              <w:rPr/>
+            </w:pPr>
+            <w:r>
+              <w:rPr/>
+              <w:t>20</w:t>
+            </w:r>
+          </w:p>
+        </w:tc>
+      </w:tr>
+      <w:tr>
+        <w:trPr/>
+        <w:tc>
+          <w:tcPr>
+            <w:tcW w:w="4193" w:type="dxa"/>
+            <w:tcBorders>
+              <w:start w:val="single" w:sz="4" w:space="0" w:color="000000"/>
+              <w:bottom w:val="single" w:sz="4" w:space="0" w:color="000000"/>
+            </w:tcBorders>
+          </w:tcPr>
+          <w:p>
+            <w:pPr>
+              <w:pStyle w:val="TableContents"/>
+              <w:rPr/>
+            </w:pPr>
+            <w:r>
+              <w:rPr/>
+              <w:t>Culling Rate (Take away bottom N%)</w:t>
+            </w:r>
+          </w:p>
+        </w:tc>
+        <w:tc>
+          <w:tcPr>
+            <w:tcW w:w="2035" w:type="dxa"/>
+            <w:tcBorders>
+              <w:start w:val="single" w:sz="4" w:space="0" w:color="000000"/>
+              <w:bottom w:val="single" w:sz="4" w:space="0" w:color="000000"/>
+              <w:end w:val="single" w:sz="4" w:space="0" w:color="000000"/>
+            </w:tcBorders>
+          </w:tcPr>
+          <w:p>
+            <w:pPr>
+              <w:pStyle w:val="TableContents"/>
+              <w:rPr/>
+            </w:pPr>
+            <w:r>
+              <w:rPr/>
+              <w:t>50%</w:t>
+            </w:r>
+          </w:p>
+        </w:tc>
+      </w:tr>
+      <w:tr>
+        <w:trPr/>
+        <w:tc>
+          <w:tcPr>
+            <w:tcW w:w="4193" w:type="dxa"/>
+            <w:tcBorders>
+              <w:start w:val="single" w:sz="4" w:space="0" w:color="000000"/>
+              <w:bottom w:val="single" w:sz="4" w:space="0" w:color="000000"/>
+            </w:tcBorders>
+          </w:tcPr>
+          <w:p>
+            <w:pPr>
+              <w:pStyle w:val="TableContents"/>
+              <w:rPr/>
+            </w:pPr>
+            <w:r>
+              <w:rPr/>
+              <w:t>Elite Size (Retain top N)</w:t>
+            </w:r>
+          </w:p>
+        </w:tc>
+        <w:tc>
+          <w:tcPr>
+            <w:tcW w:w="2035" w:type="dxa"/>
+            <w:tcBorders>
+              <w:start w:val="single" w:sz="4" w:space="0" w:color="000000"/>
+              <w:bottom w:val="single" w:sz="4" w:space="0" w:color="000000"/>
+              <w:end w:val="single" w:sz="4" w:space="0" w:color="000000"/>
+            </w:tcBorders>
+          </w:tcPr>
+          <w:p>
+            <w:pPr>
+              <w:pStyle w:val="TableContents"/>
+              <w:rPr/>
+            </w:pPr>
+            <w:r>
+              <w:rPr/>
+              <w:t>5</w:t>
+            </w:r>
+          </w:p>
+        </w:tc>
+      </w:tr>
+      <w:tr>
+        <w:trPr/>
+        <w:tc>
+          <w:tcPr>
+            <w:tcW w:w="4193" w:type="dxa"/>
+            <w:tcBorders>
+              <w:start w:val="single" w:sz="4" w:space="0" w:color="000000"/>
+              <w:bottom w:val="single" w:sz="4" w:space="0" w:color="000000"/>
+            </w:tcBorders>
+          </w:tcPr>
+          <w:p>
+            <w:pPr>
+              <w:pStyle w:val="TableContents"/>
+              <w:rPr/>
+            </w:pPr>
+            <w:r>
+              <w:rPr/>
+              <w:t>Mutation Rate</w:t>
+            </w:r>
+          </w:p>
+        </w:tc>
+        <w:tc>
+          <w:tcPr>
+            <w:tcW w:w="2035" w:type="dxa"/>
+            <w:tcBorders>
+              <w:start w:val="single" w:sz="4" w:space="0" w:color="000000"/>
+              <w:bottom w:val="single" w:sz="4" w:space="0" w:color="000000"/>
+              <w:end w:val="single" w:sz="4" w:space="0" w:color="000000"/>
+            </w:tcBorders>
+          </w:tcPr>
+          <w:p>
+            <w:pPr>
+              <w:pStyle w:val="TableContents"/>
+              <w:rPr/>
+            </w:pPr>
+            <w:r>
+              <w:rPr/>
+              <w:t>0.05 (5%)</w:t>
+            </w:r>
+          </w:p>
+        </w:tc>
+      </w:tr>
+    </w:tbl>
+    <w:p>
+      <w:pPr>
+        <w:pStyle w:val="Normal"/>
+        <w:rPr/>
+      </w:pPr>
+      <w:r>
+        <w:rPr/>
+      </w:r>
+    </w:p>
+    <w:p>
+      <w:pPr>
+        <w:pStyle w:val="Normal"/>
+        <w:rPr/>
+      </w:pPr>
+      <w:r>
+        <w:rPr/>
+        <w:t>The confusion matrix for this run follows:</w:t>
+      </w:r>
+    </w:p>
+    <w:p>
+      <w:pPr>
+        <w:pStyle w:val="Normal"/>
+        <w:rPr/>
+      </w:pPr>
+      <w:r>
+        <w:rPr/>
+      </w:r>
+    </w:p>
+    <w:p>
+      <w:pPr>
+        <w:pStyle w:val="Normal"/>
+        <w:rPr/>
+      </w:pPr>
+      <w:r>
+        <w:rPr/>
+        <w:t>[insert]</w:t>
+      </w:r>
+    </w:p>
+    <w:p>
+      <w:pPr>
+        <w:pStyle w:val="Normal"/>
+        <w:rPr/>
+      </w:pPr>
+      <w:r>
+        <w:rPr/>
+      </w:r>
+    </w:p>
+    <w:p>
+      <w:pPr>
+        <w:pStyle w:val="Normal"/>
+        <w:rPr/>
+      </w:pPr>
+      <w:r>
+        <w:rPr/>
+        <w:t>This is really bad! However, this is the best score for Recall that the MLP has generated. (99%) Because the fitness function told the GA to maximize recall, it learned that the way to never miss a 'yes' is to predict it for everyone.</w:t>
+      </w:r>
+    </w:p>
+    <w:p>
+      <w:pPr>
+        <w:pStyle w:val="Normal"/>
+        <w:rPr/>
+      </w:pPr>
+      <w:r>
+        <w:rPr/>
+      </w:r>
+    </w:p>
+    <w:p>
+      <w:pPr>
+        <w:pStyle w:val="Normal"/>
+        <w:rPr/>
+      </w:pPr>
+      <w:r>
+        <w:rPr/>
+        <w:t>A better metric to use would be the F1-Score because this is made up of both recall and precision.</w:t>
+      </w:r>
+    </w:p>
+    <w:p>
+      <w:pPr>
+        <w:pStyle w:val="Normal"/>
+        <w:rPr/>
+      </w:pPr>
+      <w:r>
+        <w:rPr/>
+      </w:r>
+    </w:p>
+    <w:p>
+      <w:pPr>
+        <w:pStyle w:val="Normal"/>
+        <w:rPr/>
+      </w:pPr>
+      <w:r>
+        <w:rPr/>
+        <w:t>Running the same parameters, but specifying the F1-Score metric as the fitness function gives the following confusion matrix:</w:t>
+      </w:r>
+    </w:p>
+    <w:p>
+      <w:pPr>
+        <w:pStyle w:val="Normal"/>
+        <w:rPr/>
+      </w:pPr>
+      <w:r>
+        <w:rPr/>
+      </w:r>
+    </w:p>
+    <w:p>
+      <w:pPr>
+        <w:pStyle w:val="Normal"/>
+        <w:rPr/>
+      </w:pPr>
+      <w:r>
+        <w:rPr/>
+        <w:t>[insert]</w:t>
+      </w:r>
+    </w:p>
+    <w:p>
+      <w:pPr>
+        <w:pStyle w:val="Normal"/>
+        <w:rPr/>
+      </w:pPr>
+      <w:r>
+        <w:rPr/>
+      </w:r>
+    </w:p>
+    <w:tbl>
+      <w:tblPr>
+        <w:tblW w:w="3061" w:type="dxa"/>
+        <w:jc w:val="start"/>
+        <w:tblInd w:w="0" w:type="dxa"/>
+        <w:tblLayout w:type="fixed"/>
+        <w:tblCellMar>
+          <w:top w:w="0" w:type="dxa"/>
+          <w:start w:w="0" w:type="dxa"/>
+          <w:bottom w:w="0" w:type="dxa"/>
+          <w:end w:w="0" w:type="dxa"/>
+        </w:tblCellMar>
+      </w:tblPr>
+      <w:tblGrid>
+        <w:gridCol w:w="1344"/>
+        <w:gridCol w:w="859"/>
+        <w:gridCol w:w="858"/>
+      </w:tblGrid>
+      <w:tr>
+        <w:trPr/>
+        <w:tc>
+          <w:tcPr>
+            <w:tcW w:w="1344" w:type="dxa"/>
+            <w:tcBorders/>
+          </w:tcPr>
+          <w:p>
+            <w:pPr>
+              <w:pStyle w:val="Normal"/>
+              <w:rPr/>
+            </w:pPr>
+            <w:r>
+              <w:rPr/>
+              <w:t>Metric</w:t>
+            </w:r>
+          </w:p>
+        </w:tc>
+        <w:tc>
+          <w:tcPr>
+            <w:tcW w:w="859" w:type="dxa"/>
+            <w:tcBorders/>
+          </w:tcPr>
+          <w:p>
+            <w:pPr>
+              <w:pStyle w:val="Normal"/>
+              <w:rPr/>
+            </w:pPr>
+            <w:r>
+              <w:rPr/>
+              <w:t>Score</w:t>
+            </w:r>
+          </w:p>
+        </w:tc>
+        <w:tc>
+          <w:tcPr>
+            <w:tcW w:w="858" w:type="dxa"/>
+            <w:tcBorders/>
+          </w:tcPr>
+          <w:p>
+            <w:pPr>
+              <w:pStyle w:val="Normal"/>
+              <w:rPr/>
+            </w:pPr>
+            <w:r>
+              <w:rPr/>
+              <w:t>%</w:t>
+            </w:r>
+          </w:p>
+        </w:tc>
+      </w:tr>
+      <w:tr>
+        <w:trPr/>
+        <w:tc>
+          <w:tcPr>
+            <w:tcW w:w="1344" w:type="dxa"/>
+            <w:tcBorders/>
+          </w:tcPr>
+          <w:p>
+            <w:pPr>
+              <w:pStyle w:val="Normal"/>
+              <w:rPr/>
+            </w:pPr>
+            <w:r>
+              <w:rPr>
+                <w:rFonts w:ascii="Droid Sans Mono;monospace" w:hAnsi="Droid Sans Mono;monospace"/>
+                <w:b w:val="false"/>
+                <w:i w:val="false"/>
+                <w:caps w:val="false"/>
+                <w:smallCaps w:val="false"/>
+                <w:color w:val="BBBEBF"/>
+                <w:spacing w:val="0"/>
+                <w:sz w:val="21"/>
+              </w:rPr>
+              <w:t>Accuracy</w:t>
+            </w:r>
+          </w:p>
+        </w:tc>
+        <w:tc>
+          <w:tcPr>
+            <w:tcW w:w="859" w:type="dxa"/>
+            <w:tcBorders/>
+          </w:tcPr>
+          <w:p>
+            <w:pPr>
+              <w:pStyle w:val="Normal"/>
+              <w:rPr/>
+            </w:pPr>
+            <w:r>
+              <w:rPr>
+                <w:rFonts w:ascii="Droid Sans Mono;monospace" w:hAnsi="Droid Sans Mono;monospace"/>
+                <w:b w:val="false"/>
+                <w:i w:val="false"/>
+                <w:caps w:val="false"/>
+                <w:smallCaps w:val="false"/>
+                <w:color w:val="BBBEBF"/>
+                <w:spacing w:val="0"/>
+                <w:sz w:val="21"/>
+              </w:rPr>
+              <w:t>0.7547</w:t>
+            </w:r>
+          </w:p>
+        </w:tc>
+        <w:tc>
+          <w:tcPr>
+            <w:tcW w:w="858" w:type="dxa"/>
+            <w:tcBorders/>
+          </w:tcPr>
+          <w:p>
+            <w:pPr>
+              <w:pStyle w:val="Normal"/>
+              <w:rPr/>
+            </w:pPr>
+            <w:r>
+              <w:rPr/>
+              <w:t>75.5%</w:t>
+            </w:r>
+          </w:p>
+        </w:tc>
+      </w:tr>
+      <w:tr>
+        <w:trPr/>
+        <w:tc>
+          <w:tcPr>
+            <w:tcW w:w="1344" w:type="dxa"/>
+            <w:tcBorders/>
+          </w:tcPr>
+          <w:p>
+            <w:pPr>
+              <w:pStyle w:val="Normal"/>
+              <w:rPr/>
+            </w:pPr>
+            <w:r>
+              <w:rPr>
+                <w:rFonts w:ascii="Droid Sans Mono;monospace" w:hAnsi="Droid Sans Mono;monospace"/>
+                <w:b w:val="false"/>
+                <w:i w:val="false"/>
+                <w:caps w:val="false"/>
+                <w:smallCaps w:val="false"/>
+                <w:color w:val="BBBEBF"/>
+                <w:spacing w:val="0"/>
+                <w:sz w:val="21"/>
+              </w:rPr>
+              <w:t>Precision</w:t>
+            </w:r>
+          </w:p>
+        </w:tc>
+        <w:tc>
+          <w:tcPr>
+            <w:tcW w:w="859" w:type="dxa"/>
+            <w:tcBorders/>
+          </w:tcPr>
+          <w:p>
+            <w:pPr>
+              <w:pStyle w:val="Normal"/>
+              <w:rPr/>
+            </w:pPr>
+            <w:r>
+              <w:rPr>
+                <w:rFonts w:ascii="Droid Sans Mono;monospace" w:hAnsi="Droid Sans Mono;monospace"/>
+                <w:b w:val="false"/>
+                <w:i w:val="false"/>
+                <w:caps w:val="false"/>
+                <w:smallCaps w:val="false"/>
+                <w:color w:val="BBBEBF"/>
+                <w:spacing w:val="0"/>
+                <w:sz w:val="21"/>
+              </w:rPr>
+              <w:t>0.2176</w:t>
+            </w:r>
+          </w:p>
+        </w:tc>
+        <w:tc>
+          <w:tcPr>
+            <w:tcW w:w="858" w:type="dxa"/>
+            <w:tcBorders/>
+          </w:tcPr>
+          <w:p>
+            <w:pPr>
+              <w:pStyle w:val="Normal"/>
+              <w:rPr/>
+            </w:pPr>
+            <w:r>
+              <w:rPr/>
+              <w:t>21.8%</w:t>
+            </w:r>
+          </w:p>
+        </w:tc>
+      </w:tr>
+      <w:tr>
+        <w:trPr/>
+        <w:tc>
+          <w:tcPr>
+            <w:tcW w:w="1344" w:type="dxa"/>
+            <w:tcBorders/>
+          </w:tcPr>
+          <w:p>
+            <w:pPr>
+              <w:pStyle w:val="Normal"/>
+              <w:rPr/>
+            </w:pPr>
+            <w:r>
+              <w:rPr>
+                <w:rFonts w:ascii="Droid Sans Mono;monospace" w:hAnsi="Droid Sans Mono;monospace"/>
+                <w:b w:val="false"/>
+                <w:i w:val="false"/>
+                <w:caps w:val="false"/>
+                <w:smallCaps w:val="false"/>
+                <w:color w:val="BBBEBF"/>
+                <w:spacing w:val="0"/>
+                <w:sz w:val="21"/>
+              </w:rPr>
+              <w:t>Recall</w:t>
+            </w:r>
+          </w:p>
+        </w:tc>
+        <w:tc>
+          <w:tcPr>
+            <w:tcW w:w="859" w:type="dxa"/>
+            <w:tcBorders/>
+          </w:tcPr>
+          <w:p>
+            <w:pPr>
+              <w:pStyle w:val="Normal"/>
+              <w:rPr/>
+            </w:pPr>
+            <w:r>
+              <w:rPr>
+                <w:rFonts w:ascii="Droid Sans Mono;monospace" w:hAnsi="Droid Sans Mono;monospace"/>
+                <w:b w:val="false"/>
+                <w:i w:val="false"/>
+                <w:caps w:val="false"/>
+                <w:smallCaps w:val="false"/>
+                <w:color w:val="BBBEBF"/>
+                <w:spacing w:val="0"/>
+                <w:sz w:val="21"/>
+              </w:rPr>
+              <w:t>0.422</w:t>
+            </w:r>
+            <w:r>
+              <w:rPr>
+                <w:rFonts w:ascii="Droid Sans Mono;monospace" w:hAnsi="Droid Sans Mono;monospace"/>
+                <w:b w:val="false"/>
+                <w:i w:val="false"/>
+                <w:caps w:val="false"/>
+                <w:smallCaps w:val="false"/>
+                <w:color w:val="BBBEBF"/>
+                <w:spacing w:val="0"/>
+                <w:sz w:val="21"/>
+              </w:rPr>
+              <w:t>5</w:t>
+            </w:r>
+          </w:p>
+        </w:tc>
+        <w:tc>
+          <w:tcPr>
+            <w:tcW w:w="858" w:type="dxa"/>
+            <w:tcBorders/>
+          </w:tcPr>
+          <w:p>
+            <w:pPr>
+              <w:pStyle w:val="Normal"/>
+              <w:rPr/>
+            </w:pPr>
+            <w:r>
+              <w:rPr/>
+              <w:t>42.3%</w:t>
+            </w:r>
+          </w:p>
+        </w:tc>
+      </w:tr>
+      <w:tr>
+        <w:trPr/>
+        <w:tc>
+          <w:tcPr>
+            <w:tcW w:w="1344" w:type="dxa"/>
+            <w:tcBorders/>
+          </w:tcPr>
+          <w:p>
+            <w:pPr>
+              <w:pStyle w:val="Normal"/>
+              <w:rPr/>
+            </w:pPr>
+            <w:r>
+              <w:rPr>
+                <w:rFonts w:ascii="Droid Sans Mono;monospace" w:hAnsi="Droid Sans Mono;monospace"/>
+                <w:b w:val="false"/>
+                <w:i w:val="false"/>
+                <w:caps w:val="false"/>
+                <w:smallCaps w:val="false"/>
+                <w:color w:val="BBBEBF"/>
+                <w:spacing w:val="0"/>
+                <w:sz w:val="21"/>
+              </w:rPr>
+              <w:t>F1 Score</w:t>
+            </w:r>
+          </w:p>
+        </w:tc>
+        <w:tc>
+          <w:tcPr>
+            <w:tcW w:w="859" w:type="dxa"/>
+            <w:tcBorders/>
+          </w:tcPr>
+          <w:p>
+            <w:pPr>
+              <w:pStyle w:val="Normal"/>
+              <w:rPr/>
+            </w:pPr>
+            <w:r>
+              <w:rPr>
+                <w:rFonts w:ascii="Droid Sans Mono;monospace" w:hAnsi="Droid Sans Mono;monospace"/>
+                <w:b w:val="false"/>
+                <w:i w:val="false"/>
+                <w:caps w:val="false"/>
+                <w:smallCaps w:val="false"/>
+                <w:color w:val="BBBEBF"/>
+                <w:spacing w:val="0"/>
+                <w:sz w:val="21"/>
+              </w:rPr>
+              <w:t>0.287</w:t>
+            </w:r>
+            <w:r>
+              <w:rPr>
+                <w:rFonts w:ascii="Droid Sans Mono;monospace" w:hAnsi="Droid Sans Mono;monospace"/>
+                <w:b w:val="false"/>
+                <w:i w:val="false"/>
+                <w:caps w:val="false"/>
+                <w:smallCaps w:val="false"/>
+                <w:color w:val="BBBEBF"/>
+                <w:spacing w:val="0"/>
+                <w:sz w:val="21"/>
+              </w:rPr>
+              <w:t>3</w:t>
+            </w:r>
+          </w:p>
+        </w:tc>
+        <w:tc>
+          <w:tcPr>
+            <w:tcW w:w="858" w:type="dxa"/>
+            <w:tcBorders/>
+          </w:tcPr>
+          <w:p>
+            <w:pPr>
+              <w:pStyle w:val="Normal"/>
+              <w:rPr/>
+            </w:pPr>
+            <w:r>
+              <w:rPr/>
+              <w:t>28.7%</w:t>
+            </w:r>
+          </w:p>
+        </w:tc>
+      </w:tr>
+    </w:tbl>
+    <w:p>
+      <w:pPr>
+        <w:pStyle w:val="Normal"/>
+        <w:rPr/>
+      </w:pPr>
+      <w:r>
+        <w:rPr/>
+      </w:r>
+    </w:p>
+    <w:p>
+      <w:pPr>
+        <w:pStyle w:val="Normal"/>
+        <w:rPr/>
+      </w:pPr>
+      <w:r>
+        <w:rPr/>
+        <w:t>The evolution loop records the number of mutations and the best fitness score for each generation. Once this has been plotted, it shows whether the volatility of the mutations results in great leaps in fitness.</w:t>
+      </w:r>
+    </w:p>
+    <w:p>
+      <w:pPr>
+        <w:pStyle w:val="Normal"/>
+        <w:rPr/>
+      </w:pPr>
+      <w:r>
+        <w:rPr/>
+      </w:r>
+    </w:p>
+    <w:p>
+      <w:pPr>
+        <w:pStyle w:val="Normal"/>
+        <w:rPr/>
+      </w:pPr>
+      <w:r>
+        <w:rPr/>
+        <w:t>[insert]</w:t>
+      </w:r>
+    </w:p>
+    <w:p>
+      <w:pPr>
+        <w:pStyle w:val="Normal"/>
+        <w:rPr/>
+      </w:pPr>
+      <w:r>
+        <w:rPr/>
+      </w:r>
+    </w:p>
+    <w:p>
+      <w:pPr>
+        <w:pStyle w:val="Normal"/>
+        <w:rPr/>
+      </w:pPr>
+      <w:r>
+        <w:rPr/>
+        <w:t>I also ran the same parameters but with 200 generations and found that only small improvements were made. However, it must be remembered that the initial weights for each individual are entirely random, as are the mutations and crossovers. It is not possible to have two runs that are identical, and a subsequent run with the same parameters might give better (or worse) results.</w:t>
+      </w:r>
+    </w:p>
+    <w:p>
+      <w:pPr>
+        <w:pStyle w:val="Normal"/>
+        <w:rPr/>
+      </w:pPr>
+      <w:r>
+        <w:rPr/>
+      </w:r>
+    </w:p>
+    <w:p>
+      <w:pPr>
+        <w:pStyle w:val="Normal"/>
+        <w:rPr/>
+      </w:pPr>
+      <w:r>
+        <w:rPr/>
+        <w:t>Going</w:t>
+      </w:r>
+      <w:r>
+        <w:rPr/>
+        <w:t xml:space="preserve"> back to the principles </w:t>
+      </w:r>
+      <w:r>
+        <w:rPr/>
+        <w:t xml:space="preserve">discussed by </w:t>
+      </w:r>
+      <w:r>
+        <w:rPr/>
+        <w:t xml:space="preserve">McCulloch-Pitts (1943), the </w:t>
+      </w:r>
+      <w:r>
+        <w:rPr/>
+        <w:t xml:space="preserve">genetic algorithm applies a wider search space </w:t>
+      </w:r>
+      <w:r>
+        <w:rPr/>
+        <w:t xml:space="preserve">when looking for the optimum way wire together the digital neurons in the network. The randomness in the algorithm means that it potentially tries out wildly different connection configurations rather than changing the existing one in small ways. </w:t>
+      </w:r>
+      <w:r>
+        <w:rPr/>
+        <w:t xml:space="preserve">In the context of </w:t>
+      </w:r>
+      <w:r>
+        <w:rPr/>
+        <w:t>the bank dataset</w:t>
+      </w:r>
+      <w:r>
+        <w:rPr/>
+        <w:t xml:space="preserve">, this is highly effective. </w:t>
+      </w:r>
+    </w:p>
+    <w:p>
+      <w:pPr>
+        <w:pStyle w:val="Normal"/>
+        <w:rPr/>
+      </w:pPr>
+      <w:r>
+        <w:rPr/>
+      </w:r>
+    </w:p>
+    <w:p>
+      <w:pPr>
+        <w:pStyle w:val="Normal"/>
+        <w:rPr/>
+      </w:pPr>
+      <w:r>
+        <w:rPr/>
+        <w:t xml:space="preserve">As noted </w:t>
+      </w:r>
+      <w:r>
+        <w:rPr/>
+        <w:t>in</w:t>
+      </w:r>
+      <w:r>
+        <w:rPr/>
+        <w:t xml:space="preserve"> Cognism 2024 cold-calling success rates are </w:t>
+      </w:r>
+      <w:r>
+        <w:rPr/>
+        <w:t>very</w:t>
+      </w:r>
+      <w:r>
+        <w:rPr/>
+        <w:t xml:space="preserve"> low. A </w:t>
+      </w:r>
+      <w:r>
+        <w:rPr/>
+        <w:t>MLP</w:t>
+      </w:r>
+      <w:r>
+        <w:rPr/>
+        <w:t xml:space="preserve"> optimi</w:t>
+      </w:r>
+      <w:r>
+        <w:rPr/>
+        <w:t>s</w:t>
+      </w:r>
+      <w:r>
+        <w:rPr/>
+        <w:t xml:space="preserve">ed </w:t>
+      </w:r>
+      <w:r>
+        <w:rPr/>
+        <w:t>using F1 Score</w:t>
+      </w:r>
+      <w:r>
+        <w:rPr/>
+        <w:t xml:space="preserve"> ensures that the model is aggressive enough to identify every possible ‘</w:t>
+      </w:r>
+      <w:r>
+        <w:rPr/>
+        <w:t>yes’</w:t>
+      </w:r>
+      <w:r>
+        <w:rPr/>
+        <w:t xml:space="preserve"> even if it increases the volume of total calls. </w:t>
+      </w:r>
+      <w:r>
+        <w:rPr/>
+        <w:t>As discussed before, these extra calls are cheap compared with the loss of value to the bank from missed deposits.</w:t>
+      </w:r>
+    </w:p>
+    <w:p>
+      <w:pPr>
+        <w:pStyle w:val="Normal"/>
+        <w:rPr/>
+      </w:pPr>
+      <w:r>
+        <w:rPr/>
+      </w:r>
+    </w:p>
+    <w:p>
+      <w:pPr>
+        <w:pStyle w:val="Normal"/>
+        <w:rPr/>
+      </w:pPr>
+      <w:r>
+        <w:rPr/>
       </w:r>
     </w:p>
     <w:p>
@@ -23598,7 +25000,7 @@
         <w:pStyle w:val="BodyText"/>
         <w:numPr>
           <w:ilvl w:val="0"/>
-          <w:numId w:val="12"/>
+          <w:numId w:val="13"/>
         </w:numPr>
         <w:rPr/>
       </w:pPr>
@@ -24082,7 +25484,7 @@
         <w:pStyle w:val="ListParagraph"/>
         <w:numPr>
           <w:ilvl w:val="0"/>
-          <w:numId w:val="13"/>
+          <w:numId w:val="14"/>
         </w:numPr>
         <w:rPr/>
       </w:pPr>
@@ -24443,7 +25845,7 @@
     </w:r>
     <w:r>
       <w:rPr/>
-      <w:t>41</w:t>
+      <w:t>44</w:t>
     </w:r>
     <w:r>
       <w:rPr/>
@@ -24467,7 +25869,7 @@
     </w:r>
     <w:r>
       <w:rPr/>
-      <w:t>41</w:t>
+      <w:t>44</w:t>
     </w:r>
     <w:r>
       <w:rPr/>
@@ -25755,48 +27157,48 @@
   </w:abstractNum>
   <w:abstractNum w:abstractNumId="10">
     <w:lvl w:ilvl="0">
-      <w:start w:val="36"/>
+      <w:start w:val="1"/>
       <w:numFmt w:val="bullet"/>
-      <w:lvlText w:val="-"/>
+      <w:lvlText w:val=""/>
       <w:lvlJc w:val="start"/>
       <w:pPr>
         <w:tabs>
-          <w:tab w:val="num" w:pos="0"/>
+          <w:tab w:val="num" w:pos="720"/>
         </w:tabs>
         <w:ind w:start="720" w:hanging="360"/>
       </w:pPr>
       <w:rPr>
-        <w:rFonts w:ascii="Helvetica" w:hAnsi="Helvetica" w:cs="Helvetica" w:hint="default"/>
+        <w:rFonts w:ascii="Symbol" w:hAnsi="Symbol" w:cs="Symbol" w:hint="default"/>
       </w:rPr>
     </w:lvl>
     <w:lvl w:ilvl="1">
       <w:start w:val="1"/>
       <w:numFmt w:val="bullet"/>
-      <w:lvlText w:val="o"/>
+      <w:lvlText w:val="◦"/>
       <w:lvlJc w:val="start"/>
       <w:pPr>
         <w:tabs>
-          <w:tab w:val="num" w:pos="0"/>
+          <w:tab w:val="num" w:pos="1080"/>
         </w:tabs>
-        <w:ind w:start="1440" w:hanging="360"/>
+        <w:ind w:start="1080" w:hanging="360"/>
       </w:pPr>
       <w:rPr>
-        <w:rFonts w:ascii="Courier New" w:hAnsi="Courier New" w:cs="Courier New" w:hint="default"/>
+        <w:rFonts w:ascii="OpenSymbol" w:hAnsi="OpenSymbol" w:cs="OpenSymbol" w:hint="default"/>
       </w:rPr>
     </w:lvl>
     <w:lvl w:ilvl="2">
       <w:start w:val="1"/>
       <w:numFmt w:val="bullet"/>
-      <w:lvlText w:val=""/>
+      <w:lvlText w:val="▪"/>
       <w:lvlJc w:val="start"/>
       <w:pPr>
         <w:tabs>
-          <w:tab w:val="num" w:pos="0"/>
+          <w:tab w:val="num" w:pos="1440"/>
         </w:tabs>
-        <w:ind w:start="2160" w:hanging="360"/>
+        <w:ind w:start="1440" w:hanging="360"/>
       </w:pPr>
       <w:rPr>
-        <w:rFonts w:ascii="Wingdings" w:hAnsi="Wingdings" w:cs="Wingdings" w:hint="default"/>
+        <w:rFonts w:ascii="OpenSymbol" w:hAnsi="OpenSymbol" w:cs="OpenSymbol" w:hint="default"/>
       </w:rPr>
     </w:lvl>
     <w:lvl w:ilvl="3">
@@ -25806,9 +27208,9 @@
       <w:lvlJc w:val="start"/>
       <w:pPr>
         <w:tabs>
-          <w:tab w:val="num" w:pos="0"/>
+          <w:tab w:val="num" w:pos="1800"/>
         </w:tabs>
-        <w:ind w:start="2880" w:hanging="360"/>
+        <w:ind w:start="1800" w:hanging="360"/>
       </w:pPr>
       <w:rPr>
         <w:rFonts w:ascii="Symbol" w:hAnsi="Symbol" w:cs="Symbol" w:hint="default"/>
@@ -25817,31 +27219,31 @@
     <w:lvl w:ilvl="4">
       <w:start w:val="1"/>
       <w:numFmt w:val="bullet"/>
-      <w:lvlText w:val="o"/>
+      <w:lvlText w:val="◦"/>
       <w:lvlJc w:val="start"/>
       <w:pPr>
         <w:tabs>
-          <w:tab w:val="num" w:pos="0"/>
+          <w:tab w:val="num" w:pos="2160"/>
         </w:tabs>
-        <w:ind w:start="3600" w:hanging="360"/>
+        <w:ind w:start="2160" w:hanging="360"/>
       </w:pPr>
       <w:rPr>
-        <w:rFonts w:ascii="Courier New" w:hAnsi="Courier New" w:cs="Courier New" w:hint="default"/>
+        <w:rFonts w:ascii="OpenSymbol" w:hAnsi="OpenSymbol" w:cs="OpenSymbol" w:hint="default"/>
       </w:rPr>
     </w:lvl>
     <w:lvl w:ilvl="5">
       <w:start w:val="1"/>
       <w:numFmt w:val="bullet"/>
-      <w:lvlText w:val=""/>
+      <w:lvlText w:val="▪"/>
       <w:lvlJc w:val="start"/>
       <w:pPr>
         <w:tabs>
-          <w:tab w:val="num" w:pos="0"/>
+          <w:tab w:val="num" w:pos="2520"/>
         </w:tabs>
-        <w:ind w:start="4320" w:hanging="360"/>
+        <w:ind w:start="2520" w:hanging="360"/>
       </w:pPr>
       <w:rPr>
-        <w:rFonts w:ascii="Wingdings" w:hAnsi="Wingdings" w:cs="Wingdings" w:hint="default"/>
+        <w:rFonts w:ascii="OpenSymbol" w:hAnsi="OpenSymbol" w:cs="OpenSymbol" w:hint="default"/>
       </w:rPr>
     </w:lvl>
     <w:lvl w:ilvl="6">
@@ -25851,9 +27253,9 @@
       <w:lvlJc w:val="start"/>
       <w:pPr>
         <w:tabs>
-          <w:tab w:val="num" w:pos="0"/>
+          <w:tab w:val="num" w:pos="2880"/>
         </w:tabs>
-        <w:ind w:start="5040" w:hanging="360"/>
+        <w:ind w:start="2880" w:hanging="360"/>
       </w:pPr>
       <w:rPr>
         <w:rFonts w:ascii="Symbol" w:hAnsi="Symbol" w:cs="Symbol" w:hint="default"/>
@@ -25862,35 +27264,154 @@
     <w:lvl w:ilvl="7">
       <w:start w:val="1"/>
       <w:numFmt w:val="bullet"/>
-      <w:lvlText w:val="o"/>
+      <w:lvlText w:val="◦"/>
       <w:lvlJc w:val="start"/>
       <w:pPr>
         <w:tabs>
-          <w:tab w:val="num" w:pos="0"/>
+          <w:tab w:val="num" w:pos="3240"/>
         </w:tabs>
-        <w:ind w:start="5760" w:hanging="360"/>
+        <w:ind w:start="3240" w:hanging="360"/>
       </w:pPr>
       <w:rPr>
-        <w:rFonts w:ascii="Courier New" w:hAnsi="Courier New" w:cs="Courier New" w:hint="default"/>
+        <w:rFonts w:ascii="OpenSymbol" w:hAnsi="OpenSymbol" w:cs="OpenSymbol" w:hint="default"/>
       </w:rPr>
     </w:lvl>
     <w:lvl w:ilvl="8">
       <w:start w:val="1"/>
       <w:numFmt w:val="bullet"/>
-      <w:lvlText w:val=""/>
+      <w:lvlText w:val="▪"/>
       <w:lvlJc w:val="start"/>
       <w:pPr>
         <w:tabs>
-          <w:tab w:val="num" w:pos="0"/>
+          <w:tab w:val="num" w:pos="3600"/>
         </w:tabs>
-        <w:ind w:start="6480" w:hanging="360"/>
+        <w:ind w:start="3600" w:hanging="360"/>
       </w:pPr>
       <w:rPr>
-        <w:rFonts w:ascii="Wingdings" w:hAnsi="Wingdings" w:cs="Wingdings" w:hint="default"/>
+        <w:rFonts w:ascii="OpenSymbol" w:hAnsi="OpenSymbol" w:cs="OpenSymbol" w:hint="default"/>
       </w:rPr>
     </w:lvl>
   </w:abstractNum>
   <w:abstractNum w:abstractNumId="11">
+    <w:lvl w:ilvl="0">
+      <w:start w:val="1"/>
+      <w:numFmt w:val="decimal"/>
+      <w:lvlText w:val="%1."/>
+      <w:lvlJc w:val="start"/>
+      <w:pPr>
+        <w:tabs>
+          <w:tab w:val="num" w:pos="720"/>
+        </w:tabs>
+        <w:ind w:start="720" w:hanging="360"/>
+      </w:pPr>
+      <w:rPr/>
+    </w:lvl>
+    <w:lvl w:ilvl="1">
+      <w:start w:val="1"/>
+      <w:numFmt w:val="decimal"/>
+      <w:lvlText w:val="%2."/>
+      <w:lvlJc w:val="start"/>
+      <w:pPr>
+        <w:tabs>
+          <w:tab w:val="num" w:pos="1080"/>
+        </w:tabs>
+        <w:ind w:start="1080" w:hanging="360"/>
+      </w:pPr>
+      <w:rPr/>
+    </w:lvl>
+    <w:lvl w:ilvl="2">
+      <w:start w:val="1"/>
+      <w:numFmt w:val="decimal"/>
+      <w:lvlText w:val="%3."/>
+      <w:lvlJc w:val="start"/>
+      <w:pPr>
+        <w:tabs>
+          <w:tab w:val="num" w:pos="1440"/>
+        </w:tabs>
+        <w:ind w:start="1440" w:hanging="360"/>
+      </w:pPr>
+      <w:rPr/>
+    </w:lvl>
+    <w:lvl w:ilvl="3">
+      <w:start w:val="1"/>
+      <w:numFmt w:val="decimal"/>
+      <w:lvlText w:val="%4."/>
+      <w:lvlJc w:val="start"/>
+      <w:pPr>
+        <w:tabs>
+          <w:tab w:val="num" w:pos="1800"/>
+        </w:tabs>
+        <w:ind w:start="1800" w:hanging="360"/>
+      </w:pPr>
+      <w:rPr/>
+    </w:lvl>
+    <w:lvl w:ilvl="4">
+      <w:start w:val="1"/>
+      <w:numFmt w:val="decimal"/>
+      <w:lvlText w:val="%5."/>
+      <w:lvlJc w:val="start"/>
+      <w:pPr>
+        <w:tabs>
+          <w:tab w:val="num" w:pos="2160"/>
+        </w:tabs>
+        <w:ind w:start="2160" w:hanging="360"/>
+      </w:pPr>
+      <w:rPr/>
+    </w:lvl>
+    <w:lvl w:ilvl="5">
+      <w:start w:val="1"/>
+      <w:numFmt w:val="decimal"/>
+      <w:lvlText w:val="%6."/>
+      <w:lvlJc w:val="start"/>
+      <w:pPr>
+        <w:tabs>
+          <w:tab w:val="num" w:pos="2520"/>
+        </w:tabs>
+        <w:ind w:start="2520" w:hanging="360"/>
+      </w:pPr>
+      <w:rPr/>
+    </w:lvl>
+    <w:lvl w:ilvl="6">
+      <w:start w:val="1"/>
+      <w:numFmt w:val="decimal"/>
+      <w:lvlText w:val="%7."/>
+      <w:lvlJc w:val="start"/>
+      <w:pPr>
+        <w:tabs>
+          <w:tab w:val="num" w:pos="2880"/>
+        </w:tabs>
+        <w:ind w:start="2880" w:hanging="360"/>
+      </w:pPr>
+      <w:rPr/>
+    </w:lvl>
+    <w:lvl w:ilvl="7">
+      <w:start w:val="1"/>
+      <w:numFmt w:val="decimal"/>
+      <w:lvlText w:val="%8."/>
+      <w:lvlJc w:val="start"/>
+      <w:pPr>
+        <w:tabs>
+          <w:tab w:val="num" w:pos="3240"/>
+        </w:tabs>
+        <w:ind w:start="3240" w:hanging="360"/>
+      </w:pPr>
+      <w:rPr/>
+    </w:lvl>
+    <w:lvl w:ilvl="8">
+      <w:start w:val="1"/>
+      <w:numFmt w:val="decimal"/>
+      <w:lvlText w:val="%9."/>
+      <w:lvlJc w:val="start"/>
+      <w:pPr>
+        <w:tabs>
+          <w:tab w:val="num" w:pos="3600"/>
+        </w:tabs>
+        <w:ind w:start="3600" w:hanging="360"/>
+      </w:pPr>
+      <w:rPr/>
+    </w:lvl>
+  </w:abstractNum>
+  <w:abstractNum w:abstractNumId="12">
     <w:lvl w:ilvl="0">
       <w:start w:val="1"/>
       <w:numFmt w:val="none"/>
@@ -26043,12 +27564,15 @@
     <w:abstractNumId w:val="11"/>
   </w:num>
   <w:num w:numId="12">
+    <w:abstractNumId w:val="12"/>
+  </w:num>
+  <w:num w:numId="13">
     <w:abstractNumId w:val="1"/>
     <w:lvlOverride w:ilvl="0">
       <w:startOverride w:val="1"/>
     </w:lvlOverride>
   </w:num>
-  <w:num w:numId="13">
+  <w:num w:numId="14">
     <w:abstractNumId w:val="1"/>
     <w:lvlOverride w:ilvl="0">
       <w:startOverride w:val="1"/>

</xml_diff>